<commit_message>
docs: restore original intro; restructure sections like proekтик (Глава 1/2, 1.1-1.3, 2.1-2.3)
Co-authored-by: triotrio123ss <triotrio123ss@gmail.com>
</commit_message>
<xml_diff>
--- a/ИП_Векторы_вокруг_нас.docx
+++ b/ИП_Векторы_вокруг_нас.docx
@@ -1611,110 +1611,6 @@
       </ns0:r>
     </ns0:p>
     <ns0:p>
-      <ns0:pPr>
-        <ns0:spacing ns0:after="0" ns0:line="360" ns0:lineRule="auto"/>
-        <ns0:jc ns0:val="left"/>
-      </ns0:pPr>
-      <ns0:r>
-        <ns0:rPr>
-          <ns0:rFonts ns0:ascii="Times New Roman" ns0:hAnsi="Times New Roman"/>
-          <ns0:sz ns0:val="28"/>
-        </ns0:rPr>
-        <ns0:t xml:space="preserve"/>
-      </ns0:r>
-    </ns0:p>
-    <ns0:p>
-      <ns0:pPr>
-        <ns0:spacing ns0:after="0" ns0:line="360" ns0:lineRule="auto"/>
-        <ns0:jc ns0:val="left"/>
-      </ns0:pPr>
-      <ns0:r>
-        <ns0:rPr>
-          <ns0:rFonts ns0:ascii="Times New Roman" ns0:hAnsi="Times New Roman"/>
-          <ns0:sz ns0:val="28"/>
-        </ns0:rPr>
-        <ns0:t xml:space="preserve">Введение</ns0:t>
-      </ns0:r>
-    </ns0:p>
-    <ns0:p>
-      <ns0:pPr>
-        <ns0:spacing ns0:after="0" ns0:line="360" ns0:lineRule="auto"/>
-        <ns0:jc ns0:val="left"/>
-      </ns0:pPr>
-      <ns0:r>
-        <ns0:rPr>
-          <ns0:rFonts ns0:ascii="Times New Roman" ns0:hAnsi="Times New Roman"/>
-          <ns0:sz ns0:val="28"/>
-        </ns0:rPr>
-        <ns0:t xml:space="preserve">1. Теоретическая часть</ns0:t>
-      </ns0:r>
-    </ns0:p>
-    <ns0:p>
-      <ns0:pPr>
-        <ns0:spacing ns0:after="0" ns0:line="360" ns0:lineRule="auto"/>
-        <ns0:jc ns0:val="left"/>
-      </ns0:pPr>
-      <ns0:r>
-        <ns0:rPr>
-          <ns0:rFonts ns0:ascii="Times New Roman" ns0:hAnsi="Times New Roman"/>
-          <ns0:sz ns0:val="28"/>
-        </ns0:rPr>
-        <ns0:t xml:space="preserve">2. Практическая часть (опрос)</ns0:t>
-      </ns0:r>
-    </ns0:p>
-    <ns0:p>
-      <ns0:pPr>
-        <ns0:spacing ns0:after="0" ns0:line="360" ns0:lineRule="auto"/>
-        <ns0:jc ns0:val="left"/>
-      </ns0:pPr>
-      <ns0:r>
-        <ns0:rPr>
-          <ns0:rFonts ns0:ascii="Times New Roman" ns0:hAnsi="Times New Roman"/>
-          <ns0:sz ns0:val="28"/>
-        </ns0:rPr>
-        <ns0:t xml:space="preserve">Заключение</ns0:t>
-      </ns0:r>
-    </ns0:p>
-    <ns0:p>
-      <ns0:pPr>
-        <ns0:spacing ns0:after="0" ns0:line="360" ns0:lineRule="auto"/>
-        <ns0:jc ns0:val="left"/>
-      </ns0:pPr>
-      <ns0:r>
-        <ns0:rPr>
-          <ns0:rFonts ns0:ascii="Times New Roman" ns0:hAnsi="Times New Roman"/>
-          <ns0:sz ns0:val="28"/>
-        </ns0:rPr>
-        <ns0:t xml:space="preserve">Список использованных источников</ns0:t>
-      </ns0:r>
-    </ns0:p>
-    <ns0:p>
-      <ns0:pPr>
-        <ns0:spacing ns0:after="0" ns0:line="360" ns0:lineRule="auto"/>
-        <ns0:jc ns0:val="left"/>
-      </ns0:pPr>
-      <ns0:r>
-        <ns0:rPr>
-          <ns0:rFonts ns0:ascii="Times New Roman" ns0:hAnsi="Times New Roman"/>
-          <ns0:sz ns0:val="28"/>
-        </ns0:rPr>
-        <ns0:t xml:space="preserve">Приложение А. Анкета</ns0:t>
-      </ns0:r>
-    </ns0:p>
-    <ns0:p>
-      <ns0:pPr>
-        <ns0:spacing ns0:after="0" ns0:line="360" ns0:lineRule="auto"/>
-        <ns0:jc ns0:val="left"/>
-      </ns0:pPr>
-      <ns0:r>
-        <ns0:rPr>
-          <ns0:rFonts ns0:ascii="Times New Roman" ns0:hAnsi="Times New Roman"/>
-          <ns0:sz ns0:val="28"/>
-        </ns0:rPr>
-        <ns0:t xml:space="preserve">Приложение Б. Сырые данные</ns0:t>
-      </ns0:r>
-    </ns0:p>
-    <ns0:p>
       <ns0:r>
         <ns0:br ns0:type="page"/>
       </ns0:r>
@@ -1759,35 +1655,63 @@
           <ns0:rFonts ns0:ascii="Times New Roman" ns0:hAnsi="Times New Roman"/>
           <ns0:sz ns0:val="28"/>
         </ns0:rPr>
-        <ns0:t xml:space="preserve">Векторы помогают описывать величины, у которых важны и значение, и направление: перемещение, скорость, сила, направление ветра. Тема «Векторы вокруг нас» показывает связь математики с жизненными ситуациями и другими дисциплинами.</ns0:t>
-      </ns0:r>
-    </ns0:p>
-    <ns0:p>
-      <ns0:pPr>
-        <ns0:spacing ns0:after="0" ns0:line="360" ns0:lineRule="auto"/>
-        <ns0:ind ns0:firstLine="0"/>
-        <ns0:jc ns0:val="both"/>
-      </ns0:pPr>
-      <ns0:r>
-        <ns0:rPr>
-          <ns0:rFonts ns0:ascii="Times New Roman" ns0:hAnsi="Times New Roman"/>
-          <ns0:sz ns0:val="28"/>
-        </ns0:rPr>
-        <ns0:t xml:space="preserve"/>
-      </ns0:r>
-    </ns0:p>
-    <ns0:p>
-      <ns0:pPr>
-        <ns0:spacing ns0:after="0" ns0:line="360" ns0:lineRule="auto"/>
-        <ns0:ind ns0:firstLine="709"/>
-        <ns0:jc ns0:val="both"/>
-      </ns0:pPr>
-      <ns0:r>
-        <ns0:rPr>
-          <ns0:rFonts ns0:ascii="Times New Roman" ns0:hAnsi="Times New Roman"/>
-          <ns0:sz ns0:val="28"/>
-        </ns0:rPr>
-        <ns0:t xml:space="preserve">Цель проекта — кратко объяснить основные идеи векторов и показать их применение через практическую часть в виде опроса с диаграммами.</ns0:t>
+        <ns0:t xml:space="preserve">Тема «Векторы вокруг нас» показывает, что математика описывает реальные действия и явления: движение, силу, направление ветра, перемещение людей и транспорта, работу механизмов. Вектор — это объект, который характеризуется величиной и направлением. Благодаря этому векторы удобно применять там, где важно не только «сколько», но и «куда».</ns0:t>
+      </ns0:r>
+    </ns0:p>
+    <ns0:p>
+      <ns0:pPr>
+        <ns0:spacing ns0:after="0" ns0:line="360" ns0:lineRule="auto"/>
+        <ns0:ind ns0:firstLine="0"/>
+        <ns0:jc ns0:val="both"/>
+      </ns0:pPr>
+      <ns0:r>
+        <ns0:rPr>
+          <ns0:rFonts ns0:ascii="Times New Roman" ns0:hAnsi="Times New Roman"/>
+          <ns0:sz ns0:val="28"/>
+        </ns0:rPr>
+        <ns0:t xml:space="preserve"/>
+      </ns0:r>
+    </ns0:p>
+    <ns0:p>
+      <ns0:pPr>
+        <ns0:spacing ns0:after="0" ns0:line="360" ns0:lineRule="auto"/>
+        <ns0:ind ns0:firstLine="709"/>
+        <ns0:jc ns0:val="both"/>
+      </ns0:pPr>
+      <ns0:r>
+        <ns0:rPr>
+          <ns0:rFonts ns0:ascii="Times New Roman" ns0:hAnsi="Times New Roman"/>
+          <ns0:sz ns0:val="28"/>
+        </ns0:rPr>
+        <ns0:t xml:space="preserve">Актуальность темы связана с тем, что современный человек постоянно сталкивается с направленными величинами: ориентирование в городе, спортивные тренировки, безопасность движения, работа с картами и схемами, цифровые технологии (графика, игры, моделирование). Понимание векторов делает такие явления «прозрачными»: их можно измерять, сравнивать и рассчитывать.</ns0:t>
+      </ns0:r>
+    </ns0:p>
+    <ns0:p>
+      <ns0:pPr>
+        <ns0:spacing ns0:after="0" ns0:line="360" ns0:lineRule="auto"/>
+        <ns0:ind ns0:firstLine="0"/>
+        <ns0:jc ns0:val="both"/>
+      </ns0:pPr>
+      <ns0:r>
+        <ns0:rPr>
+          <ns0:rFonts ns0:ascii="Times New Roman" ns0:hAnsi="Times New Roman"/>
+          <ns0:sz ns0:val="28"/>
+        </ns0:rPr>
+        <ns0:t xml:space="preserve"/>
+      </ns0:r>
+    </ns0:p>
+    <ns0:p>
+      <ns0:pPr>
+        <ns0:spacing ns0:after="0" ns0:line="360" ns0:lineRule="auto"/>
+        <ns0:ind ns0:firstLine="709"/>
+        <ns0:jc ns0:val="both"/>
+      </ns0:pPr>
+      <ns0:r>
+        <ns0:rPr>
+          <ns0:rFonts ns0:ascii="Times New Roman" ns0:hAnsi="Times New Roman"/>
+          <ns0:sz ns0:val="28"/>
+        </ns0:rPr>
+        <ns0:t xml:space="preserve">Цель проекта — показать, как понятие вектора используется в повседневной жизни, и продемонстрировать это на практическом материале с помощью опроса и диаграмм.</ns0:t>
       </ns0:r>
     </ns0:p>
     <ns0:p>
@@ -1829,35 +1753,133 @@
           <ns0:rFonts ns0:ascii="Times New Roman" ns0:hAnsi="Times New Roman"/>
           <ns0:sz ns0:val="28"/>
         </ns0:rPr>
-        <ns0:t xml:space="preserve">1) дать определение вектора и основные характеристики;</ns0:t>
-      </ns0:r>
-    </ns0:p>
-    <ns0:p>
-      <ns0:pPr>
-        <ns0:spacing ns0:after="0" ns0:line="360" ns0:lineRule="auto"/>
-        <ns0:ind ns0:firstLine="709"/>
-        <ns0:jc ns0:val="both"/>
-      </ns0:pPr>
-      <ns0:r>
-        <ns0:rPr>
-          <ns0:rFonts ns0:ascii="Times New Roman" ns0:hAnsi="Times New Roman"/>
-          <ns0:sz ns0:val="28"/>
-        </ns0:rPr>
-        <ns0:t xml:space="preserve">2) описать базовые операции над векторами и их смысл;</ns0:t>
-      </ns0:r>
-    </ns0:p>
-    <ns0:p>
-      <ns0:pPr>
-        <ns0:spacing ns0:after="0" ns0:line="360" ns0:lineRule="auto"/>
-        <ns0:ind ns0:firstLine="709"/>
-        <ns0:jc ns0:val="both"/>
-      </ns0:pPr>
-      <ns0:r>
-        <ns0:rPr>
-          <ns0:rFonts ns0:ascii="Times New Roman" ns0:hAnsi="Times New Roman"/>
-          <ns0:sz ns0:val="28"/>
-        </ns0:rPr>
-        <ns0:t xml:space="preserve">3) провести опрос и представить результаты диаграммами.</ns0:t>
+        <ns0:t xml:space="preserve">1) дать определение вектора и рассмотреть основные характеристики;</ns0:t>
+      </ns0:r>
+    </ns0:p>
+    <ns0:p>
+      <ns0:pPr>
+        <ns0:spacing ns0:after="0" ns0:line="360" ns0:lineRule="auto"/>
+        <ns0:ind ns0:firstLine="709"/>
+        <ns0:jc ns0:val="both"/>
+      </ns0:pPr>
+      <ns0:r>
+        <ns0:rPr>
+          <ns0:rFonts ns0:ascii="Times New Roman" ns0:hAnsi="Times New Roman"/>
+          <ns0:sz ns0:val="28"/>
+        </ns0:rPr>
+        <ns0:t xml:space="preserve">2) описать операции над векторами и их смысл;</ns0:t>
+      </ns0:r>
+    </ns0:p>
+    <ns0:p>
+      <ns0:pPr>
+        <ns0:spacing ns0:after="0" ns0:line="360" ns0:lineRule="auto"/>
+        <ns0:ind ns0:firstLine="709"/>
+        <ns0:jc ns0:val="both"/>
+      </ns0:pPr>
+      <ns0:r>
+        <ns0:rPr>
+          <ns0:rFonts ns0:ascii="Times New Roman" ns0:hAnsi="Times New Roman"/>
+          <ns0:sz ns0:val="28"/>
+        </ns0:rPr>
+        <ns0:t xml:space="preserve">3) показать примеры применения векторов в окружающем мире;</ns0:t>
+      </ns0:r>
+    </ns0:p>
+    <ns0:p>
+      <ns0:pPr>
+        <ns0:spacing ns0:after="0" ns0:line="360" ns0:lineRule="auto"/>
+        <ns0:ind ns0:firstLine="709"/>
+        <ns0:jc ns0:val="both"/>
+      </ns0:pPr>
+      <ns0:r>
+        <ns0:rPr>
+          <ns0:rFonts ns0:ascii="Times New Roman" ns0:hAnsi="Times New Roman"/>
+          <ns0:sz ns0:val="28"/>
+        </ns0:rPr>
+        <ns0:t xml:space="preserve">4) провести опрос и проанализировать ответы, оформив результаты диаграммами;</ns0:t>
+      </ns0:r>
+    </ns0:p>
+    <ns0:p>
+      <ns0:pPr>
+        <ns0:spacing ns0:after="0" ns0:line="360" ns0:lineRule="auto"/>
+        <ns0:ind ns0:firstLine="709"/>
+        <ns0:jc ns0:val="both"/>
+      </ns0:pPr>
+      <ns0:r>
+        <ns0:rPr>
+          <ns0:rFonts ns0:ascii="Times New Roman" ns0:hAnsi="Times New Roman"/>
+          <ns0:sz ns0:val="28"/>
+        </ns0:rPr>
+        <ns0:t xml:space="preserve">5) сформулировать выводы.</ns0:t>
+      </ns0:r>
+    </ns0:p>
+    <ns0:p>
+      <ns0:pPr>
+        <ns0:spacing ns0:after="0" ns0:line="360" ns0:lineRule="auto"/>
+        <ns0:ind ns0:firstLine="0"/>
+        <ns0:jc ns0:val="both"/>
+      </ns0:pPr>
+      <ns0:r>
+        <ns0:rPr>
+          <ns0:rFonts ns0:ascii="Times New Roman" ns0:hAnsi="Times New Roman"/>
+          <ns0:sz ns0:val="28"/>
+        </ns0:rPr>
+        <ns0:t xml:space="preserve"/>
+      </ns0:r>
+    </ns0:p>
+    <ns0:p>
+      <ns0:pPr>
+        <ns0:spacing ns0:after="0" ns0:line="360" ns0:lineRule="auto"/>
+        <ns0:ind ns0:firstLine="709"/>
+        <ns0:jc ns0:val="both"/>
+      </ns0:pPr>
+      <ns0:r>
+        <ns0:rPr>
+          <ns0:rFonts ns0:ascii="Times New Roman" ns0:hAnsi="Times New Roman"/>
+          <ns0:sz ns0:val="28"/>
+        </ns0:rPr>
+        <ns0:t xml:space="preserve">Объект исследования — направленные величины в природе, технике и повседневной жизни.</ns0:t>
+      </ns0:r>
+    </ns0:p>
+    <ns0:p>
+      <ns0:pPr>
+        <ns0:spacing ns0:after="0" ns0:line="360" ns0:lineRule="auto"/>
+        <ns0:ind ns0:firstLine="709"/>
+        <ns0:jc ns0:val="both"/>
+      </ns0:pPr>
+      <ns0:r>
+        <ns0:rPr>
+          <ns0:rFonts ns0:ascii="Times New Roman" ns0:hAnsi="Times New Roman"/>
+          <ns0:sz ns0:val="28"/>
+        </ns0:rPr>
+        <ns0:t xml:space="preserve">Предмет исследования — способы описания и применения векторов как модели направленных величин.</ns0:t>
+      </ns0:r>
+    </ns0:p>
+    <ns0:p>
+      <ns0:pPr>
+        <ns0:spacing ns0:after="0" ns0:line="360" ns0:lineRule="auto"/>
+        <ns0:ind ns0:firstLine="0"/>
+        <ns0:jc ns0:val="both"/>
+      </ns0:pPr>
+      <ns0:r>
+        <ns0:rPr>
+          <ns0:rFonts ns0:ascii="Times New Roman" ns0:hAnsi="Times New Roman"/>
+          <ns0:sz ns0:val="28"/>
+        </ns0:rPr>
+        <ns0:t xml:space="preserve"/>
+      </ns0:r>
+    </ns0:p>
+    <ns0:p>
+      <ns0:pPr>
+        <ns0:spacing ns0:after="0" ns0:line="360" ns0:lineRule="auto"/>
+        <ns0:ind ns0:firstLine="709"/>
+        <ns0:jc ns0:val="both"/>
+      </ns0:pPr>
+      <ns0:r>
+        <ns0:rPr>
+          <ns0:rFonts ns0:ascii="Times New Roman" ns0:hAnsi="Times New Roman"/>
+          <ns0:sz ns0:val="28"/>
+        </ns0:rPr>
+        <ns0:t xml:space="preserve">Методы исследования: анализ литературы, обобщение, моделирование ситуаций с помощью векторов, анкетирование, представление данных в виде диаграмм.</ns0:t>
       </ns0:r>
     </ns0:p>
     <ns0:p>
@@ -1886,28 +1908,28 @@
           <ns0:sz ns0:val="28"/>
           <ns0:b/>
         </ns0:rPr>
-        <ns0:t xml:space="preserve">1. ТЕОРЕТИЧЕСКАЯ ЧАСТЬ</ns0:t>
-      </ns0:r>
-    </ns0:p>
-    <ns0:p>
-      <ns0:pPr>
-        <ns0:spacing ns0:after="0" ns0:line="360" ns0:lineRule="auto"/>
-        <ns0:ind ns0:firstLine="0"/>
-        <ns0:jc ns0:val="both"/>
-      </ns0:pPr>
-      <ns0:r>
-        <ns0:rPr>
-          <ns0:rFonts ns0:ascii="Times New Roman" ns0:hAnsi="Times New Roman"/>
-          <ns0:sz ns0:val="28"/>
-        </ns0:rPr>
-        <ns0:t xml:space="preserve"/>
-      </ns0:r>
-    </ns0:p>
-    <ns0:p>
-      <ns0:pPr>
-        <ns0:spacing ns0:after="0" ns0:line="360" ns0:lineRule="auto"/>
-        <ns0:ind ns0:firstLine="0"/>
-        <ns0:jc ns0:val="both"/>
+        <ns0:t xml:space="preserve">1. ТЕОРЕТИЧЕСКАЯ ЧАСТЬ. ОСНОВЫ ВЕКТОРОВ</ns0:t>
+      </ns0:r>
+    </ns0:p>
+    <ns0:p>
+      <ns0:pPr>
+        <ns0:spacing ns0:after="0" ns0:line="360" ns0:lineRule="auto"/>
+        <ns0:ind ns0:firstLine="0"/>
+        <ns0:jc ns0:val="both"/>
+      </ns0:pPr>
+      <ns0:r>
+        <ns0:rPr>
+          <ns0:rFonts ns0:ascii="Times New Roman" ns0:hAnsi="Times New Roman"/>
+          <ns0:sz ns0:val="28"/>
+        </ns0:rPr>
+        <ns0:t xml:space="preserve"/>
+      </ns0:r>
+    </ns0:p>
+    <ns0:p>
+      <ns0:pPr>
+        <ns0:spacing ns0:after="0" ns0:line="360" ns0:lineRule="auto"/>
+        <ns0:ind ns0:firstLine="0"/>
+        <ns0:jc ns0:val="center"/>
       </ns0:pPr>
       <ns0:r>
         <ns0:rPr>
@@ -1915,63 +1937,63 @@
           <ns0:sz ns0:val="28"/>
           <ns0:b/>
         </ns0:rPr>
-        <ns0:t xml:space="preserve">1.1. Понятие вектора</ns0:t>
-      </ns0:r>
-    </ns0:p>
-    <ns0:p>
-      <ns0:pPr>
-        <ns0:spacing ns0:after="0" ns0:line="360" ns0:lineRule="auto"/>
-        <ns0:ind ns0:firstLine="0"/>
-        <ns0:jc ns0:val="both"/>
-      </ns0:pPr>
-      <ns0:r>
-        <ns0:rPr>
-          <ns0:rFonts ns0:ascii="Times New Roman" ns0:hAnsi="Times New Roman"/>
-          <ns0:sz ns0:val="28"/>
-        </ns0:rPr>
-        <ns0:t xml:space="preserve"/>
-      </ns0:r>
-    </ns0:p>
-    <ns0:p>
-      <ns0:pPr>
-        <ns0:spacing ns0:after="0" ns0:line="360" ns0:lineRule="auto"/>
-        <ns0:ind ns0:firstLine="709"/>
-        <ns0:jc ns0:val="both"/>
-      </ns0:pPr>
-      <ns0:r>
-        <ns0:rPr>
-          <ns0:rFonts ns0:ascii="Times New Roman" ns0:hAnsi="Times New Roman"/>
-          <ns0:sz ns0:val="28"/>
-        </ns0:rPr>
-        <ns0:t xml:space="preserve">Вектор — направленный отрезок. Он характеризуется длиной (модулем) и направлением. Равные векторы имеют одинаковую длину и направление, даже если расположены в разных местах. Нулевой вектор имеет модуль 0.</ns0:t>
-      </ns0:r>
-    </ns0:p>
-    <ns0:p>
-      <ns0:pPr>
-        <ns0:spacing ns0:after="0" ns0:line="360" ns0:lineRule="auto"/>
-        <ns0:ind ns0:firstLine="0"/>
-        <ns0:jc ns0:val="both"/>
-      </ns0:pPr>
-      <ns0:r>
-        <ns0:rPr>
-          <ns0:rFonts ns0:ascii="Times New Roman" ns0:hAnsi="Times New Roman"/>
-          <ns0:sz ns0:val="28"/>
-        </ns0:rPr>
-        <ns0:t xml:space="preserve"/>
-      </ns0:r>
-    </ns0:p>
-    <ns0:p>
-      <ns0:pPr>
-        <ns0:spacing ns0:after="0" ns0:line="360" ns0:lineRule="auto"/>
-        <ns0:ind ns0:firstLine="709"/>
-        <ns0:jc ns0:val="both"/>
-      </ns0:pPr>
-      <ns0:r>
-        <ns0:rPr>
-          <ns0:rFonts ns0:ascii="Times New Roman" ns0:hAnsi="Times New Roman"/>
-          <ns0:sz ns0:val="28"/>
-        </ns0:rPr>
-        <ns0:t xml:space="preserve">Координаты вектора на плоскости: если A(x1; y1), B(x2; y2), то AB⃗ = (x2 − x1; y2 − y1). Модуль: |a⃗| = √(ax² + ay²).</ns0:t>
+        <ns0:t xml:space="preserve">СОДЕРЖАНИЕ</ns0:t>
+      </ns0:r>
+    </ns0:p>
+    <ns0:p>
+      <ns0:pPr>
+        <ns0:spacing ns0:after="0" ns0:line="360" ns0:lineRule="auto"/>
+        <ns0:ind ns0:firstLine="0"/>
+        <ns0:jc ns0:val="both"/>
+      </ns0:pPr>
+      <ns0:r>
+        <ns0:rPr>
+          <ns0:rFonts ns0:ascii="Times New Roman" ns0:hAnsi="Times New Roman"/>
+          <ns0:sz ns0:val="28"/>
+        </ns0:rPr>
+        <ns0:t xml:space="preserve"/>
+      </ns0:r>
+    </ns0:p>
+    <ns0:p>
+      <ns0:pPr>
+        <ns0:spacing ns0:after="0" ns0:line="360" ns0:lineRule="auto"/>
+        <ns0:ind ns0:firstLine="709"/>
+        <ns0:jc ns0:val="both"/>
+      </ns0:pPr>
+      <ns0:r>
+        <ns0:rPr>
+          <ns0:rFonts ns0:ascii="Times New Roman" ns0:hAnsi="Times New Roman"/>
+          <ns0:sz ns0:val="28"/>
+        </ns0:rPr>
+        <ns0:t xml:space="preserve">Введение……………………………………………………………………..3</ns0:t>
+      </ns0:r>
+    </ns0:p>
+    <ns0:p>
+      <ns0:pPr>
+        <ns0:spacing ns0:after="0" ns0:line="360" ns0:lineRule="auto"/>
+        <ns0:ind ns0:firstLine="0"/>
+        <ns0:jc ns0:val="both"/>
+      </ns0:pPr>
+      <ns0:r>
+        <ns0:rPr>
+          <ns0:rFonts ns0:ascii="Times New Roman" ns0:hAnsi="Times New Roman"/>
+          <ns0:sz ns0:val="28"/>
+        </ns0:rPr>
+        <ns0:t xml:space="preserve"/>
+      </ns0:r>
+    </ns0:p>
+    <ns0:p>
+      <ns0:pPr>
+        <ns0:spacing ns0:after="0" ns0:line="360" ns0:lineRule="auto"/>
+        <ns0:ind ns0:firstLine="709"/>
+        <ns0:jc ns0:val="both"/>
+      </ns0:pPr>
+      <ns0:r>
+        <ns0:rPr>
+          <ns0:rFonts ns0:ascii="Times New Roman" ns0:hAnsi="Times New Roman"/>
+          <ns0:sz ns0:val="28"/>
+        </ns0:rPr>
+        <ns0:t xml:space="preserve">Глава 1. Векторы как математическая модель направленных величин</ns0:t>
       </ns0:r>
     </ns0:p>
     <ns0:p>
@@ -2000,91 +2022,7 @@
           <ns0:sz ns0:val="28"/>
           <ns0:b/>
         </ns0:rPr>
-        <ns0:t xml:space="preserve">1.2. Операции над векторами</ns0:t>
-      </ns0:r>
-    </ns0:p>
-    <ns0:p>
-      <ns0:pPr>
-        <ns0:spacing ns0:after="0" ns0:line="360" ns0:lineRule="auto"/>
-        <ns0:ind ns0:firstLine="0"/>
-        <ns0:jc ns0:val="both"/>
-      </ns0:pPr>
-      <ns0:r>
-        <ns0:rPr>
-          <ns0:rFonts ns0:ascii="Times New Roman" ns0:hAnsi="Times New Roman"/>
-          <ns0:sz ns0:val="28"/>
-        </ns0:rPr>
-        <ns0:t xml:space="preserve"/>
-      </ns0:r>
-    </ns0:p>
-    <ns0:p>
-      <ns0:pPr>
-        <ns0:spacing ns0:after="0" ns0:line="360" ns0:lineRule="auto"/>
-        <ns0:ind ns0:firstLine="709"/>
-        <ns0:jc ns0:val="both"/>
-      </ns0:pPr>
-      <ns0:r>
-        <ns0:rPr>
-          <ns0:rFonts ns0:ascii="Times New Roman" ns0:hAnsi="Times New Roman"/>
-          <ns0:sz ns0:val="28"/>
-        </ns0:rPr>
-        <ns0:t xml:space="preserve">Сложение векторов соответствует последовательному выполнению двух перемещений: сначала по a⃗, затем по b⃗. Итоговое перемещение — a⃗ + b⃗. Вычитание: a⃗ − b⃗ = a⃗ + (−b⃗).</ns0:t>
-      </ns0:r>
-    </ns0:p>
-    <ns0:p>
-      <ns0:pPr>
-        <ns0:spacing ns0:after="0" ns0:line="360" ns0:lineRule="auto"/>
-        <ns0:ind ns0:firstLine="0"/>
-        <ns0:jc ns0:val="both"/>
-      </ns0:pPr>
-      <ns0:r>
-        <ns0:rPr>
-          <ns0:rFonts ns0:ascii="Times New Roman" ns0:hAnsi="Times New Roman"/>
-          <ns0:sz ns0:val="28"/>
-        </ns0:rPr>
-        <ns0:t xml:space="preserve"/>
-      </ns0:r>
-    </ns0:p>
-    <ns0:p>
-      <ns0:pPr>
-        <ns0:spacing ns0:after="0" ns0:line="360" ns0:lineRule="auto"/>
-        <ns0:ind ns0:firstLine="709"/>
-        <ns0:jc ns0:val="both"/>
-      </ns0:pPr>
-      <ns0:r>
-        <ns0:rPr>
-          <ns0:rFonts ns0:ascii="Times New Roman" ns0:hAnsi="Times New Roman"/>
-          <ns0:sz ns0:val="28"/>
-        </ns0:rPr>
-        <ns0:t xml:space="preserve">Умножение на число k·a⃗ изменяет длину в |k| раз; при отрицательном k направление меняется на противоположное.</ns0:t>
-      </ns0:r>
-    </ns0:p>
-    <ns0:p>
-      <ns0:pPr>
-        <ns0:spacing ns0:after="0" ns0:line="360" ns0:lineRule="auto"/>
-        <ns0:ind ns0:firstLine="0"/>
-        <ns0:jc ns0:val="both"/>
-      </ns0:pPr>
-      <ns0:r>
-        <ns0:rPr>
-          <ns0:rFonts ns0:ascii="Times New Roman" ns0:hAnsi="Times New Roman"/>
-          <ns0:sz ns0:val="28"/>
-        </ns0:rPr>
-        <ns0:t xml:space="preserve"/>
-      </ns0:r>
-    </ns0:p>
-    <ns0:p>
-      <ns0:pPr>
-        <ns0:spacing ns0:after="0" ns0:line="360" ns0:lineRule="auto"/>
-        <ns0:ind ns0:firstLine="709"/>
-        <ns0:jc ns0:val="both"/>
-      </ns0:pPr>
-      <ns0:r>
-        <ns0:rPr>
-          <ns0:rFonts ns0:ascii="Times New Roman" ns0:hAnsi="Times New Roman"/>
-          <ns0:sz ns0:val="28"/>
-        </ns0:rPr>
-        <ns0:t xml:space="preserve">Скалярное произведение a⃗·b⃗ = |a⃗|·|b⃗|·cosφ помогает находить угол между направлениями и использовать проекции (например, в задачах о работе силы).</ns0:t>
+        <ns0:t xml:space="preserve">1.1 Понятие вектора и основные характеристики………………………..4</ns0:t>
       </ns0:r>
     </ns0:p>
     <ns0:p>
@@ -2113,63 +2051,7 @@
           <ns0:sz ns0:val="28"/>
           <ns0:b/>
         </ns0:rPr>
-        <ns0:t xml:space="preserve">1.3. Векторы вокруг нас (короткие примеры)</ns0:t>
-      </ns0:r>
-    </ns0:p>
-    <ns0:p>
-      <ns0:pPr>
-        <ns0:spacing ns0:after="0" ns0:line="360" ns0:lineRule="auto"/>
-        <ns0:ind ns0:firstLine="0"/>
-        <ns0:jc ns0:val="both"/>
-      </ns0:pPr>
-      <ns0:r>
-        <ns0:rPr>
-          <ns0:rFonts ns0:ascii="Times New Roman" ns0:hAnsi="Times New Roman"/>
-          <ns0:sz ns0:val="28"/>
-        </ns0:rPr>
-        <ns0:t xml:space="preserve"/>
-      </ns0:r>
-    </ns0:p>
-    <ns0:p>
-      <ns0:pPr>
-        <ns0:spacing ns0:after="0" ns0:line="360" ns0:lineRule="auto"/>
-        <ns0:ind ns0:firstLine="709"/>
-        <ns0:jc ns0:val="both"/>
-      </ns0:pPr>
-      <ns0:r>
-        <ns0:rPr>
-          <ns0:rFonts ns0:ascii="Times New Roman" ns0:hAnsi="Times New Roman"/>
-          <ns0:sz ns0:val="28"/>
-        </ns0:rPr>
-        <ns0:t xml:space="preserve">Скорость и ускорение — векторы, потому что при повороте меняется направление движения. Сила — вектор, поэтому несколько сил складываются, образуя результирующую. Ветер описывают направлением и скоростью. В навигации маршрут можно представить суммой перемещений между точками.</ns0:t>
-      </ns0:r>
-    </ns0:p>
-    <ns0:p>
-      <ns0:pPr>
-        <ns0:spacing ns0:after="0" ns0:line="360" ns0:lineRule="auto"/>
-        <ns0:ind ns0:firstLine="0"/>
-        <ns0:jc ns0:val="both"/>
-      </ns0:pPr>
-      <ns0:r>
-        <ns0:rPr>
-          <ns0:rFonts ns0:ascii="Times New Roman" ns0:hAnsi="Times New Roman"/>
-          <ns0:sz ns0:val="28"/>
-        </ns0:rPr>
-        <ns0:t xml:space="preserve"/>
-      </ns0:r>
-    </ns0:p>
-    <ns0:p>
-      <ns0:pPr>
-        <ns0:spacing ns0:after="0" ns0:line="360" ns0:lineRule="auto"/>
-        <ns0:ind ns0:firstLine="709"/>
-        <ns0:jc ns0:val="both"/>
-      </ns0:pPr>
-      <ns0:r>
-        <ns0:rPr>
-          <ns0:rFonts ns0:ascii="Times New Roman" ns0:hAnsi="Times New Roman"/>
-          <ns0:sz ns0:val="28"/>
-        </ns0:rPr>
-        <ns0:t xml:space="preserve">Пример: человек прошёл 300 м на восток и 400 м на север. Результирующее перемещение — диагональ, модуль √(300²+400²)=500 м.</ns0:t>
+        <ns0:t xml:space="preserve">1.2 Координаты вектора и модуль………………………………………….6</ns0:t>
       </ns0:r>
     </ns0:p>
     <ns0:p>
@@ -2198,7 +2080,35 @@
           <ns0:sz ns0:val="28"/>
           <ns0:b/>
         </ns0:rPr>
-        <ns0:t xml:space="preserve">2. ПРАКТИЧЕСКАЯ ЧАСТЬ (ОПРОС)</ns0:t>
+        <ns0:t xml:space="preserve">1.3 Операции над векторами и их смысл…………………………………..8</ns0:t>
+      </ns0:r>
+    </ns0:p>
+    <ns0:p>
+      <ns0:pPr>
+        <ns0:spacing ns0:after="0" ns0:line="360" ns0:lineRule="auto"/>
+        <ns0:ind ns0:firstLine="0"/>
+        <ns0:jc ns0:val="both"/>
+      </ns0:pPr>
+      <ns0:r>
+        <ns0:rPr>
+          <ns0:rFonts ns0:ascii="Times New Roman" ns0:hAnsi="Times New Roman"/>
+          <ns0:sz ns0:val="28"/>
+        </ns0:rPr>
+        <ns0:t xml:space="preserve"/>
+      </ns0:r>
+    </ns0:p>
+    <ns0:p>
+      <ns0:pPr>
+        <ns0:spacing ns0:after="0" ns0:line="360" ns0:lineRule="auto"/>
+        <ns0:ind ns0:firstLine="709"/>
+        <ns0:jc ns0:val="both"/>
+      </ns0:pPr>
+      <ns0:r>
+        <ns0:rPr>
+          <ns0:rFonts ns0:ascii="Times New Roman" ns0:hAnsi="Times New Roman"/>
+          <ns0:sz ns0:val="28"/>
+        </ns0:rPr>
+        <ns0:t xml:space="preserve">Глава 2. Практическая часть: опрос и диаграммы</ns0:t>
       </ns0:r>
     </ns0:p>
     <ns0:p>
@@ -2227,35 +2137,7 @@
           <ns0:sz ns0:val="28"/>
           <ns0:b/>
         </ns0:rPr>
-        <ns0:t xml:space="preserve">2.1. Организация опроса</ns0:t>
-      </ns0:r>
-    </ns0:p>
-    <ns0:p>
-      <ns0:pPr>
-        <ns0:spacing ns0:after="0" ns0:line="360" ns0:lineRule="auto"/>
-        <ns0:ind ns0:firstLine="0"/>
-        <ns0:jc ns0:val="both"/>
-      </ns0:pPr>
-      <ns0:r>
-        <ns0:rPr>
-          <ns0:rFonts ns0:ascii="Times New Roman" ns0:hAnsi="Times New Roman"/>
-          <ns0:sz ns0:val="28"/>
-        </ns0:rPr>
-        <ns0:t xml:space="preserve"/>
-      </ns0:r>
-    </ns0:p>
-    <ns0:p>
-      <ns0:pPr>
-        <ns0:spacing ns0:after="0" ns0:line="360" ns0:lineRule="auto"/>
-        <ns0:ind ns0:firstLine="709"/>
-        <ns0:jc ns0:val="both"/>
-      </ns0:pPr>
-      <ns0:r>
-        <ns0:rPr>
-          <ns0:rFonts ns0:ascii="Times New Roman" ns0:hAnsi="Times New Roman"/>
-          <ns0:sz ns0:val="28"/>
-        </ns0:rPr>
-        <ns0:t xml:space="preserve">Проведён анонимный опрос из 8 вопросов. Участники: 30 человек. Цель — выяснить, узнают ли респонденты векторы в типичных ситуациях и различают ли векторные и скалярные величины.</ns0:t>
+        <ns0:t xml:space="preserve">2.1 Организация и проведение опроса……………………………………10</ns0:t>
       </ns0:r>
     </ns0:p>
     <ns0:p>
@@ -2284,161 +2166,7 @@
           <ns0:sz ns0:val="28"/>
           <ns0:b/>
         </ns0:rPr>
-        <ns0:t xml:space="preserve">2.2. Результаты опроса</ns0:t>
-      </ns0:r>
-    </ns0:p>
-    <ns0:p>
-      <ns0:pPr>
-        <ns0:spacing ns0:after="0" ns0:line="360" ns0:lineRule="auto"/>
-        <ns0:ind ns0:firstLine="0"/>
-        <ns0:jc ns0:val="both"/>
-      </ns0:pPr>
-      <ns0:r>
-        <ns0:rPr>
-          <ns0:rFonts ns0:ascii="Times New Roman" ns0:hAnsi="Times New Roman"/>
-          <ns0:sz ns0:val="28"/>
-        </ns0:rPr>
-        <ns0:t xml:space="preserve"/>
-      </ns0:r>
-    </ns0:p>
-    <ns0:p>
-      <ns0:pPr>
-        <ns0:spacing ns0:after="0" ns0:line="360" ns0:lineRule="auto"/>
-        <ns0:ind ns0:firstLine="709"/>
-        <ns0:jc ns0:val="both"/>
-      </ns0:pPr>
-      <ns0:r>
-        <ns0:rPr>
-          <ns0:rFonts ns0:ascii="Times New Roman" ns0:hAnsi="Times New Roman"/>
-          <ns0:sz ns0:val="28"/>
-        </ns0:rPr>
-        <ns0:t xml:space="preserve">Вопрос 1: Да — 18; Примерно — 10; Нет — 2.</ns0:t>
-      </ns0:r>
-    </ns0:p>
-    <ns0:p>
-      <ns0:pPr>
-        <ns0:spacing ns0:after="0" ns0:line="360" ns0:lineRule="auto"/>
-        <ns0:ind ns0:firstLine="709"/>
-        <ns0:jc ns0:val="both"/>
-      </ns0:pPr>
-      <ns0:r>
-        <ns0:rPr>
-          <ns0:rFonts ns0:ascii="Times New Roman" ns0:hAnsi="Times New Roman"/>
-          <ns0:sz ns0:val="28"/>
-        </ns0:rPr>
-        <ns0:t xml:space="preserve">Вопрос 2: Математика — 17; Физика — 6; Компьютерная графика — 3; Медицина — 2; Не встречаю — 2.</ns0:t>
-      </ns0:r>
-    </ns0:p>
-    <ns0:p>
-      <ns0:pPr>
-        <ns0:spacing ns0:after="0" ns0:line="360" ns0:lineRule="auto"/>
-        <ns0:ind ns0:firstLine="709"/>
-        <ns0:jc ns0:val="both"/>
-      </ns0:pPr>
-      <ns0:r>
-        <ns0:rPr>
-          <ns0:rFonts ns0:ascii="Times New Roman" ns0:hAnsi="Times New Roman"/>
-          <ns0:sz ns0:val="28"/>
-        </ns0:rPr>
-        <ns0:t xml:space="preserve">Вопрос 3: Только величина — 1; Только направление — 0; Величина и направление — 27; Не знаю — 2.</ns0:t>
-      </ns0:r>
-    </ns0:p>
-    <ns0:p>
-      <ns0:pPr>
-        <ns0:spacing ns0:after="0" ns0:line="360" ns0:lineRule="auto"/>
-        <ns0:ind ns0:firstLine="709"/>
-        <ns0:jc ns0:val="both"/>
-      </ns0:pPr>
-      <ns0:r>
-        <ns0:rPr>
-          <ns0:rFonts ns0:ascii="Times New Roman" ns0:hAnsi="Times New Roman"/>
-          <ns0:sz ns0:val="28"/>
-        </ns0:rPr>
-        <ns0:t xml:space="preserve">Вопрос 4: Да — 23; Нет — 2; Не уверен(а) — 5.</ns0:t>
-      </ns0:r>
-    </ns0:p>
-    <ns0:p>
-      <ns0:pPr>
-        <ns0:spacing ns0:after="0" ns0:line="360" ns0:lineRule="auto"/>
-        <ns0:ind ns0:firstLine="709"/>
-        <ns0:jc ns0:val="both"/>
-      </ns0:pPr>
-      <ns0:r>
-        <ns0:rPr>
-          <ns0:rFonts ns0:ascii="Times New Roman" ns0:hAnsi="Times New Roman"/>
-          <ns0:sz ns0:val="28"/>
-        </ns0:rPr>
-        <ns0:t xml:space="preserve">Вопрос 5: Да — 3; Нет — 21; Не уверен(а) — 6.</ns0:t>
-      </ns0:r>
-    </ns0:p>
-    <ns0:p>
-      <ns0:pPr>
-        <ns0:spacing ns0:after="0" ns0:line="360" ns0:lineRule="auto"/>
-        <ns0:ind ns0:firstLine="709"/>
-        <ns0:jc ns0:val="both"/>
-      </ns0:pPr>
-      <ns0:r>
-        <ns0:rPr>
-          <ns0:rFonts ns0:ascii="Times New Roman" ns0:hAnsi="Times New Roman"/>
-          <ns0:sz ns0:val="28"/>
-        </ns0:rPr>
-        <ns0:t xml:space="preserve">Вопрос 6: Сумма расстояний — 6; Вектор от начала к концу — 21; Среднее — 1; Не знаю — 2.</ns0:t>
-      </ns0:r>
-    </ns0:p>
-    <ns0:p>
-      <ns0:pPr>
-        <ns0:spacing ns0:after="0" ns0:line="360" ns0:lineRule="auto"/>
-        <ns0:ind ns0:firstLine="709"/>
-        <ns0:jc ns0:val="both"/>
-      </ns0:pPr>
-      <ns0:r>
-        <ns0:rPr>
-          <ns0:rFonts ns0:ascii="Times New Roman" ns0:hAnsi="Times New Roman"/>
-          <ns0:sz ns0:val="28"/>
-        </ns0:rPr>
-        <ns0:t xml:space="preserve">Вопрос 7: Навигация — 6; Спорт — 3; Техника — 4; Компьютерные технологии — 3; Везде перечисленное — 14.</ns0:t>
-      </ns0:r>
-    </ns0:p>
-    <ns0:p>
-      <ns0:pPr>
-        <ns0:spacing ns0:after="0" ns0:line="360" ns0:lineRule="auto"/>
-        <ns0:ind ns0:firstLine="709"/>
-        <ns0:jc ns0:val="both"/>
-      </ns0:pPr>
-      <ns0:r>
-        <ns0:rPr>
-          <ns0:rFonts ns0:ascii="Times New Roman" ns0:hAnsi="Times New Roman"/>
-          <ns0:sz ns0:val="28"/>
-        </ns0:rPr>
-        <ns0:t xml:space="preserve">Вопрос 8: Да — 22; Нет — 1; Иногда — 7.</ns0:t>
-      </ns0:r>
-    </ns0:p>
-    <ns0:p>
-      <ns0:pPr>
-        <ns0:spacing ns0:after="0" ns0:line="360" ns0:lineRule="auto"/>
-        <ns0:ind ns0:firstLine="0"/>
-        <ns0:jc ns0:val="both"/>
-      </ns0:pPr>
-      <ns0:r>
-        <ns0:rPr>
-          <ns0:rFonts ns0:ascii="Times New Roman" ns0:hAnsi="Times New Roman"/>
-          <ns0:sz ns0:val="28"/>
-        </ns0:rPr>
-        <ns0:t xml:space="preserve"/>
-      </ns0:r>
-    </ns0:p>
-    <ns0:p>
-      <ns0:pPr>
-        <ns0:spacing ns0:after="0" ns0:line="360" ns0:lineRule="auto"/>
-        <ns0:ind ns0:firstLine="709"/>
-        <ns0:jc ns0:val="both"/>
-      </ns0:pPr>
-      <ns0:r>
-        <ns0:rPr>
-          <ns0:rFonts ns0:ascii="Times New Roman" ns0:hAnsi="Times New Roman"/>
-          <ns0:sz ns0:val="28"/>
-        </ns0:rPr>
-        <ns0:t xml:space="preserve">На рисунках 1–8 представлены диаграммы распределения ответов по вопросам 1–8.</ns0:t>
+        <ns0:t xml:space="preserve">2.2 Диаграммы результатов опроса………………………………………12</ns0:t>
       </ns0:r>
     </ns0:p>
     <ns0:p>
@@ -2467,35 +2195,855 @@
           <ns0:sz ns0:val="28"/>
           <ns0:b/>
         </ns0:rPr>
-        <ns0:t xml:space="preserve">2.3. Выводы по опросу</ns0:t>
-      </ns0:r>
-    </ns0:p>
-    <ns0:p>
-      <ns0:pPr>
-        <ns0:spacing ns0:after="0" ns0:line="360" ns0:lineRule="auto"/>
-        <ns0:ind ns0:firstLine="0"/>
-        <ns0:jc ns0:val="both"/>
-      </ns0:pPr>
-      <ns0:r>
-        <ns0:rPr>
-          <ns0:rFonts ns0:ascii="Times New Roman" ns0:hAnsi="Times New Roman"/>
-          <ns0:sz ns0:val="28"/>
-        </ns0:rPr>
-        <ns0:t xml:space="preserve"/>
-      </ns0:r>
-    </ns0:p>
-    <ns0:p>
-      <ns0:pPr>
-        <ns0:spacing ns0:after="0" ns0:line="360" ns0:lineRule="auto"/>
-        <ns0:ind ns0:firstLine="709"/>
-        <ns0:jc ns0:val="both"/>
-      </ns0:pPr>
-      <ns0:r>
-        <ns0:rPr>
-          <ns0:rFonts ns0:ascii="Times New Roman" ns0:hAnsi="Times New Roman"/>
-          <ns0:sz ns0:val="28"/>
-        </ns0:rPr>
-        <ns0:t xml:space="preserve">Большинство респондентов понимают, что векторная величина должна иметь и направление, и величину (вопрос 3), и верно отличают скорость (вектор) от температуры (скаляр). Также многие отмечают, что примеры из жизни помогают лучше усваивать тему.</ns0:t>
+        <ns0:t xml:space="preserve">2.3 Выводы по результатам опроса………………………………………15</ns0:t>
+      </ns0:r>
+    </ns0:p>
+    <ns0:p>
+      <ns0:pPr>
+        <ns0:spacing ns0:after="0" ns0:line="360" ns0:lineRule="auto"/>
+        <ns0:ind ns0:firstLine="0"/>
+        <ns0:jc ns0:val="both"/>
+      </ns0:pPr>
+      <ns0:r>
+        <ns0:rPr>
+          <ns0:rFonts ns0:ascii="Times New Roman" ns0:hAnsi="Times New Roman"/>
+          <ns0:sz ns0:val="28"/>
+        </ns0:rPr>
+        <ns0:t xml:space="preserve"/>
+      </ns0:r>
+    </ns0:p>
+    <ns0:p>
+      <ns0:pPr>
+        <ns0:spacing ns0:after="0" ns0:line="360" ns0:lineRule="auto"/>
+        <ns0:ind ns0:firstLine="709"/>
+        <ns0:jc ns0:val="both"/>
+      </ns0:pPr>
+      <ns0:r>
+        <ns0:rPr>
+          <ns0:rFonts ns0:ascii="Times New Roman" ns0:hAnsi="Times New Roman"/>
+          <ns0:sz ns0:val="28"/>
+        </ns0:rPr>
+        <ns0:t xml:space="preserve">Заключение…………………………………………………………………..16</ns0:t>
+      </ns0:r>
+    </ns0:p>
+    <ns0:p>
+      <ns0:pPr>
+        <ns0:spacing ns0:after="0" ns0:line="360" ns0:lineRule="auto"/>
+        <ns0:ind ns0:firstLine="0"/>
+        <ns0:jc ns0:val="both"/>
+      </ns0:pPr>
+      <ns0:r>
+        <ns0:rPr>
+          <ns0:rFonts ns0:ascii="Times New Roman" ns0:hAnsi="Times New Roman"/>
+          <ns0:sz ns0:val="28"/>
+        </ns0:rPr>
+        <ns0:t xml:space="preserve"/>
+      </ns0:r>
+    </ns0:p>
+    <ns0:p>
+      <ns0:pPr>
+        <ns0:spacing ns0:after="0" ns0:line="360" ns0:lineRule="auto"/>
+        <ns0:ind ns0:firstLine="709"/>
+        <ns0:jc ns0:val="both"/>
+      </ns0:pPr>
+      <ns0:r>
+        <ns0:rPr>
+          <ns0:rFonts ns0:ascii="Times New Roman" ns0:hAnsi="Times New Roman"/>
+          <ns0:sz ns0:val="28"/>
+        </ns0:rPr>
+        <ns0:t xml:space="preserve">Список использованных источников……………………………………..17</ns0:t>
+      </ns0:r>
+    </ns0:p>
+    <ns0:p>
+      <ns0:pPr>
+        <ns0:spacing ns0:after="0" ns0:line="360" ns0:lineRule="auto"/>
+        <ns0:ind ns0:firstLine="0"/>
+        <ns0:jc ns0:val="both"/>
+      </ns0:pPr>
+      <ns0:r>
+        <ns0:rPr>
+          <ns0:rFonts ns0:ascii="Times New Roman" ns0:hAnsi="Times New Roman"/>
+          <ns0:sz ns0:val="28"/>
+        </ns0:rPr>
+        <ns0:t xml:space="preserve"/>
+      </ns0:r>
+    </ns0:p>
+    <ns0:p>
+      <ns0:pPr>
+        <ns0:spacing ns0:after="0" ns0:line="360" ns0:lineRule="auto"/>
+        <ns0:ind ns0:firstLine="709"/>
+        <ns0:jc ns0:val="both"/>
+      </ns0:pPr>
+      <ns0:r>
+        <ns0:rPr>
+          <ns0:rFonts ns0:ascii="Times New Roman" ns0:hAnsi="Times New Roman"/>
+          <ns0:sz ns0:val="28"/>
+        </ns0:rPr>
+        <ns0:t xml:space="preserve">Приложение А. Анкета……………………………………………………..18</ns0:t>
+      </ns0:r>
+    </ns0:p>
+    <ns0:p>
+      <ns0:pPr>
+        <ns0:spacing ns0:after="0" ns0:line="360" ns0:lineRule="auto"/>
+        <ns0:ind ns0:firstLine="0"/>
+        <ns0:jc ns0:val="both"/>
+      </ns0:pPr>
+      <ns0:r>
+        <ns0:rPr>
+          <ns0:rFonts ns0:ascii="Times New Roman" ns0:hAnsi="Times New Roman"/>
+          <ns0:sz ns0:val="28"/>
+        </ns0:rPr>
+        <ns0:t xml:space="preserve"/>
+      </ns0:r>
+    </ns0:p>
+    <ns0:p>
+      <ns0:pPr>
+        <ns0:spacing ns0:after="0" ns0:line="360" ns0:lineRule="auto"/>
+        <ns0:ind ns0:firstLine="709"/>
+        <ns0:jc ns0:val="both"/>
+      </ns0:pPr>
+      <ns0:r>
+        <ns0:rPr>
+          <ns0:rFonts ns0:ascii="Times New Roman" ns0:hAnsi="Times New Roman"/>
+          <ns0:sz ns0:val="28"/>
+        </ns0:rPr>
+        <ns0:t xml:space="preserve">Приложение Б. Сырые данные опроса…………………………………..19</ns0:t>
+      </ns0:r>
+    </ns0:p>
+    <ns0:p>
+      <ns0:pPr>
+        <ns0:spacing ns0:after="0" ns0:line="360" ns0:lineRule="auto"/>
+        <ns0:ind ns0:firstLine="0"/>
+        <ns0:jc ns0:val="both"/>
+      </ns0:pPr>
+      <ns0:r>
+        <ns0:rPr>
+          <ns0:rFonts ns0:ascii="Times New Roman" ns0:hAnsi="Times New Roman"/>
+          <ns0:sz ns0:val="28"/>
+        </ns0:rPr>
+        <ns0:t xml:space="preserve"/>
+      </ns0:r>
+    </ns0:p>
+    <ns0:p>
+      <ns0:pPr>
+        <ns0:spacing ns0:after="0" ns0:line="360" ns0:lineRule="auto"/>
+        <ns0:ind ns0:firstLine="0"/>
+        <ns0:jc ns0:val="both"/>
+      </ns0:pPr>
+      <ns0:r>
+        <ns0:rPr>
+          <ns0:rFonts ns0:ascii="Times New Roman" ns0:hAnsi="Times New Roman"/>
+          <ns0:sz ns0:val="28"/>
+          <ns0:b/>
+        </ns0:rPr>
+        <ns0:t xml:space="preserve">ГЛАВА 1. ВЕКТОРЫ КАК МАТЕМАТИЧЕСКАЯ МОДЕЛЬ НАПРАВЛЕННЫХ ВЕЛИЧИН</ns0:t>
+      </ns0:r>
+    </ns0:p>
+    <ns0:p>
+      <ns0:pPr>
+        <ns0:spacing ns0:after="0" ns0:line="360" ns0:lineRule="auto"/>
+        <ns0:ind ns0:firstLine="0"/>
+        <ns0:jc ns0:val="both"/>
+      </ns0:pPr>
+      <ns0:r>
+        <ns0:rPr>
+          <ns0:rFonts ns0:ascii="Times New Roman" ns0:hAnsi="Times New Roman"/>
+          <ns0:sz ns0:val="28"/>
+        </ns0:rPr>
+        <ns0:t xml:space="preserve"/>
+      </ns0:r>
+    </ns0:p>
+    <ns0:p>
+      <ns0:pPr>
+        <ns0:spacing ns0:after="0" ns0:line="360" ns0:lineRule="auto"/>
+        <ns0:ind ns0:firstLine="0"/>
+        <ns0:jc ns0:val="both"/>
+      </ns0:pPr>
+      <ns0:r>
+        <ns0:rPr>
+          <ns0:rFonts ns0:ascii="Times New Roman" ns0:hAnsi="Times New Roman"/>
+          <ns0:sz ns0:val="28"/>
+          <ns0:b/>
+        </ns0:rPr>
+        <ns0:t xml:space="preserve">1.1 Понятие вектора и основные характеристики</ns0:t>
+      </ns0:r>
+    </ns0:p>
+    <ns0:p>
+      <ns0:pPr>
+        <ns0:spacing ns0:after="0" ns0:line="360" ns0:lineRule="auto"/>
+        <ns0:ind ns0:firstLine="0"/>
+        <ns0:jc ns0:val="both"/>
+      </ns0:pPr>
+      <ns0:r>
+        <ns0:rPr>
+          <ns0:rFonts ns0:ascii="Times New Roman" ns0:hAnsi="Times New Roman"/>
+          <ns0:sz ns0:val="28"/>
+        </ns0:rPr>
+        <ns0:t xml:space="preserve"/>
+      </ns0:r>
+    </ns0:p>
+    <ns0:p>
+      <ns0:pPr>
+        <ns0:spacing ns0:after="0" ns0:line="360" ns0:lineRule="auto"/>
+        <ns0:ind ns0:firstLine="709"/>
+        <ns0:jc ns0:val="both"/>
+      </ns0:pPr>
+      <ns0:r>
+        <ns0:rPr>
+          <ns0:rFonts ns0:ascii="Times New Roman" ns0:hAnsi="Times New Roman"/>
+          <ns0:sz ns0:val="28"/>
+        </ns0:rPr>
+        <ns0:t xml:space="preserve">Вектором называют направленный отрезок. Он задаётся начальной и конечной точками и показывает направление от начала к концу. Вектор характеризуется длиной (модулем) и направлением.</ns0:t>
+      </ns0:r>
+    </ns0:p>
+    <ns0:p>
+      <ns0:pPr>
+        <ns0:spacing ns0:after="0" ns0:line="360" ns0:lineRule="auto"/>
+        <ns0:ind ns0:firstLine="0"/>
+        <ns0:jc ns0:val="both"/>
+      </ns0:pPr>
+      <ns0:r>
+        <ns0:rPr>
+          <ns0:rFonts ns0:ascii="Times New Roman" ns0:hAnsi="Times New Roman"/>
+          <ns0:sz ns0:val="28"/>
+        </ns0:rPr>
+        <ns0:t xml:space="preserve"/>
+      </ns0:r>
+    </ns0:p>
+    <ns0:p>
+      <ns0:pPr>
+        <ns0:spacing ns0:after="0" ns0:line="360" ns0:lineRule="auto"/>
+        <ns0:ind ns0:firstLine="709"/>
+        <ns0:jc ns0:val="both"/>
+      </ns0:pPr>
+      <ns0:r>
+        <ns0:rPr>
+          <ns0:rFonts ns0:ascii="Times New Roman" ns0:hAnsi="Times New Roman"/>
+          <ns0:sz ns0:val="28"/>
+        </ns0:rPr>
+        <ns0:t xml:space="preserve">Равные векторы имеют одинаковые модуль и направление, даже если расположены в разных местах. Противоположные векторы равны по длине, но направлены в разные стороны. Нулевой вектор имеет модуль 0.</ns0:t>
+      </ns0:r>
+    </ns0:p>
+    <ns0:p>
+      <ns0:pPr>
+        <ns0:spacing ns0:after="0" ns0:line="360" ns0:lineRule="auto"/>
+        <ns0:ind ns0:firstLine="0"/>
+        <ns0:jc ns0:val="both"/>
+      </ns0:pPr>
+      <ns0:r>
+        <ns0:rPr>
+          <ns0:rFonts ns0:ascii="Times New Roman" ns0:hAnsi="Times New Roman"/>
+          <ns0:sz ns0:val="28"/>
+        </ns0:rPr>
+        <ns0:t xml:space="preserve"/>
+      </ns0:r>
+    </ns0:p>
+    <ns0:p>
+      <ns0:pPr>
+        <ns0:spacing ns0:after="0" ns0:line="360" ns0:lineRule="auto"/>
+        <ns0:ind ns0:firstLine="709"/>
+        <ns0:jc ns0:val="both"/>
+      </ns0:pPr>
+      <ns0:r>
+        <ns0:rPr>
+          <ns0:rFonts ns0:ascii="Times New Roman" ns0:hAnsi="Times New Roman"/>
+          <ns0:sz ns0:val="28"/>
+        </ns0:rPr>
+        <ns0:t xml:space="preserve">В реальной жизни векторная модель удобна там, где важны «сколько» и «куда»: перемещение, скорость, сила, направление ветра.</ns0:t>
+      </ns0:r>
+    </ns0:p>
+    <ns0:p>
+      <ns0:pPr>
+        <ns0:spacing ns0:after="0" ns0:line="360" ns0:lineRule="auto"/>
+        <ns0:ind ns0:firstLine="0"/>
+        <ns0:jc ns0:val="both"/>
+      </ns0:pPr>
+      <ns0:r>
+        <ns0:rPr>
+          <ns0:rFonts ns0:ascii="Times New Roman" ns0:hAnsi="Times New Roman"/>
+          <ns0:sz ns0:val="28"/>
+        </ns0:rPr>
+        <ns0:t xml:space="preserve"/>
+      </ns0:r>
+    </ns0:p>
+    <ns0:p>
+      <ns0:pPr>
+        <ns0:spacing ns0:after="0" ns0:line="360" ns0:lineRule="auto"/>
+        <ns0:ind ns0:firstLine="0"/>
+        <ns0:jc ns0:val="both"/>
+      </ns0:pPr>
+      <ns0:r>
+        <ns0:rPr>
+          <ns0:rFonts ns0:ascii="Times New Roman" ns0:hAnsi="Times New Roman"/>
+          <ns0:sz ns0:val="28"/>
+          <ns0:b/>
+        </ns0:rPr>
+        <ns0:t xml:space="preserve">1.2 Координаты вектора и модуль</ns0:t>
+      </ns0:r>
+    </ns0:p>
+    <ns0:p>
+      <ns0:pPr>
+        <ns0:spacing ns0:after="0" ns0:line="360" ns0:lineRule="auto"/>
+        <ns0:ind ns0:firstLine="0"/>
+        <ns0:jc ns0:val="both"/>
+      </ns0:pPr>
+      <ns0:r>
+        <ns0:rPr>
+          <ns0:rFonts ns0:ascii="Times New Roman" ns0:hAnsi="Times New Roman"/>
+          <ns0:sz ns0:val="28"/>
+        </ns0:rPr>
+        <ns0:t xml:space="preserve"/>
+      </ns0:r>
+    </ns0:p>
+    <ns0:p>
+      <ns0:pPr>
+        <ns0:spacing ns0:after="0" ns0:line="360" ns0:lineRule="auto"/>
+        <ns0:ind ns0:firstLine="709"/>
+        <ns0:jc ns0:val="both"/>
+      </ns0:pPr>
+      <ns0:r>
+        <ns0:rPr>
+          <ns0:rFonts ns0:ascii="Times New Roman" ns0:hAnsi="Times New Roman"/>
+          <ns0:sz ns0:val="28"/>
+        </ns0:rPr>
+        <ns0:t xml:space="preserve">На координатной плоскости вектор удобно описывать координатами. Если заданы точки A(x1; y1) и B(x2; y2), то координаты вектора AB⃗ равны (x2 − x1; y2 − y1).</ns0:t>
+      </ns0:r>
+    </ns0:p>
+    <ns0:p>
+      <ns0:pPr>
+        <ns0:spacing ns0:after="0" ns0:line="360" ns0:lineRule="auto"/>
+        <ns0:ind ns0:firstLine="0"/>
+        <ns0:jc ns0:val="both"/>
+      </ns0:pPr>
+      <ns0:r>
+        <ns0:rPr>
+          <ns0:rFonts ns0:ascii="Times New Roman" ns0:hAnsi="Times New Roman"/>
+          <ns0:sz ns0:val="28"/>
+        </ns0:rPr>
+        <ns0:t xml:space="preserve"/>
+      </ns0:r>
+    </ns0:p>
+    <ns0:p>
+      <ns0:pPr>
+        <ns0:spacing ns0:after="0" ns0:line="360" ns0:lineRule="auto"/>
+        <ns0:ind ns0:firstLine="709"/>
+        <ns0:jc ns0:val="both"/>
+      </ns0:pPr>
+      <ns0:r>
+        <ns0:rPr>
+          <ns0:rFonts ns0:ascii="Times New Roman" ns0:hAnsi="Times New Roman"/>
+          <ns0:sz ns0:val="28"/>
+        </ns0:rPr>
+        <ns0:t xml:space="preserve">Координаты вектора показывают, на сколько единиц нужно сместиться по оси x и по оси y, чтобы перейти из A в B. Например, из A(−2; 1) в B(3; 5) нужно сместиться на 5 вправо и на 4 вверх: AB⃗=(5; 4).</ns0:t>
+      </ns0:r>
+    </ns0:p>
+    <ns0:p>
+      <ns0:pPr>
+        <ns0:spacing ns0:after="0" ns0:line="360" ns0:lineRule="auto"/>
+        <ns0:ind ns0:firstLine="0"/>
+        <ns0:jc ns0:val="both"/>
+      </ns0:pPr>
+      <ns0:r>
+        <ns0:rPr>
+          <ns0:rFonts ns0:ascii="Times New Roman" ns0:hAnsi="Times New Roman"/>
+          <ns0:sz ns0:val="28"/>
+        </ns0:rPr>
+        <ns0:t xml:space="preserve"/>
+      </ns0:r>
+    </ns0:p>
+    <ns0:p>
+      <ns0:pPr>
+        <ns0:spacing ns0:after="0" ns0:line="360" ns0:lineRule="auto"/>
+        <ns0:ind ns0:firstLine="709"/>
+        <ns0:jc ns0:val="both"/>
+      </ns0:pPr>
+      <ns0:r>
+        <ns0:rPr>
+          <ns0:rFonts ns0:ascii="Times New Roman" ns0:hAnsi="Times New Roman"/>
+          <ns0:sz ns0:val="28"/>
+        </ns0:rPr>
+        <ns0:t xml:space="preserve">Модуль вектора a⃗=(ax; ay) вычисляют по формуле |a⃗|=√(ax²+ay²). Эта формула связана с теоремой Пифагора и применяется при вычислении длины перемещения.</ns0:t>
+      </ns0:r>
+    </ns0:p>
+    <ns0:p>
+      <ns0:pPr>
+        <ns0:spacing ns0:after="0" ns0:line="360" ns0:lineRule="auto"/>
+        <ns0:ind ns0:firstLine="0"/>
+        <ns0:jc ns0:val="both"/>
+      </ns0:pPr>
+      <ns0:r>
+        <ns0:rPr>
+          <ns0:rFonts ns0:ascii="Times New Roman" ns0:hAnsi="Times New Roman"/>
+          <ns0:sz ns0:val="28"/>
+        </ns0:rPr>
+        <ns0:t xml:space="preserve"/>
+      </ns0:r>
+    </ns0:p>
+    <ns0:p>
+      <ns0:pPr>
+        <ns0:spacing ns0:after="0" ns0:line="360" ns0:lineRule="auto"/>
+        <ns0:ind ns0:firstLine="0"/>
+        <ns0:jc ns0:val="both"/>
+      </ns0:pPr>
+      <ns0:r>
+        <ns0:rPr>
+          <ns0:rFonts ns0:ascii="Times New Roman" ns0:hAnsi="Times New Roman"/>
+          <ns0:sz ns0:val="28"/>
+          <ns0:b/>
+        </ns0:rPr>
+        <ns0:t xml:space="preserve">1.3 Операции над векторами и их смысл</ns0:t>
+      </ns0:r>
+    </ns0:p>
+    <ns0:p>
+      <ns0:pPr>
+        <ns0:spacing ns0:after="0" ns0:line="360" ns0:lineRule="auto"/>
+        <ns0:ind ns0:firstLine="0"/>
+        <ns0:jc ns0:val="both"/>
+      </ns0:pPr>
+      <ns0:r>
+        <ns0:rPr>
+          <ns0:rFonts ns0:ascii="Times New Roman" ns0:hAnsi="Times New Roman"/>
+          <ns0:sz ns0:val="28"/>
+        </ns0:rPr>
+        <ns0:t xml:space="preserve"/>
+      </ns0:r>
+    </ns0:p>
+    <ns0:p>
+      <ns0:pPr>
+        <ns0:spacing ns0:after="0" ns0:line="360" ns0:lineRule="auto"/>
+        <ns0:ind ns0:firstLine="709"/>
+        <ns0:jc ns0:val="both"/>
+      </ns0:pPr>
+      <ns0:r>
+        <ns0:rPr>
+          <ns0:rFonts ns0:ascii="Times New Roman" ns0:hAnsi="Times New Roman"/>
+          <ns0:sz ns0:val="28"/>
+        </ns0:rPr>
+        <ns0:t xml:space="preserve">Сложение векторов соответствует последовательному выполнению перемещений: сначала по a⃗, затем по b⃗. Результирующее перемещение равно сумме a⃗+b⃗ (правило треугольника).</ns0:t>
+      </ns0:r>
+    </ns0:p>
+    <ns0:p>
+      <ns0:pPr>
+        <ns0:spacing ns0:after="0" ns0:line="360" ns0:lineRule="auto"/>
+        <ns0:ind ns0:firstLine="0"/>
+        <ns0:jc ns0:val="both"/>
+      </ns0:pPr>
+      <ns0:r>
+        <ns0:rPr>
+          <ns0:rFonts ns0:ascii="Times New Roman" ns0:hAnsi="Times New Roman"/>
+          <ns0:sz ns0:val="28"/>
+        </ns0:rPr>
+        <ns0:t xml:space="preserve"/>
+      </ns0:r>
+    </ns0:p>
+    <ns0:p>
+      <ns0:pPr>
+        <ns0:spacing ns0:after="0" ns0:line="360" ns0:lineRule="auto"/>
+        <ns0:ind ns0:firstLine="709"/>
+        <ns0:jc ns0:val="both"/>
+      </ns0:pPr>
+      <ns0:r>
+        <ns0:rPr>
+          <ns0:rFonts ns0:ascii="Times New Roman" ns0:hAnsi="Times New Roman"/>
+          <ns0:sz ns0:val="28"/>
+        </ns0:rPr>
+        <ns0:t xml:space="preserve">Вычитание векторов связано со сложением: a⃗−b⃗ = a⃗ + (−b⃗), где −b⃗ — вектор той же длины, но противоположного направления. Умножение вектора на число меняет его длину и, при отрицательном коэффициенте, направление.</ns0:t>
+      </ns0:r>
+    </ns0:p>
+    <ns0:p>
+      <ns0:pPr>
+        <ns0:spacing ns0:after="0" ns0:line="360" ns0:lineRule="auto"/>
+        <ns0:ind ns0:firstLine="0"/>
+        <ns0:jc ns0:val="both"/>
+      </ns0:pPr>
+      <ns0:r>
+        <ns0:rPr>
+          <ns0:rFonts ns0:ascii="Times New Roman" ns0:hAnsi="Times New Roman"/>
+          <ns0:sz ns0:val="28"/>
+        </ns0:rPr>
+        <ns0:t xml:space="preserve"/>
+      </ns0:r>
+    </ns0:p>
+    <ns0:p>
+      <ns0:pPr>
+        <ns0:spacing ns0:after="0" ns0:line="360" ns0:lineRule="auto"/>
+        <ns0:ind ns0:firstLine="709"/>
+        <ns0:jc ns0:val="both"/>
+      </ns0:pPr>
+      <ns0:r>
+        <ns0:rPr>
+          <ns0:rFonts ns0:ascii="Times New Roman" ns0:hAnsi="Times New Roman"/>
+          <ns0:sz ns0:val="28"/>
+        </ns0:rPr>
+        <ns0:t xml:space="preserve">Скалярное произведение помогает сравнивать направления и находить проекции. В прикладных задачах оно используется, например, при вычислении работы силы A=F⃗·s⃗.</ns0:t>
+      </ns0:r>
+    </ns0:p>
+    <ns0:p>
+      <ns0:pPr>
+        <ns0:spacing ns0:after="0" ns0:line="360" ns0:lineRule="auto"/>
+        <ns0:ind ns0:firstLine="0"/>
+        <ns0:jc ns0:val="both"/>
+      </ns0:pPr>
+      <ns0:r>
+        <ns0:rPr>
+          <ns0:rFonts ns0:ascii="Times New Roman" ns0:hAnsi="Times New Roman"/>
+          <ns0:sz ns0:val="28"/>
+        </ns0:rPr>
+        <ns0:t xml:space="preserve"/>
+      </ns0:r>
+    </ns0:p>
+    <ns0:p>
+      <ns0:pPr>
+        <ns0:spacing ns0:after="0" ns0:line="360" ns0:lineRule="auto"/>
+        <ns0:ind ns0:firstLine="0"/>
+        <ns0:jc ns0:val="both"/>
+      </ns0:pPr>
+      <ns0:r>
+        <ns0:rPr>
+          <ns0:rFonts ns0:ascii="Times New Roman" ns0:hAnsi="Times New Roman"/>
+          <ns0:sz ns0:val="28"/>
+          <ns0:b/>
+        </ns0:rPr>
+        <ns0:t xml:space="preserve">ГЛАВА 2. ПРАКТИЧЕСКАЯ ЧАСТЬ: ОПРОС И ДИАГРАММЫ</ns0:t>
+      </ns0:r>
+    </ns0:p>
+    <ns0:p>
+      <ns0:pPr>
+        <ns0:spacing ns0:after="0" ns0:line="360" ns0:lineRule="auto"/>
+        <ns0:ind ns0:firstLine="0"/>
+        <ns0:jc ns0:val="both"/>
+      </ns0:pPr>
+      <ns0:r>
+        <ns0:rPr>
+          <ns0:rFonts ns0:ascii="Times New Roman" ns0:hAnsi="Times New Roman"/>
+          <ns0:sz ns0:val="28"/>
+        </ns0:rPr>
+        <ns0:t xml:space="preserve"/>
+      </ns0:r>
+    </ns0:p>
+    <ns0:p>
+      <ns0:pPr>
+        <ns0:spacing ns0:after="0" ns0:line="360" ns0:lineRule="auto"/>
+        <ns0:ind ns0:firstLine="0"/>
+        <ns0:jc ns0:val="both"/>
+      </ns0:pPr>
+      <ns0:r>
+        <ns0:rPr>
+          <ns0:rFonts ns0:ascii="Times New Roman" ns0:hAnsi="Times New Roman"/>
+          <ns0:sz ns0:val="28"/>
+          <ns0:b/>
+        </ns0:rPr>
+        <ns0:t xml:space="preserve">2.1 Организация и проведение опроса</ns0:t>
+      </ns0:r>
+    </ns0:p>
+    <ns0:p>
+      <ns0:pPr>
+        <ns0:spacing ns0:after="0" ns0:line="360" ns0:lineRule="auto"/>
+        <ns0:ind ns0:firstLine="0"/>
+        <ns0:jc ns0:val="both"/>
+      </ns0:pPr>
+      <ns0:r>
+        <ns0:rPr>
+          <ns0:rFonts ns0:ascii="Times New Roman" ns0:hAnsi="Times New Roman"/>
+          <ns0:sz ns0:val="28"/>
+        </ns0:rPr>
+        <ns0:t xml:space="preserve"/>
+      </ns0:r>
+    </ns0:p>
+    <ns0:p>
+      <ns0:pPr>
+        <ns0:spacing ns0:after="0" ns0:line="360" ns0:lineRule="auto"/>
+        <ns0:ind ns0:firstLine="709"/>
+        <ns0:jc ns0:val="both"/>
+      </ns0:pPr>
+      <ns0:r>
+        <ns0:rPr>
+          <ns0:rFonts ns0:ascii="Times New Roman" ns0:hAnsi="Times New Roman"/>
+          <ns0:sz ns0:val="28"/>
+        </ns0:rPr>
+        <ns0:t xml:space="preserve">Цель опроса — выяснить, насколько респонденты узнают векторы в жизненных ситуациях и различают векторные и скалярные величины.</ns0:t>
+      </ns0:r>
+    </ns0:p>
+    <ns0:p>
+      <ns0:pPr>
+        <ns0:spacing ns0:after="0" ns0:line="360" ns0:lineRule="auto"/>
+        <ns0:ind ns0:firstLine="0"/>
+        <ns0:jc ns0:val="both"/>
+      </ns0:pPr>
+      <ns0:r>
+        <ns0:rPr>
+          <ns0:rFonts ns0:ascii="Times New Roman" ns0:hAnsi="Times New Roman"/>
+          <ns0:sz ns0:val="28"/>
+        </ns0:rPr>
+        <ns0:t xml:space="preserve"/>
+      </ns0:r>
+    </ns0:p>
+    <ns0:p>
+      <ns0:pPr>
+        <ns0:spacing ns0:after="0" ns0:line="360" ns0:lineRule="auto"/>
+        <ns0:ind ns0:firstLine="709"/>
+        <ns0:jc ns0:val="both"/>
+      </ns0:pPr>
+      <ns0:r>
+        <ns0:rPr>
+          <ns0:rFonts ns0:ascii="Times New Roman" ns0:hAnsi="Times New Roman"/>
+          <ns0:sz ns0:val="28"/>
+        </ns0:rPr>
+        <ns0:t xml:space="preserve">Формат: анонимная анкета из 8 вопросов с вариантами ответа. В опросе участвовали 30 человек. Подсчёт результатов выполнен по количеству выбранных вариантов.</ns0:t>
+      </ns0:r>
+    </ns0:p>
+    <ns0:p>
+      <ns0:pPr>
+        <ns0:spacing ns0:after="0" ns0:line="360" ns0:lineRule="auto"/>
+        <ns0:ind ns0:firstLine="0"/>
+        <ns0:jc ns0:val="both"/>
+      </ns0:pPr>
+      <ns0:r>
+        <ns0:rPr>
+          <ns0:rFonts ns0:ascii="Times New Roman" ns0:hAnsi="Times New Roman"/>
+          <ns0:sz ns0:val="28"/>
+        </ns0:rPr>
+        <ns0:t xml:space="preserve"/>
+      </ns0:r>
+    </ns0:p>
+    <ns0:p>
+      <ns0:pPr>
+        <ns0:spacing ns0:after="0" ns0:line="360" ns0:lineRule="auto"/>
+        <ns0:ind ns0:firstLine="709"/>
+        <ns0:jc ns0:val="both"/>
+      </ns0:pPr>
+      <ns0:r>
+        <ns0:rPr>
+          <ns0:rFonts ns0:ascii="Times New Roman" ns0:hAnsi="Times New Roman"/>
+          <ns0:sz ns0:val="28"/>
+        </ns0:rPr>
+        <ns0:t xml:space="preserve">Далее результаты представлены в виде диаграмм для наглядного сравнения ответов.</ns0:t>
+      </ns0:r>
+    </ns0:p>
+    <ns0:p>
+      <ns0:pPr>
+        <ns0:spacing ns0:after="0" ns0:line="360" ns0:lineRule="auto"/>
+        <ns0:ind ns0:firstLine="0"/>
+        <ns0:jc ns0:val="both"/>
+      </ns0:pPr>
+      <ns0:r>
+        <ns0:rPr>
+          <ns0:rFonts ns0:ascii="Times New Roman" ns0:hAnsi="Times New Roman"/>
+          <ns0:sz ns0:val="28"/>
+        </ns0:rPr>
+        <ns0:t xml:space="preserve"/>
+      </ns0:r>
+    </ns0:p>
+    <ns0:p>
+      <ns0:pPr>
+        <ns0:spacing ns0:after="0" ns0:line="360" ns0:lineRule="auto"/>
+        <ns0:ind ns0:firstLine="0"/>
+        <ns0:jc ns0:val="both"/>
+      </ns0:pPr>
+      <ns0:r>
+        <ns0:rPr>
+          <ns0:rFonts ns0:ascii="Times New Roman" ns0:hAnsi="Times New Roman"/>
+          <ns0:sz ns0:val="28"/>
+          <ns0:b/>
+        </ns0:rPr>
+        <ns0:t xml:space="preserve">2.2 Диаграммы результатов опроса</ns0:t>
+      </ns0:r>
+    </ns0:p>
+    <ns0:p>
+      <ns0:pPr>
+        <ns0:spacing ns0:after="0" ns0:line="360" ns0:lineRule="auto"/>
+        <ns0:ind ns0:firstLine="0"/>
+        <ns0:jc ns0:val="both"/>
+      </ns0:pPr>
+      <ns0:r>
+        <ns0:rPr>
+          <ns0:rFonts ns0:ascii="Times New Roman" ns0:hAnsi="Times New Roman"/>
+          <ns0:sz ns0:val="28"/>
+        </ns0:rPr>
+        <ns0:t xml:space="preserve"/>
+      </ns0:r>
+    </ns0:p>
+    <ns0:p>
+      <ns0:pPr>
+        <ns0:spacing ns0:after="0" ns0:line="360" ns0:lineRule="auto"/>
+        <ns0:ind ns0:firstLine="709"/>
+        <ns0:jc ns0:val="both"/>
+      </ns0:pPr>
+      <ns0:r>
+        <ns0:rPr>
+          <ns0:rFonts ns0:ascii="Times New Roman" ns0:hAnsi="Times New Roman"/>
+          <ns0:sz ns0:val="28"/>
+        </ns0:rPr>
+        <ns0:t xml:space="preserve">Для каждого вопроса подсчитано количество ответов по каждому варианту. На рисунках 1–8 приведены диаграммы распределения ответов по вопросам 1–8 соответственно.</ns0:t>
+      </ns0:r>
+    </ns0:p>
+    <ns0:p>
+      <ns0:pPr>
+        <ns0:spacing ns0:after="0" ns0:line="360" ns0:lineRule="auto"/>
+        <ns0:ind ns0:firstLine="0"/>
+        <ns0:jc ns0:val="both"/>
+      </ns0:pPr>
+      <ns0:r>
+        <ns0:rPr>
+          <ns0:rFonts ns0:ascii="Times New Roman" ns0:hAnsi="Times New Roman"/>
+          <ns0:sz ns0:val="28"/>
+        </ns0:rPr>
+        <ns0:t xml:space="preserve"/>
+      </ns0:r>
+    </ns0:p>
+    <ns0:p>
+      <ns0:pPr>
+        <ns0:spacing ns0:after="0" ns0:line="360" ns0:lineRule="auto"/>
+        <ns0:ind ns0:firstLine="709"/>
+        <ns0:jc ns0:val="both"/>
+      </ns0:pPr>
+      <ns0:r>
+        <ns0:rPr>
+          <ns0:rFonts ns0:ascii="Times New Roman" ns0:hAnsi="Times New Roman"/>
+          <ns0:sz ns0:val="28"/>
+        </ns0:rPr>
+        <ns0:t xml:space="preserve">Вопрос 1: Да — 18; Примерно — 10; Нет — 2. Вопрос 3: Величина и направление — 27 (большинство верно выделяет признак векторной величины).</ns0:t>
+      </ns0:r>
+    </ns0:p>
+    <ns0:p>
+      <ns0:pPr>
+        <ns0:spacing ns0:after="0" ns0:line="360" ns0:lineRule="auto"/>
+        <ns0:ind ns0:firstLine="0"/>
+        <ns0:jc ns0:val="both"/>
+      </ns0:pPr>
+      <ns0:r>
+        <ns0:rPr>
+          <ns0:rFonts ns0:ascii="Times New Roman" ns0:hAnsi="Times New Roman"/>
+          <ns0:sz ns0:val="28"/>
+        </ns0:rPr>
+        <ns0:t xml:space="preserve"/>
+      </ns0:r>
+    </ns0:p>
+    <ns0:p>
+      <ns0:pPr>
+        <ns0:spacing ns0:after="0" ns0:line="360" ns0:lineRule="auto"/>
+        <ns0:ind ns0:firstLine="709"/>
+        <ns0:jc ns0:val="both"/>
+      </ns0:pPr>
+      <ns0:r>
+        <ns0:rPr>
+          <ns0:rFonts ns0:ascii="Times New Roman" ns0:hAnsi="Times New Roman"/>
+          <ns0:sz ns0:val="28"/>
+        </ns0:rPr>
+        <ns0:t xml:space="preserve">Вопрос 5: Нет — 21 (температура является скалярной величиной). Эти результаты показывают, что базовые различия между скалярами и векторами в целом понятны.</ns0:t>
+      </ns0:r>
+    </ns0:p>
+    <ns0:p>
+      <ns0:pPr>
+        <ns0:spacing ns0:after="0" ns0:line="360" ns0:lineRule="auto"/>
+        <ns0:ind ns0:firstLine="0"/>
+        <ns0:jc ns0:val="both"/>
+      </ns0:pPr>
+      <ns0:r>
+        <ns0:rPr>
+          <ns0:rFonts ns0:ascii="Times New Roman" ns0:hAnsi="Times New Roman"/>
+          <ns0:sz ns0:val="28"/>
+        </ns0:rPr>
+        <ns0:t xml:space="preserve"/>
+      </ns0:r>
+    </ns0:p>
+    <ns0:p>
+      <ns0:pPr>
+        <ns0:spacing ns0:after="0" ns0:line="360" ns0:lineRule="auto"/>
+        <ns0:ind ns0:firstLine="0"/>
+        <ns0:jc ns0:val="both"/>
+      </ns0:pPr>
+      <ns0:r>
+        <ns0:rPr>
+          <ns0:rFonts ns0:ascii="Times New Roman" ns0:hAnsi="Times New Roman"/>
+          <ns0:sz ns0:val="28"/>
+          <ns0:b/>
+        </ns0:rPr>
+        <ns0:t xml:space="preserve">2.3 Выводы по результатам опроса</ns0:t>
+      </ns0:r>
+    </ns0:p>
+    <ns0:p>
+      <ns0:pPr>
+        <ns0:spacing ns0:after="0" ns0:line="360" ns0:lineRule="auto"/>
+        <ns0:ind ns0:firstLine="0"/>
+        <ns0:jc ns0:val="both"/>
+      </ns0:pPr>
+      <ns0:r>
+        <ns0:rPr>
+          <ns0:rFonts ns0:ascii="Times New Roman" ns0:hAnsi="Times New Roman"/>
+          <ns0:sz ns0:val="28"/>
+        </ns0:rPr>
+        <ns0:t xml:space="preserve"/>
+      </ns0:r>
+    </ns0:p>
+    <ns0:p>
+      <ns0:pPr>
+        <ns0:spacing ns0:after="0" ns0:line="360" ns0:lineRule="auto"/>
+        <ns0:ind ns0:firstLine="709"/>
+        <ns0:jc ns0:val="both"/>
+      </ns0:pPr>
+      <ns0:r>
+        <ns0:rPr>
+          <ns0:rFonts ns0:ascii="Times New Roman" ns0:hAnsi="Times New Roman"/>
+          <ns0:sz ns0:val="28"/>
+        </ns0:rPr>
+        <ns0:t xml:space="preserve">Большинство респондентов знакомы с понятием вектора и корректно определяют, что у векторной величины есть величина и направление. Также большинство верно относится к температуре как к скалярной величине.</ns0:t>
+      </ns0:r>
+    </ns0:p>
+    <ns0:p>
+      <ns0:pPr>
+        <ns0:spacing ns0:after="0" ns0:line="360" ns0:lineRule="auto"/>
+        <ns0:ind ns0:firstLine="0"/>
+        <ns0:jc ns0:val="both"/>
+      </ns0:pPr>
+      <ns0:r>
+        <ns0:rPr>
+          <ns0:rFonts ns0:ascii="Times New Roman" ns0:hAnsi="Times New Roman"/>
+          <ns0:sz ns0:val="28"/>
+        </ns0:rPr>
+        <ns0:t xml:space="preserve"/>
+      </ns0:r>
+    </ns0:p>
+    <ns0:p>
+      <ns0:pPr>
+        <ns0:spacing ns0:after="0" ns0:line="360" ns0:lineRule="auto"/>
+        <ns0:ind ns0:firstLine="709"/>
+        <ns0:jc ns0:val="both"/>
+      </ns0:pPr>
+      <ns0:r>
+        <ns0:rPr>
+          <ns0:rFonts ns0:ascii="Times New Roman" ns0:hAnsi="Times New Roman"/>
+          <ns0:sz ns0:val="28"/>
+        </ns0:rPr>
+        <ns0:t xml:space="preserve">Наиболее часто слово «вектор» респонденты встречают в математике и физике. Это подтверждает связь темы с учебными дисциплинами.</ns0:t>
+      </ns0:r>
+    </ns0:p>
+    <ns0:p>
+      <ns0:pPr>
+        <ns0:spacing ns0:after="0" ns0:line="360" ns0:lineRule="auto"/>
+        <ns0:ind ns0:firstLine="0"/>
+        <ns0:jc ns0:val="both"/>
+      </ns0:pPr>
+      <ns0:r>
+        <ns0:rPr>
+          <ns0:rFonts ns0:ascii="Times New Roman" ns0:hAnsi="Times New Roman"/>
+          <ns0:sz ns0:val="28"/>
+        </ns0:rPr>
+        <ns0:t xml:space="preserve"/>
+      </ns0:r>
+    </ns0:p>
+    <ns0:p>
+      <ns0:pPr>
+        <ns0:spacing ns0:after="0" ns0:line="360" ns0:lineRule="auto"/>
+        <ns0:ind ns0:firstLine="709"/>
+        <ns0:jc ns0:val="both"/>
+      </ns0:pPr>
+      <ns0:r>
+        <ns0:rPr>
+          <ns0:rFonts ns0:ascii="Times New Roman" ns0:hAnsi="Times New Roman"/>
+          <ns0:sz ns0:val="28"/>
+        </ns0:rPr>
+        <ns0:t xml:space="preserve">Большая часть респондентов хотели бы видеть больше примеров из жизни при изучении математики, поэтому практико-ориентированное объяснение темы повышает интерес и понимание.</ns0:t>
       </ns0:r>
     </ns0:p>
     <ns0:p>
@@ -2519,14 +3067,9 @@
     </ns0:p>
     <ns0:p>
       <ns0:pPr>
-        <ns0:spacing ns0:after="0" ns0:line="360" ns0:lineRule="auto"/>
         <ns0:jc ns0:val="center"/>
       </ns0:pPr>
       <ns0:r>
-        <ns0:rPr>
-          <ns0:rFonts ns0:ascii="Times New Roman" ns0:hAnsi="Times New Roman"/>
-          <ns0:sz ns0:val="28"/>
-        </ns0:rPr>
         <ns0:t xml:space="preserve">Рисунок 1 – Результаты опроса: вопрос 1</ns0:t>
       </ns0:r>
     </ns0:p>
@@ -2584,27 +3127,9 @@
     </ns0:p>
     <ns0:p>
       <ns0:pPr>
-        <ns0:spacing ns0:after="0" ns0:line="360" ns0:lineRule="auto"/>
-        <ns0:jc ns0:val="left"/>
-      </ns0:pPr>
-      <ns0:r>
-        <ns0:rPr>
-          <ns0:rFonts ns0:ascii="Times New Roman" ns0:hAnsi="Times New Roman"/>
-          <ns0:sz ns0:val="28"/>
-        </ns0:rPr>
-        <ns0:t xml:space="preserve"/>
-      </ns0:r>
-    </ns0:p>
-    <ns0:p>
-      <ns0:pPr>
-        <ns0:spacing ns0:after="0" ns0:line="360" ns0:lineRule="auto"/>
         <ns0:jc ns0:val="center"/>
       </ns0:pPr>
       <ns0:r>
-        <ns0:rPr>
-          <ns0:rFonts ns0:ascii="Times New Roman" ns0:hAnsi="Times New Roman"/>
-          <ns0:sz ns0:val="28"/>
-        </ns0:rPr>
         <ns0:t xml:space="preserve">Рисунок 2 – Результаты опроса: вопрос 2</ns0:t>
       </ns0:r>
     </ns0:p>
@@ -2662,27 +3187,9 @@
     </ns0:p>
     <ns0:p>
       <ns0:pPr>
-        <ns0:spacing ns0:after="0" ns0:line="360" ns0:lineRule="auto"/>
-        <ns0:jc ns0:val="left"/>
-      </ns0:pPr>
-      <ns0:r>
-        <ns0:rPr>
-          <ns0:rFonts ns0:ascii="Times New Roman" ns0:hAnsi="Times New Roman"/>
-          <ns0:sz ns0:val="28"/>
-        </ns0:rPr>
-        <ns0:t xml:space="preserve"/>
-      </ns0:r>
-    </ns0:p>
-    <ns0:p>
-      <ns0:pPr>
-        <ns0:spacing ns0:after="0" ns0:line="360" ns0:lineRule="auto"/>
         <ns0:jc ns0:val="center"/>
       </ns0:pPr>
       <ns0:r>
-        <ns0:rPr>
-          <ns0:rFonts ns0:ascii="Times New Roman" ns0:hAnsi="Times New Roman"/>
-          <ns0:sz ns0:val="28"/>
-        </ns0:rPr>
         <ns0:t xml:space="preserve">Рисунок 3 – Результаты опроса: вопрос 3</ns0:t>
       </ns0:r>
     </ns0:p>
@@ -2740,27 +3247,9 @@
     </ns0:p>
     <ns0:p>
       <ns0:pPr>
-        <ns0:spacing ns0:after="0" ns0:line="360" ns0:lineRule="auto"/>
-        <ns0:jc ns0:val="left"/>
-      </ns0:pPr>
-      <ns0:r>
-        <ns0:rPr>
-          <ns0:rFonts ns0:ascii="Times New Roman" ns0:hAnsi="Times New Roman"/>
-          <ns0:sz ns0:val="28"/>
-        </ns0:rPr>
-        <ns0:t xml:space="preserve"/>
-      </ns0:r>
-    </ns0:p>
-    <ns0:p>
-      <ns0:pPr>
-        <ns0:spacing ns0:after="0" ns0:line="360" ns0:lineRule="auto"/>
         <ns0:jc ns0:val="center"/>
       </ns0:pPr>
       <ns0:r>
-        <ns0:rPr>
-          <ns0:rFonts ns0:ascii="Times New Roman" ns0:hAnsi="Times New Roman"/>
-          <ns0:sz ns0:val="28"/>
-        </ns0:rPr>
         <ns0:t xml:space="preserve">Рисунок 4 – Результаты опроса: вопрос 4</ns0:t>
       </ns0:r>
     </ns0:p>
@@ -2818,27 +3307,9 @@
     </ns0:p>
     <ns0:p>
       <ns0:pPr>
-        <ns0:spacing ns0:after="0" ns0:line="360" ns0:lineRule="auto"/>
-        <ns0:jc ns0:val="left"/>
-      </ns0:pPr>
-      <ns0:r>
-        <ns0:rPr>
-          <ns0:rFonts ns0:ascii="Times New Roman" ns0:hAnsi="Times New Roman"/>
-          <ns0:sz ns0:val="28"/>
-        </ns0:rPr>
-        <ns0:t xml:space="preserve"/>
-      </ns0:r>
-    </ns0:p>
-    <ns0:p>
-      <ns0:pPr>
-        <ns0:spacing ns0:after="0" ns0:line="360" ns0:lineRule="auto"/>
         <ns0:jc ns0:val="center"/>
       </ns0:pPr>
       <ns0:r>
-        <ns0:rPr>
-          <ns0:rFonts ns0:ascii="Times New Roman" ns0:hAnsi="Times New Roman"/>
-          <ns0:sz ns0:val="28"/>
-        </ns0:rPr>
         <ns0:t xml:space="preserve">Рисунок 5 – Результаты опроса: вопрос 5</ns0:t>
       </ns0:r>
     </ns0:p>
@@ -2896,27 +3367,9 @@
     </ns0:p>
     <ns0:p>
       <ns0:pPr>
-        <ns0:spacing ns0:after="0" ns0:line="360" ns0:lineRule="auto"/>
-        <ns0:jc ns0:val="left"/>
-      </ns0:pPr>
-      <ns0:r>
-        <ns0:rPr>
-          <ns0:rFonts ns0:ascii="Times New Roman" ns0:hAnsi="Times New Roman"/>
-          <ns0:sz ns0:val="28"/>
-        </ns0:rPr>
-        <ns0:t xml:space="preserve"/>
-      </ns0:r>
-    </ns0:p>
-    <ns0:p>
-      <ns0:pPr>
-        <ns0:spacing ns0:after="0" ns0:line="360" ns0:lineRule="auto"/>
         <ns0:jc ns0:val="center"/>
       </ns0:pPr>
       <ns0:r>
-        <ns0:rPr>
-          <ns0:rFonts ns0:ascii="Times New Roman" ns0:hAnsi="Times New Roman"/>
-          <ns0:sz ns0:val="28"/>
-        </ns0:rPr>
         <ns0:t xml:space="preserve">Рисунок 6 – Результаты опроса: вопрос 6</ns0:t>
       </ns0:r>
     </ns0:p>
@@ -2974,27 +3427,9 @@
     </ns0:p>
     <ns0:p>
       <ns0:pPr>
-        <ns0:spacing ns0:after="0" ns0:line="360" ns0:lineRule="auto"/>
-        <ns0:jc ns0:val="left"/>
-      </ns0:pPr>
-      <ns0:r>
-        <ns0:rPr>
-          <ns0:rFonts ns0:ascii="Times New Roman" ns0:hAnsi="Times New Roman"/>
-          <ns0:sz ns0:val="28"/>
-        </ns0:rPr>
-        <ns0:t xml:space="preserve"/>
-      </ns0:r>
-    </ns0:p>
-    <ns0:p>
-      <ns0:pPr>
-        <ns0:spacing ns0:after="0" ns0:line="360" ns0:lineRule="auto"/>
         <ns0:jc ns0:val="center"/>
       </ns0:pPr>
       <ns0:r>
-        <ns0:rPr>
-          <ns0:rFonts ns0:ascii="Times New Roman" ns0:hAnsi="Times New Roman"/>
-          <ns0:sz ns0:val="28"/>
-        </ns0:rPr>
         <ns0:t xml:space="preserve">Рисунок 7 – Результаты опроса: вопрос 7</ns0:t>
       </ns0:r>
     </ns0:p>
@@ -3052,27 +3487,9 @@
     </ns0:p>
     <ns0:p>
       <ns0:pPr>
-        <ns0:spacing ns0:after="0" ns0:line="360" ns0:lineRule="auto"/>
-        <ns0:jc ns0:val="left"/>
-      </ns0:pPr>
-      <ns0:r>
-        <ns0:rPr>
-          <ns0:rFonts ns0:ascii="Times New Roman" ns0:hAnsi="Times New Roman"/>
-          <ns0:sz ns0:val="28"/>
-        </ns0:rPr>
-        <ns0:t xml:space="preserve"/>
-      </ns0:r>
-    </ns0:p>
-    <ns0:p>
-      <ns0:pPr>
-        <ns0:spacing ns0:after="0" ns0:line="360" ns0:lineRule="auto"/>
         <ns0:jc ns0:val="center"/>
       </ns0:pPr>
       <ns0:r>
-        <ns0:rPr>
-          <ns0:rFonts ns0:ascii="Times New Roman" ns0:hAnsi="Times New Roman"/>
-          <ns0:sz ns0:val="28"/>
-        </ns0:rPr>
         <ns0:t xml:space="preserve">Рисунок 8 – Результаты опроса: вопрос 8</ns0:t>
       </ns0:r>
     </ns0:p>
@@ -3131,19 +3548,6 @@
     <ns0:p>
       <ns0:pPr>
         <ns0:spacing ns0:after="0" ns0:line="360" ns0:lineRule="auto"/>
-        <ns0:jc ns0:val="left"/>
-      </ns0:pPr>
-      <ns0:r>
-        <ns0:rPr>
-          <ns0:rFonts ns0:ascii="Times New Roman" ns0:hAnsi="Times New Roman"/>
-          <ns0:sz ns0:val="28"/>
-        </ns0:rPr>
-        <ns0:t xml:space="preserve"/>
-      </ns0:r>
-    </ns0:p>
-    <ns0:p>
-      <ns0:pPr>
-        <ns0:spacing ns0:after="0" ns0:line="360" ns0:lineRule="auto"/>
         <ns0:ind ns0:firstLine="0"/>
         <ns0:jc ns0:val="center"/>
       </ns0:pPr>
@@ -3181,7 +3585,35 @@
           <ns0:rFonts ns0:ascii="Times New Roman" ns0:hAnsi="Times New Roman"/>
           <ns0:sz ns0:val="28"/>
         </ns0:rPr>
-        <ns0:t xml:space="preserve">Векторы — удобная математическая модель для описания направленных величин. Теоретическая часть дала основные определения и операции, а практическая часть показала, что базовые представления о теме у большинства есть, но запрос на прикладные примеры высокий.</ns0:t>
+        <ns0:t xml:space="preserve">В ходе проекта рассмотрены основные понятия темы «Векторы»: определение, координатная запись, модуль и базовые операции. Показано, что векторы используются для описания направленных величин в физике, навигации и повседневных ситуациях.</ns0:t>
+      </ns0:r>
+    </ns0:p>
+    <ns0:p>
+      <ns0:pPr>
+        <ns0:spacing ns0:after="0" ns0:line="360" ns0:lineRule="auto"/>
+        <ns0:ind ns0:firstLine="0"/>
+        <ns0:jc ns0:val="both"/>
+      </ns0:pPr>
+      <ns0:r>
+        <ns0:rPr>
+          <ns0:rFonts ns0:ascii="Times New Roman" ns0:hAnsi="Times New Roman"/>
+          <ns0:sz ns0:val="28"/>
+        </ns0:rPr>
+        <ns0:t xml:space="preserve"/>
+      </ns0:r>
+    </ns0:p>
+    <ns0:p>
+      <ns0:pPr>
+        <ns0:spacing ns0:after="0" ns0:line="360" ns0:lineRule="auto"/>
+        <ns0:ind ns0:firstLine="709"/>
+        <ns0:jc ns0:val="both"/>
+      </ns0:pPr>
+      <ns0:r>
+        <ns0:rPr>
+          <ns0:rFonts ns0:ascii="Times New Roman" ns0:hAnsi="Times New Roman"/>
+          <ns0:sz ns0:val="28"/>
+        </ns0:rPr>
+        <ns0:t xml:space="preserve">Практическая часть в виде опроса подтвердила, что у большинства респондентов есть базовое понимание векторов, но остаётся потребность в большем количестве жизненных примеров. Таким образом, цель проекта достигнута.</ns0:t>
       </ns0:r>
     </ns0:p>
     <ns0:p>
@@ -3252,6 +3684,20 @@
         <ns0:rPr>
           <ns0:rFonts ns0:ascii="Times New Roman" ns0:hAnsi="Times New Roman"/>
           <ns0:sz ns0:val="28"/>
+        </ns0:rPr>
+        <ns0:t xml:space="preserve"/>
+      </ns0:r>
+    </ns0:p>
+    <ns0:p>
+      <ns0:pPr>
+        <ns0:spacing ns0:after="0" ns0:line="360" ns0:lineRule="auto"/>
+        <ns0:ind ns0:firstLine="0"/>
+        <ns0:jc ns0:val="both"/>
+      </ns0:pPr>
+      <ns0:r>
+        <ns0:rPr>
+          <ns0:rFonts ns0:ascii="Times New Roman" ns0:hAnsi="Times New Roman"/>
+          <ns0:sz ns0:val="28"/>
           <ns0:b/>
         </ns0:rPr>
         <ns0:t xml:space="preserve">2. Погорелов, А. В. Геометрия : учебник для 10–11 классов / А. В. Погорелов. – Москва : Просвещение, 2020. – 272 с.</ns0:t>
@@ -3267,16 +3713,380 @@
         <ns0:rPr>
           <ns0:rFonts ns0:ascii="Times New Roman" ns0:hAnsi="Times New Roman"/>
           <ns0:sz ns0:val="28"/>
+        </ns0:rPr>
+        <ns0:t xml:space="preserve"/>
+      </ns0:r>
+    </ns0:p>
+    <ns0:p>
+      <ns0:pPr>
+        <ns0:spacing ns0:after="0" ns0:line="360" ns0:lineRule="auto"/>
+        <ns0:ind ns0:firstLine="709"/>
+        <ns0:jc ns0:val="both"/>
+      </ns0:pPr>
+      <ns0:r>
+        <ns0:rPr>
+          <ns0:rFonts ns0:ascii="Times New Roman" ns0:hAnsi="Times New Roman"/>
+          <ns0:sz ns0:val="28"/>
+        </ns0:rPr>
+        <ns0:t xml:space="preserve">3. Ильин, В. А. Аналитическая геометрия и линейная алгебра : учебник / В. А. Ильин, Э. Г. Позняк. – Москва : Физматлит, 2020. – 368 с.</ns0:t>
+      </ns0:r>
+    </ns0:p>
+    <ns0:p>
+      <ns0:pPr>
+        <ns0:spacing ns0:after="0" ns0:line="360" ns0:lineRule="auto"/>
+        <ns0:ind ns0:firstLine="0"/>
+        <ns0:jc ns0:val="both"/>
+      </ns0:pPr>
+      <ns0:r>
+        <ns0:rPr>
+          <ns0:rFonts ns0:ascii="Times New Roman" ns0:hAnsi="Times New Roman"/>
+          <ns0:sz ns0:val="28"/>
+        </ns0:rPr>
+        <ns0:t xml:space="preserve"/>
+      </ns0:r>
+    </ns0:p>
+    <ns0:p>
+      <ns0:pPr>
+        <ns0:spacing ns0:after="0" ns0:line="360" ns0:lineRule="auto"/>
+        <ns0:ind ns0:firstLine="709"/>
+        <ns0:jc ns0:val="both"/>
+      </ns0:pPr>
+      <ns0:r>
+        <ns0:rPr>
+          <ns0:rFonts ns0:ascii="Times New Roman" ns0:hAnsi="Times New Roman"/>
+          <ns0:sz ns0:val="28"/>
+        </ns0:rPr>
+        <ns0:t xml:space="preserve">4. Колмогоров, А. Н. Алгебра и начала математического анализа. 10–11 классы : учебник / А. Н. Колмогоров. – Москва : Просвещение, 2021. – 304 с.</ns0:t>
+      </ns0:r>
+    </ns0:p>
+    <ns0:p>
+      <ns0:pPr>
+        <ns0:spacing ns0:after="0" ns0:line="360" ns0:lineRule="auto"/>
+        <ns0:ind ns0:firstLine="0"/>
+        <ns0:jc ns0:val="both"/>
+      </ns0:pPr>
+      <ns0:r>
+        <ns0:rPr>
+          <ns0:rFonts ns0:ascii="Times New Roman" ns0:hAnsi="Times New Roman"/>
+          <ns0:sz ns0:val="28"/>
+        </ns0:rPr>
+        <ns0:t xml:space="preserve"/>
+      </ns0:r>
+    </ns0:p>
+    <ns0:p>
+      <ns0:pPr>
+        <ns0:spacing ns0:after="0" ns0:line="360" ns0:lineRule="auto"/>
+        <ns0:ind ns0:firstLine="709"/>
+        <ns0:jc ns0:val="both"/>
+      </ns0:pPr>
+      <ns0:r>
+        <ns0:rPr>
+          <ns0:rFonts ns0:ascii="Times New Roman" ns0:hAnsi="Times New Roman"/>
+          <ns0:sz ns0:val="28"/>
+        </ns0:rPr>
+        <ns0:t xml:space="preserve">5. Мордкович, А. Г. Алгебра и начала анализа. 10 класс : учебник / А. Г. Мордкович. – Москва : Мнемозина, 2020. – 287 с.</ns0:t>
+      </ns0:r>
+    </ns0:p>
+    <ns0:p>
+      <ns0:pPr>
+        <ns0:spacing ns0:after="0" ns0:line="360" ns0:lineRule="auto"/>
+        <ns0:ind ns0:firstLine="0"/>
+        <ns0:jc ns0:val="both"/>
+      </ns0:pPr>
+      <ns0:r>
+        <ns0:rPr>
+          <ns0:rFonts ns0:ascii="Times New Roman" ns0:hAnsi="Times New Roman"/>
+          <ns0:sz ns0:val="28"/>
+        </ns0:rPr>
+        <ns0:t xml:space="preserve"/>
+      </ns0:r>
+    </ns0:p>
+    <ns0:p>
+      <ns0:pPr>
+        <ns0:spacing ns0:after="0" ns0:line="360" ns0:lineRule="auto"/>
+        <ns0:ind ns0:firstLine="709"/>
+        <ns0:jc ns0:val="both"/>
+      </ns0:pPr>
+      <ns0:r>
+        <ns0:rPr>
+          <ns0:rFonts ns0:ascii="Times New Roman" ns0:hAnsi="Times New Roman"/>
+          <ns0:sz ns0:val="28"/>
+        </ns0:rPr>
+        <ns0:t xml:space="preserve">6. Демидович, Б. П. Сборник задач и упражнений по математическому анализу : учебное пособие / Б. П. Демидович. – Москва : АСТ, 2021. – 736 с.</ns0:t>
+      </ns0:r>
+    </ns0:p>
+    <ns0:p>
+      <ns0:pPr>
+        <ns0:spacing ns0:after="0" ns0:line="360" ns0:lineRule="auto"/>
+        <ns0:ind ns0:firstLine="0"/>
+        <ns0:jc ns0:val="both"/>
+      </ns0:pPr>
+      <ns0:r>
+        <ns0:rPr>
+          <ns0:rFonts ns0:ascii="Times New Roman" ns0:hAnsi="Times New Roman"/>
+          <ns0:sz ns0:val="28"/>
+        </ns0:rPr>
+        <ns0:t xml:space="preserve"/>
+      </ns0:r>
+    </ns0:p>
+    <ns0:p>
+      <ns0:pPr>
+        <ns0:spacing ns0:after="0" ns0:line="360" ns0:lineRule="auto"/>
+        <ns0:ind ns0:firstLine="0"/>
+        <ns0:jc ns0:val="center"/>
+      </ns0:pPr>
+      <ns0:r>
+        <ns0:rPr>
+          <ns0:rFonts ns0:ascii="Times New Roman" ns0:hAnsi="Times New Roman"/>
+          <ns0:sz ns0:val="28"/>
           <ns0:b/>
         </ns0:rPr>
-        <ns0:t xml:space="preserve">3. Ильин, В. А. Аналитическая геометрия и линейная алгебра : учебник / В. А. Ильин, Э. Г. Позняк. – Москва : Физматлит, 2020. – 368 с.</ns0:t>
-      </ns0:r>
-    </ns0:p>
-    <ns0:p>
-      <ns0:pPr>
-        <ns0:spacing ns0:after="0" ns0:line="360" ns0:lineRule="auto"/>
-        <ns0:ind ns0:firstLine="0"/>
-        <ns0:jc ns0:val="both"/>
+        <ns0:t xml:space="preserve">ПРИЛОЖЕНИЕ А. Анкета</ns0:t>
+      </ns0:r>
+    </ns0:p>
+    <ns0:p>
+      <ns0:pPr>
+        <ns0:spacing ns0:after="0" ns0:line="360" ns0:lineRule="auto"/>
+        <ns0:ind ns0:firstLine="0"/>
+        <ns0:jc ns0:val="both"/>
+      </ns0:pPr>
+      <ns0:r>
+        <ns0:rPr>
+          <ns0:rFonts ns0:ascii="Times New Roman" ns0:hAnsi="Times New Roman"/>
+          <ns0:sz ns0:val="28"/>
+        </ns0:rPr>
+        <ns0:t xml:space="preserve"/>
+      </ns0:r>
+    </ns0:p>
+    <ns0:p>
+      <ns0:pPr>
+        <ns0:spacing ns0:after="0" ns0:line="360" ns0:lineRule="auto"/>
+        <ns0:ind ns0:firstLine="709"/>
+        <ns0:jc ns0:val="both"/>
+      </ns0:pPr>
+      <ns0:r>
+        <ns0:rPr>
+          <ns0:rFonts ns0:ascii="Times New Roman" ns0:hAnsi="Times New Roman"/>
+          <ns0:sz ns0:val="28"/>
+        </ns0:rPr>
+        <ns0:t xml:space="preserve">(1) Знаете ли вы, что такое вектор?</ns0:t>
+      </ns0:r>
+    </ns0:p>
+    <ns0:p>
+      <ns0:pPr>
+        <ns0:spacing ns0:after="0" ns0:line="360" ns0:lineRule="auto"/>
+        <ns0:ind ns0:firstLine="0"/>
+        <ns0:jc ns0:val="both"/>
+      </ns0:pPr>
+      <ns0:r>
+        <ns0:rPr>
+          <ns0:rFonts ns0:ascii="Times New Roman" ns0:hAnsi="Times New Roman"/>
+          <ns0:sz ns0:val="28"/>
+        </ns0:rPr>
+        <ns0:t xml:space="preserve"/>
+      </ns0:r>
+    </ns0:p>
+    <ns0:p>
+      <ns0:pPr>
+        <ns0:spacing ns0:after="0" ns0:line="360" ns0:lineRule="auto"/>
+        <ns0:ind ns0:firstLine="709"/>
+        <ns0:jc ns0:val="both"/>
+      </ns0:pPr>
+      <ns0:r>
+        <ns0:rPr>
+          <ns0:rFonts ns0:ascii="Times New Roman" ns0:hAnsi="Times New Roman"/>
+          <ns0:sz ns0:val="28"/>
+        </ns0:rPr>
+        <ns0:t xml:space="preserve">(2) Где вы чаще всего встречаете слово «вектор»?</ns0:t>
+      </ns0:r>
+    </ns0:p>
+    <ns0:p>
+      <ns0:pPr>
+        <ns0:spacing ns0:after="0" ns0:line="360" ns0:lineRule="auto"/>
+        <ns0:ind ns0:firstLine="0"/>
+        <ns0:jc ns0:val="both"/>
+      </ns0:pPr>
+      <ns0:r>
+        <ns0:rPr>
+          <ns0:rFonts ns0:ascii="Times New Roman" ns0:hAnsi="Times New Roman"/>
+          <ns0:sz ns0:val="28"/>
+        </ns0:rPr>
+        <ns0:t xml:space="preserve"/>
+      </ns0:r>
+    </ns0:p>
+    <ns0:p>
+      <ns0:pPr>
+        <ns0:spacing ns0:after="0" ns0:line="360" ns0:lineRule="auto"/>
+        <ns0:ind ns0:firstLine="709"/>
+        <ns0:jc ns0:val="both"/>
+      </ns0:pPr>
+      <ns0:r>
+        <ns0:rPr>
+          <ns0:rFonts ns0:ascii="Times New Roman" ns0:hAnsi="Times New Roman"/>
+          <ns0:sz ns0:val="28"/>
+        </ns0:rPr>
+        <ns0:t xml:space="preserve">(3) Что обязательно должно быть у векторной величины?</ns0:t>
+      </ns0:r>
+    </ns0:p>
+    <ns0:p>
+      <ns0:pPr>
+        <ns0:spacing ns0:after="0" ns0:line="360" ns0:lineRule="auto"/>
+        <ns0:ind ns0:firstLine="0"/>
+        <ns0:jc ns0:val="both"/>
+      </ns0:pPr>
+      <ns0:r>
+        <ns0:rPr>
+          <ns0:rFonts ns0:ascii="Times New Roman" ns0:hAnsi="Times New Roman"/>
+          <ns0:sz ns0:val="28"/>
+        </ns0:rPr>
+        <ns0:t xml:space="preserve"/>
+      </ns0:r>
+    </ns0:p>
+    <ns0:p>
+      <ns0:pPr>
+        <ns0:spacing ns0:after="0" ns0:line="360" ns0:lineRule="auto"/>
+        <ns0:ind ns0:firstLine="709"/>
+        <ns0:jc ns0:val="both"/>
+      </ns0:pPr>
+      <ns0:r>
+        <ns0:rPr>
+          <ns0:rFonts ns0:ascii="Times New Roman" ns0:hAnsi="Times New Roman"/>
+          <ns0:sz ns0:val="28"/>
+        </ns0:rPr>
+        <ns0:t xml:space="preserve">(4) Можно ли считать скорость векторной величиной?</ns0:t>
+      </ns0:r>
+    </ns0:p>
+    <ns0:p>
+      <ns0:pPr>
+        <ns0:spacing ns0:after="0" ns0:line="360" ns0:lineRule="auto"/>
+        <ns0:ind ns0:firstLine="0"/>
+        <ns0:jc ns0:val="both"/>
+      </ns0:pPr>
+      <ns0:r>
+        <ns0:rPr>
+          <ns0:rFonts ns0:ascii="Times New Roman" ns0:hAnsi="Times New Roman"/>
+          <ns0:sz ns0:val="28"/>
+        </ns0:rPr>
+        <ns0:t xml:space="preserve"/>
+      </ns0:r>
+    </ns0:p>
+    <ns0:p>
+      <ns0:pPr>
+        <ns0:spacing ns0:after="0" ns0:line="360" ns0:lineRule="auto"/>
+        <ns0:ind ns0:firstLine="709"/>
+        <ns0:jc ns0:val="both"/>
+      </ns0:pPr>
+      <ns0:r>
+        <ns0:rPr>
+          <ns0:rFonts ns0:ascii="Times New Roman" ns0:hAnsi="Times New Roman"/>
+          <ns0:sz ns0:val="28"/>
+        </ns0:rPr>
+        <ns0:t xml:space="preserve">(5) Можно ли считать температуру векторной величиной?</ns0:t>
+      </ns0:r>
+    </ns0:p>
+    <ns0:p>
+      <ns0:pPr>
+        <ns0:spacing ns0:after="0" ns0:line="360" ns0:lineRule="auto"/>
+        <ns0:ind ns0:firstLine="0"/>
+        <ns0:jc ns0:val="both"/>
+      </ns0:pPr>
+      <ns0:r>
+        <ns0:rPr>
+          <ns0:rFonts ns0:ascii="Times New Roman" ns0:hAnsi="Times New Roman"/>
+          <ns0:sz ns0:val="28"/>
+        </ns0:rPr>
+        <ns0:t xml:space="preserve"/>
+      </ns0:r>
+    </ns0:p>
+    <ns0:p>
+      <ns0:pPr>
+        <ns0:spacing ns0:after="0" ns0:line="360" ns0:lineRule="auto"/>
+        <ns0:ind ns0:firstLine="709"/>
+        <ns0:jc ns0:val="both"/>
+      </ns0:pPr>
+      <ns0:r>
+        <ns0:rPr>
+          <ns0:rFonts ns0:ascii="Times New Roman" ns0:hAnsi="Times New Roman"/>
+          <ns0:sz ns0:val="28"/>
+        </ns0:rPr>
+        <ns0:t xml:space="preserve">(6) Что такое «результирующее перемещение» при нескольких перемещениях подряд?</ns0:t>
+      </ns0:r>
+    </ns0:p>
+    <ns0:p>
+      <ns0:pPr>
+        <ns0:spacing ns0:after="0" ns0:line="360" ns0:lineRule="auto"/>
+        <ns0:ind ns0:firstLine="0"/>
+        <ns0:jc ns0:val="both"/>
+      </ns0:pPr>
+      <ns0:r>
+        <ns0:rPr>
+          <ns0:rFonts ns0:ascii="Times New Roman" ns0:hAnsi="Times New Roman"/>
+          <ns0:sz ns0:val="28"/>
+        </ns0:rPr>
+        <ns0:t xml:space="preserve"/>
+      </ns0:r>
+    </ns0:p>
+    <ns0:p>
+      <ns0:pPr>
+        <ns0:spacing ns0:after="0" ns0:line="360" ns0:lineRule="auto"/>
+        <ns0:ind ns0:firstLine="709"/>
+        <ns0:jc ns0:val="both"/>
+      </ns0:pPr>
+      <ns0:r>
+        <ns0:rPr>
+          <ns0:rFonts ns0:ascii="Times New Roman" ns0:hAnsi="Times New Roman"/>
+          <ns0:sz ns0:val="28"/>
+        </ns0:rPr>
+        <ns0:t xml:space="preserve">(7) Где векторы полезны в жизни?</ns0:t>
+      </ns0:r>
+    </ns0:p>
+    <ns0:p>
+      <ns0:pPr>
+        <ns0:spacing ns0:after="0" ns0:line="360" ns0:lineRule="auto"/>
+        <ns0:ind ns0:firstLine="0"/>
+        <ns0:jc ns0:val="both"/>
+      </ns0:pPr>
+      <ns0:r>
+        <ns0:rPr>
+          <ns0:rFonts ns0:ascii="Times New Roman" ns0:hAnsi="Times New Roman"/>
+          <ns0:sz ns0:val="28"/>
+        </ns0:rPr>
+        <ns0:t xml:space="preserve"/>
+      </ns0:r>
+    </ns0:p>
+    <ns0:p>
+      <ns0:pPr>
+        <ns0:spacing ns0:after="0" ns0:line="360" ns0:lineRule="auto"/>
+        <ns0:ind ns0:firstLine="709"/>
+        <ns0:jc ns0:val="both"/>
+      </ns0:pPr>
+      <ns0:r>
+        <ns0:rPr>
+          <ns0:rFonts ns0:ascii="Times New Roman" ns0:hAnsi="Times New Roman"/>
+          <ns0:sz ns0:val="28"/>
+        </ns0:rPr>
+        <ns0:t xml:space="preserve">(8) Хотели бы вы видеть больше примеров из жизни на уроках математики?</ns0:t>
+      </ns0:r>
+    </ns0:p>
+    <ns0:p>
+      <ns0:pPr>
+        <ns0:spacing ns0:after="0" ns0:line="360" ns0:lineRule="auto"/>
+        <ns0:ind ns0:firstLine="0"/>
+        <ns0:jc ns0:val="both"/>
+      </ns0:pPr>
+      <ns0:r>
+        <ns0:rPr>
+          <ns0:rFonts ns0:ascii="Times New Roman" ns0:hAnsi="Times New Roman"/>
+          <ns0:sz ns0:val="28"/>
+        </ns0:rPr>
+        <ns0:t xml:space="preserve"/>
+      </ns0:r>
+    </ns0:p>
+    <ns0:p>
+      <ns0:pPr>
+        <ns0:spacing ns0:after="0" ns0:line="360" ns0:lineRule="auto"/>
+        <ns0:ind ns0:firstLine="0"/>
+        <ns0:jc ns0:val="center"/>
       </ns0:pPr>
       <ns0:r>
         <ns0:rPr>
@@ -3284,221 +4094,7 @@
           <ns0:sz ns0:val="28"/>
           <ns0:b/>
         </ns0:rPr>
-        <ns0:t xml:space="preserve">4. Колмогоров, А. Н. Алгебра и начала математического анализа. 10–11 классы : учебник / А. Н. Колмогоров. – Москва : Просвещение, 2021. – 304 с.</ns0:t>
-      </ns0:r>
-    </ns0:p>
-    <ns0:p>
-      <ns0:pPr>
-        <ns0:spacing ns0:after="0" ns0:line="360" ns0:lineRule="auto"/>
-        <ns0:ind ns0:firstLine="0"/>
-        <ns0:jc ns0:val="both"/>
-      </ns0:pPr>
-      <ns0:r>
-        <ns0:rPr>
-          <ns0:rFonts ns0:ascii="Times New Roman" ns0:hAnsi="Times New Roman"/>
-          <ns0:sz ns0:val="28"/>
-          <ns0:b/>
-        </ns0:rPr>
-        <ns0:t xml:space="preserve">5. Мордкович, А. Г. Алгебра и начала анализа. 10 класс : учебник / А. Г. Мордкович. – Москва : Мнемозина, 2020. – 287 с.</ns0:t>
-      </ns0:r>
-    </ns0:p>
-    <ns0:p>
-      <ns0:pPr>
-        <ns0:spacing ns0:after="0" ns0:line="360" ns0:lineRule="auto"/>
-        <ns0:ind ns0:firstLine="0"/>
-        <ns0:jc ns0:val="both"/>
-      </ns0:pPr>
-      <ns0:r>
-        <ns0:rPr>
-          <ns0:rFonts ns0:ascii="Times New Roman" ns0:hAnsi="Times New Roman"/>
-          <ns0:sz ns0:val="28"/>
-          <ns0:b/>
-        </ns0:rPr>
-        <ns0:t xml:space="preserve">6. Демидович, Б. П. Сборник задач и упражнений по математическому анализу : учебное пособие / Б. П. Демидович. – Москва : АСТ, 2021. – 736 с.</ns0:t>
-      </ns0:r>
-    </ns0:p>
-    <ns0:p>
-      <ns0:pPr>
-        <ns0:spacing ns0:after="0" ns0:line="360" ns0:lineRule="auto"/>
-        <ns0:ind ns0:firstLine="0"/>
-        <ns0:jc ns0:val="both"/>
-      </ns0:pPr>
-      <ns0:r>
-        <ns0:rPr>
-          <ns0:rFonts ns0:ascii="Times New Roman" ns0:hAnsi="Times New Roman"/>
-          <ns0:sz ns0:val="28"/>
-        </ns0:rPr>
-        <ns0:t xml:space="preserve"/>
-      </ns0:r>
-    </ns0:p>
-    <ns0:p>
-      <ns0:pPr>
-        <ns0:spacing ns0:after="0" ns0:line="360" ns0:lineRule="auto"/>
-        <ns0:ind ns0:firstLine="0"/>
-        <ns0:jc ns0:val="center"/>
-      </ns0:pPr>
-      <ns0:r>
-        <ns0:rPr>
-          <ns0:rFonts ns0:ascii="Times New Roman" ns0:hAnsi="Times New Roman"/>
-          <ns0:sz ns0:val="28"/>
-          <ns0:b/>
-        </ns0:rPr>
-        <ns0:t xml:space="preserve">ПРИЛОЖЕНИЕ А. Анкета</ns0:t>
-      </ns0:r>
-    </ns0:p>
-    <ns0:p>
-      <ns0:pPr>
-        <ns0:spacing ns0:after="0" ns0:line="360" ns0:lineRule="auto"/>
-        <ns0:ind ns0:firstLine="0"/>
-        <ns0:jc ns0:val="both"/>
-      </ns0:pPr>
-      <ns0:r>
-        <ns0:rPr>
-          <ns0:rFonts ns0:ascii="Times New Roman" ns0:hAnsi="Times New Roman"/>
-          <ns0:sz ns0:val="28"/>
-        </ns0:rPr>
-        <ns0:t xml:space="preserve"/>
-      </ns0:r>
-    </ns0:p>
-    <ns0:p>
-      <ns0:pPr>
-        <ns0:spacing ns0:after="0" ns0:line="360" ns0:lineRule="auto"/>
-        <ns0:ind ns0:firstLine="709"/>
-        <ns0:jc ns0:val="both"/>
-      </ns0:pPr>
-      <ns0:r>
-        <ns0:rPr>
-          <ns0:rFonts ns0:ascii="Times New Roman" ns0:hAnsi="Times New Roman"/>
-          <ns0:sz ns0:val="28"/>
-        </ns0:rPr>
-        <ns0:t xml:space="preserve">(1) Знаете ли вы, что такое вектор?</ns0:t>
-      </ns0:r>
-    </ns0:p>
-    <ns0:p>
-      <ns0:pPr>
-        <ns0:spacing ns0:after="0" ns0:line="360" ns0:lineRule="auto"/>
-        <ns0:ind ns0:firstLine="709"/>
-        <ns0:jc ns0:val="both"/>
-      </ns0:pPr>
-      <ns0:r>
-        <ns0:rPr>
-          <ns0:rFonts ns0:ascii="Times New Roman" ns0:hAnsi="Times New Roman"/>
-          <ns0:sz ns0:val="28"/>
-        </ns0:rPr>
-        <ns0:t xml:space="preserve">(2) Где вы чаще всего встречаете слово «вектор»?</ns0:t>
-      </ns0:r>
-    </ns0:p>
-    <ns0:p>
-      <ns0:pPr>
-        <ns0:spacing ns0:after="0" ns0:line="360" ns0:lineRule="auto"/>
-        <ns0:ind ns0:firstLine="709"/>
-        <ns0:jc ns0:val="both"/>
-      </ns0:pPr>
-      <ns0:r>
-        <ns0:rPr>
-          <ns0:rFonts ns0:ascii="Times New Roman" ns0:hAnsi="Times New Roman"/>
-          <ns0:sz ns0:val="28"/>
-        </ns0:rPr>
-        <ns0:t xml:space="preserve">(3) Что обязательно должно быть у векторной величины?</ns0:t>
-      </ns0:r>
-    </ns0:p>
-    <ns0:p>
-      <ns0:pPr>
-        <ns0:spacing ns0:after="0" ns0:line="360" ns0:lineRule="auto"/>
-        <ns0:ind ns0:firstLine="709"/>
-        <ns0:jc ns0:val="both"/>
-      </ns0:pPr>
-      <ns0:r>
-        <ns0:rPr>
-          <ns0:rFonts ns0:ascii="Times New Roman" ns0:hAnsi="Times New Roman"/>
-          <ns0:sz ns0:val="28"/>
-        </ns0:rPr>
-        <ns0:t xml:space="preserve">(4) Можно ли считать скорость векторной величиной?</ns0:t>
-      </ns0:r>
-    </ns0:p>
-    <ns0:p>
-      <ns0:pPr>
-        <ns0:spacing ns0:after="0" ns0:line="360" ns0:lineRule="auto"/>
-        <ns0:ind ns0:firstLine="709"/>
-        <ns0:jc ns0:val="both"/>
-      </ns0:pPr>
-      <ns0:r>
-        <ns0:rPr>
-          <ns0:rFonts ns0:ascii="Times New Roman" ns0:hAnsi="Times New Roman"/>
-          <ns0:sz ns0:val="28"/>
-        </ns0:rPr>
-        <ns0:t xml:space="preserve">(5) Можно ли считать температуру векторной величиной?</ns0:t>
-      </ns0:r>
-    </ns0:p>
-    <ns0:p>
-      <ns0:pPr>
-        <ns0:spacing ns0:after="0" ns0:line="360" ns0:lineRule="auto"/>
-        <ns0:ind ns0:firstLine="709"/>
-        <ns0:jc ns0:val="both"/>
-      </ns0:pPr>
-      <ns0:r>
-        <ns0:rPr>
-          <ns0:rFonts ns0:ascii="Times New Roman" ns0:hAnsi="Times New Roman"/>
-          <ns0:sz ns0:val="28"/>
-        </ns0:rPr>
-        <ns0:t xml:space="preserve">(6) Что такое «результирующее перемещение» при нескольких перемещениях подряд?</ns0:t>
-      </ns0:r>
-    </ns0:p>
-    <ns0:p>
-      <ns0:pPr>
-        <ns0:spacing ns0:after="0" ns0:line="360" ns0:lineRule="auto"/>
-        <ns0:ind ns0:firstLine="709"/>
-        <ns0:jc ns0:val="both"/>
-      </ns0:pPr>
-      <ns0:r>
-        <ns0:rPr>
-          <ns0:rFonts ns0:ascii="Times New Roman" ns0:hAnsi="Times New Roman"/>
-          <ns0:sz ns0:val="28"/>
-        </ns0:rPr>
-        <ns0:t xml:space="preserve">(7) Где векторы полезны в жизни?</ns0:t>
-      </ns0:r>
-    </ns0:p>
-    <ns0:p>
-      <ns0:pPr>
-        <ns0:spacing ns0:after="0" ns0:line="360" ns0:lineRule="auto"/>
-        <ns0:ind ns0:firstLine="709"/>
-        <ns0:jc ns0:val="both"/>
-      </ns0:pPr>
-      <ns0:r>
-        <ns0:rPr>
-          <ns0:rFonts ns0:ascii="Times New Roman" ns0:hAnsi="Times New Roman"/>
-          <ns0:sz ns0:val="28"/>
-        </ns0:rPr>
-        <ns0:t xml:space="preserve">(8) Хотели бы вы видеть больше примеров из жизни на уроках математики?</ns0:t>
-      </ns0:r>
-    </ns0:p>
-    <ns0:p>
-      <ns0:pPr>
-        <ns0:spacing ns0:after="0" ns0:line="360" ns0:lineRule="auto"/>
-        <ns0:ind ns0:firstLine="0"/>
-        <ns0:jc ns0:val="both"/>
-      </ns0:pPr>
-      <ns0:r>
-        <ns0:rPr>
-          <ns0:rFonts ns0:ascii="Times New Roman" ns0:hAnsi="Times New Roman"/>
-          <ns0:sz ns0:val="28"/>
-        </ns0:rPr>
-        <ns0:t xml:space="preserve"/>
-      </ns0:r>
-    </ns0:p>
-    <ns0:p>
-      <ns0:pPr>
-        <ns0:spacing ns0:after="0" ns0:line="360" ns0:lineRule="auto"/>
-        <ns0:ind ns0:firstLine="0"/>
-        <ns0:jc ns0:val="center"/>
-      </ns0:pPr>
-      <ns0:r>
-        <ns0:rPr>
-          <ns0:rFonts ns0:ascii="Times New Roman" ns0:hAnsi="Times New Roman"/>
-          <ns0:sz ns0:val="28"/>
-          <ns0:b/>
-        </ns0:rPr>
-        <ns0:t xml:space="preserve">ПРИЛОЖЕНИЕ Б. Сырые данные (количество ответов)</ns0:t>
+        <ns0:t xml:space="preserve">ПРИЛОЖЕНИЕ Б. Сырые данные опроса (30 респондентов)</ns0:t>
       </ns0:r>
     </ns0:p>
     <ns0:p>
@@ -3532,6 +4128,20 @@
     <ns0:p>
       <ns0:pPr>
         <ns0:spacing ns0:after="0" ns0:line="360" ns0:lineRule="auto"/>
+        <ns0:ind ns0:firstLine="0"/>
+        <ns0:jc ns0:val="both"/>
+      </ns0:pPr>
+      <ns0:r>
+        <ns0:rPr>
+          <ns0:rFonts ns0:ascii="Times New Roman" ns0:hAnsi="Times New Roman"/>
+          <ns0:sz ns0:val="28"/>
+        </ns0:rPr>
+        <ns0:t xml:space="preserve"/>
+      </ns0:r>
+    </ns0:p>
+    <ns0:p>
+      <ns0:pPr>
+        <ns0:spacing ns0:after="0" ns0:line="360" ns0:lineRule="auto"/>
         <ns0:ind ns0:firstLine="709"/>
         <ns0:jc ns0:val="both"/>
       </ns0:pPr>
@@ -3546,6 +4156,20 @@
     <ns0:p>
       <ns0:pPr>
         <ns0:spacing ns0:after="0" ns0:line="360" ns0:lineRule="auto"/>
+        <ns0:ind ns0:firstLine="0"/>
+        <ns0:jc ns0:val="both"/>
+      </ns0:pPr>
+      <ns0:r>
+        <ns0:rPr>
+          <ns0:rFonts ns0:ascii="Times New Roman" ns0:hAnsi="Times New Roman"/>
+          <ns0:sz ns0:val="28"/>
+        </ns0:rPr>
+        <ns0:t xml:space="preserve"/>
+      </ns0:r>
+    </ns0:p>
+    <ns0:p>
+      <ns0:pPr>
+        <ns0:spacing ns0:after="0" ns0:line="360" ns0:lineRule="auto"/>
         <ns0:ind ns0:firstLine="709"/>
         <ns0:jc ns0:val="both"/>
       </ns0:pPr>
@@ -3560,6 +4184,20 @@
     <ns0:p>
       <ns0:pPr>
         <ns0:spacing ns0:after="0" ns0:line="360" ns0:lineRule="auto"/>
+        <ns0:ind ns0:firstLine="0"/>
+        <ns0:jc ns0:val="both"/>
+      </ns0:pPr>
+      <ns0:r>
+        <ns0:rPr>
+          <ns0:rFonts ns0:ascii="Times New Roman" ns0:hAnsi="Times New Roman"/>
+          <ns0:sz ns0:val="28"/>
+        </ns0:rPr>
+        <ns0:t xml:space="preserve"/>
+      </ns0:r>
+    </ns0:p>
+    <ns0:p>
+      <ns0:pPr>
+        <ns0:spacing ns0:after="0" ns0:line="360" ns0:lineRule="auto"/>
         <ns0:ind ns0:firstLine="709"/>
         <ns0:jc ns0:val="both"/>
       </ns0:pPr>
@@ -3574,6 +4212,20 @@
     <ns0:p>
       <ns0:pPr>
         <ns0:spacing ns0:after="0" ns0:line="360" ns0:lineRule="auto"/>
+        <ns0:ind ns0:firstLine="0"/>
+        <ns0:jc ns0:val="both"/>
+      </ns0:pPr>
+      <ns0:r>
+        <ns0:rPr>
+          <ns0:rFonts ns0:ascii="Times New Roman" ns0:hAnsi="Times New Roman"/>
+          <ns0:sz ns0:val="28"/>
+        </ns0:rPr>
+        <ns0:t xml:space="preserve"/>
+      </ns0:r>
+    </ns0:p>
+    <ns0:p>
+      <ns0:pPr>
+        <ns0:spacing ns0:after="0" ns0:line="360" ns0:lineRule="auto"/>
         <ns0:ind ns0:firstLine="709"/>
         <ns0:jc ns0:val="both"/>
       </ns0:pPr>
@@ -3588,6 +4240,20 @@
     <ns0:p>
       <ns0:pPr>
         <ns0:spacing ns0:after="0" ns0:line="360" ns0:lineRule="auto"/>
+        <ns0:ind ns0:firstLine="0"/>
+        <ns0:jc ns0:val="both"/>
+      </ns0:pPr>
+      <ns0:r>
+        <ns0:rPr>
+          <ns0:rFonts ns0:ascii="Times New Roman" ns0:hAnsi="Times New Roman"/>
+          <ns0:sz ns0:val="28"/>
+        </ns0:rPr>
+        <ns0:t xml:space="preserve"/>
+      </ns0:r>
+    </ns0:p>
+    <ns0:p>
+      <ns0:pPr>
+        <ns0:spacing ns0:after="0" ns0:line="360" ns0:lineRule="auto"/>
         <ns0:ind ns0:firstLine="709"/>
         <ns0:jc ns0:val="both"/>
       </ns0:pPr>
@@ -3602,6 +4268,20 @@
     <ns0:p>
       <ns0:pPr>
         <ns0:spacing ns0:after="0" ns0:line="360" ns0:lineRule="auto"/>
+        <ns0:ind ns0:firstLine="0"/>
+        <ns0:jc ns0:val="both"/>
+      </ns0:pPr>
+      <ns0:r>
+        <ns0:rPr>
+          <ns0:rFonts ns0:ascii="Times New Roman" ns0:hAnsi="Times New Roman"/>
+          <ns0:sz ns0:val="28"/>
+        </ns0:rPr>
+        <ns0:t xml:space="preserve"/>
+      </ns0:r>
+    </ns0:p>
+    <ns0:p>
+      <ns0:pPr>
+        <ns0:spacing ns0:after="0" ns0:line="360" ns0:lineRule="auto"/>
         <ns0:ind ns0:firstLine="709"/>
         <ns0:jc ns0:val="both"/>
       </ns0:pPr>
@@ -3611,6 +4291,20 @@
           <ns0:sz ns0:val="28"/>
         </ns0:rPr>
         <ns0:t xml:space="preserve">Q7: Навигация — 6; Спорт — 3; Техника — 4; Компьютерные технологии — 3; Везде перечисленное — 14.</ns0:t>
+      </ns0:r>
+    </ns0:p>
+    <ns0:p>
+      <ns0:pPr>
+        <ns0:spacing ns0:after="0" ns0:line="360" ns0:lineRule="auto"/>
+        <ns0:ind ns0:firstLine="0"/>
+        <ns0:jc ns0:val="both"/>
+      </ns0:pPr>
+      <ns0:r>
+        <ns0:rPr>
+          <ns0:rFonts ns0:ascii="Times New Roman" ns0:hAnsi="Times New Roman"/>
+          <ns0:sz ns0:val="28"/>
+        </ns0:rPr>
+        <ns0:t xml:space="preserve"/>
       </ns0:r>
     </ns0:p>
     <ns0:p>

</xml_diff>

<commit_message>
docs: expand section text while keeping proekтик-like headings
Co-authored-by: triotrio123ss <triotrio123ss@gmail.com>
</commit_message>
<xml_diff>
--- a/ИП_Векторы_вокруг_нас.docx
+++ b/ИП_Векторы_вокруг_нас.docx
@@ -1899,8 +1899,36 @@
     <ns0:p>
       <ns0:pPr>
         <ns0:spacing ns0:after="0" ns0:line="360" ns0:lineRule="auto"/>
-        <ns0:ind ns0:firstLine="0"/>
-        <ns0:jc ns0:val="both"/>
+        <ns0:ind ns0:firstLine="709"/>
+        <ns0:jc ns0:val="both"/>
+      </ns0:pPr>
+      <ns0:r>
+        <ns0:rPr>
+          <ns0:rFonts ns0:ascii="Times New Roman" ns0:hAnsi="Times New Roman"/>
+          <ns0:sz ns0:val="28"/>
+        </ns0:rPr>
+        <ns0:t xml:space="preserve">1. ТЕОРЕТИЧЕСКАЯ ЧАСТЬ. ОСНОВЫ ВЕКТОРОВ</ns0:t>
+      </ns0:r>
+    </ns0:p>
+    <ns0:p>
+      <ns0:pPr>
+        <ns0:spacing ns0:after="0" ns0:line="360" ns0:lineRule="auto"/>
+        <ns0:ind ns0:firstLine="0"/>
+        <ns0:jc ns0:val="both"/>
+      </ns0:pPr>
+      <ns0:r>
+        <ns0:rPr>
+          <ns0:rFonts ns0:ascii="Times New Roman" ns0:hAnsi="Times New Roman"/>
+          <ns0:sz ns0:val="28"/>
+        </ns0:rPr>
+        <ns0:t xml:space="preserve"/>
+      </ns0:r>
+    </ns0:p>
+    <ns0:p>
+      <ns0:pPr>
+        <ns0:spacing ns0:after="0" ns0:line="360" ns0:lineRule="auto"/>
+        <ns0:ind ns0:firstLine="0"/>
+        <ns0:jc ns0:val="center"/>
       </ns0:pPr>
       <ns0:r>
         <ns0:rPr>
@@ -1908,28 +1936,84 @@
           <ns0:sz ns0:val="28"/>
           <ns0:b/>
         </ns0:rPr>
-        <ns0:t xml:space="preserve">1. ТЕОРЕТИЧЕСКАЯ ЧАСТЬ. ОСНОВЫ ВЕКТОРОВ</ns0:t>
-      </ns0:r>
-    </ns0:p>
-    <ns0:p>
-      <ns0:pPr>
-        <ns0:spacing ns0:after="0" ns0:line="360" ns0:lineRule="auto"/>
-        <ns0:ind ns0:firstLine="0"/>
-        <ns0:jc ns0:val="both"/>
-      </ns0:pPr>
-      <ns0:r>
-        <ns0:rPr>
-          <ns0:rFonts ns0:ascii="Times New Roman" ns0:hAnsi="Times New Roman"/>
-          <ns0:sz ns0:val="28"/>
-        </ns0:rPr>
-        <ns0:t xml:space="preserve"/>
-      </ns0:r>
-    </ns0:p>
-    <ns0:p>
-      <ns0:pPr>
-        <ns0:spacing ns0:after="0" ns0:line="360" ns0:lineRule="auto"/>
-        <ns0:ind ns0:firstLine="0"/>
-        <ns0:jc ns0:val="center"/>
+        <ns0:t xml:space="preserve">СОДЕРЖАНИЕ</ns0:t>
+      </ns0:r>
+    </ns0:p>
+    <ns0:p>
+      <ns0:pPr>
+        <ns0:spacing ns0:after="0" ns0:line="360" ns0:lineRule="auto"/>
+        <ns0:ind ns0:firstLine="0"/>
+        <ns0:jc ns0:val="both"/>
+      </ns0:pPr>
+      <ns0:r>
+        <ns0:rPr>
+          <ns0:rFonts ns0:ascii="Times New Roman" ns0:hAnsi="Times New Roman"/>
+          <ns0:sz ns0:val="28"/>
+        </ns0:rPr>
+        <ns0:t xml:space="preserve"/>
+      </ns0:r>
+    </ns0:p>
+    <ns0:p>
+      <ns0:pPr>
+        <ns0:spacing ns0:after="0" ns0:line="360" ns0:lineRule="auto"/>
+        <ns0:ind ns0:firstLine="709"/>
+        <ns0:jc ns0:val="both"/>
+      </ns0:pPr>
+      <ns0:r>
+        <ns0:rPr>
+          <ns0:rFonts ns0:ascii="Times New Roman" ns0:hAnsi="Times New Roman"/>
+          <ns0:sz ns0:val="28"/>
+        </ns0:rPr>
+        <ns0:t xml:space="preserve">Введение……………………………………………………………………..3</ns0:t>
+      </ns0:r>
+    </ns0:p>
+    <ns0:p>
+      <ns0:pPr>
+        <ns0:spacing ns0:after="0" ns0:line="360" ns0:lineRule="auto"/>
+        <ns0:ind ns0:firstLine="0"/>
+        <ns0:jc ns0:val="both"/>
+      </ns0:pPr>
+      <ns0:r>
+        <ns0:rPr>
+          <ns0:rFonts ns0:ascii="Times New Roman" ns0:hAnsi="Times New Roman"/>
+          <ns0:sz ns0:val="28"/>
+        </ns0:rPr>
+        <ns0:t xml:space="preserve"/>
+      </ns0:r>
+    </ns0:p>
+    <ns0:p>
+      <ns0:pPr>
+        <ns0:spacing ns0:after="0" ns0:line="360" ns0:lineRule="auto"/>
+        <ns0:ind ns0:firstLine="709"/>
+        <ns0:jc ns0:val="both"/>
+      </ns0:pPr>
+      <ns0:r>
+        <ns0:rPr>
+          <ns0:rFonts ns0:ascii="Times New Roman" ns0:hAnsi="Times New Roman"/>
+          <ns0:sz ns0:val="28"/>
+        </ns0:rPr>
+        <ns0:t xml:space="preserve">Глава 1. Векторы как математическая модель направленных величин</ns0:t>
+      </ns0:r>
+    </ns0:p>
+    <ns0:p>
+      <ns0:pPr>
+        <ns0:spacing ns0:after="0" ns0:line="360" ns0:lineRule="auto"/>
+        <ns0:ind ns0:firstLine="0"/>
+        <ns0:jc ns0:val="both"/>
+      </ns0:pPr>
+      <ns0:r>
+        <ns0:rPr>
+          <ns0:rFonts ns0:ascii="Times New Roman" ns0:hAnsi="Times New Roman"/>
+          <ns0:sz ns0:val="28"/>
+        </ns0:rPr>
+        <ns0:t xml:space="preserve"/>
+      </ns0:r>
+    </ns0:p>
+    <ns0:p>
+      <ns0:pPr>
+        <ns0:spacing ns0:after="0" ns0:line="360" ns0:lineRule="auto"/>
+        <ns0:ind ns0:firstLine="0"/>
+        <ns0:jc ns0:val="both"/>
       </ns0:pPr>
       <ns0:r>
         <ns0:rPr>
@@ -1937,63 +2021,7 @@
           <ns0:sz ns0:val="28"/>
           <ns0:b/>
         </ns0:rPr>
-        <ns0:t xml:space="preserve">СОДЕРЖАНИЕ</ns0:t>
-      </ns0:r>
-    </ns0:p>
-    <ns0:p>
-      <ns0:pPr>
-        <ns0:spacing ns0:after="0" ns0:line="360" ns0:lineRule="auto"/>
-        <ns0:ind ns0:firstLine="0"/>
-        <ns0:jc ns0:val="both"/>
-      </ns0:pPr>
-      <ns0:r>
-        <ns0:rPr>
-          <ns0:rFonts ns0:ascii="Times New Roman" ns0:hAnsi="Times New Roman"/>
-          <ns0:sz ns0:val="28"/>
-        </ns0:rPr>
-        <ns0:t xml:space="preserve"/>
-      </ns0:r>
-    </ns0:p>
-    <ns0:p>
-      <ns0:pPr>
-        <ns0:spacing ns0:after="0" ns0:line="360" ns0:lineRule="auto"/>
-        <ns0:ind ns0:firstLine="709"/>
-        <ns0:jc ns0:val="both"/>
-      </ns0:pPr>
-      <ns0:r>
-        <ns0:rPr>
-          <ns0:rFonts ns0:ascii="Times New Roman" ns0:hAnsi="Times New Roman"/>
-          <ns0:sz ns0:val="28"/>
-        </ns0:rPr>
-        <ns0:t xml:space="preserve">Введение……………………………………………………………………..3</ns0:t>
-      </ns0:r>
-    </ns0:p>
-    <ns0:p>
-      <ns0:pPr>
-        <ns0:spacing ns0:after="0" ns0:line="360" ns0:lineRule="auto"/>
-        <ns0:ind ns0:firstLine="0"/>
-        <ns0:jc ns0:val="both"/>
-      </ns0:pPr>
-      <ns0:r>
-        <ns0:rPr>
-          <ns0:rFonts ns0:ascii="Times New Roman" ns0:hAnsi="Times New Roman"/>
-          <ns0:sz ns0:val="28"/>
-        </ns0:rPr>
-        <ns0:t xml:space="preserve"/>
-      </ns0:r>
-    </ns0:p>
-    <ns0:p>
-      <ns0:pPr>
-        <ns0:spacing ns0:after="0" ns0:line="360" ns0:lineRule="auto"/>
-        <ns0:ind ns0:firstLine="709"/>
-        <ns0:jc ns0:val="both"/>
-      </ns0:pPr>
-      <ns0:r>
-        <ns0:rPr>
-          <ns0:rFonts ns0:ascii="Times New Roman" ns0:hAnsi="Times New Roman"/>
-          <ns0:sz ns0:val="28"/>
-        </ns0:rPr>
-        <ns0:t xml:space="preserve">Глава 1. Векторы как математическая модель направленных величин</ns0:t>
+        <ns0:t xml:space="preserve">1.1 Понятие вектора и основные характеристики………………………..4</ns0:t>
       </ns0:r>
     </ns0:p>
     <ns0:p>
@@ -2022,7 +2050,7 @@
           <ns0:sz ns0:val="28"/>
           <ns0:b/>
         </ns0:rPr>
-        <ns0:t xml:space="preserve">1.1 Понятие вектора и основные характеристики………………………..4</ns0:t>
+        <ns0:t xml:space="preserve">1.2 Координаты вектора и модуль………………………………………….6</ns0:t>
       </ns0:r>
     </ns0:p>
     <ns0:p>
@@ -2051,7 +2079,35 @@
           <ns0:sz ns0:val="28"/>
           <ns0:b/>
         </ns0:rPr>
-        <ns0:t xml:space="preserve">1.2 Координаты вектора и модуль………………………………………….6</ns0:t>
+        <ns0:t xml:space="preserve">1.3 Операции над векторами и их смысл…………………………………..8</ns0:t>
+      </ns0:r>
+    </ns0:p>
+    <ns0:p>
+      <ns0:pPr>
+        <ns0:spacing ns0:after="0" ns0:line="360" ns0:lineRule="auto"/>
+        <ns0:ind ns0:firstLine="0"/>
+        <ns0:jc ns0:val="both"/>
+      </ns0:pPr>
+      <ns0:r>
+        <ns0:rPr>
+          <ns0:rFonts ns0:ascii="Times New Roman" ns0:hAnsi="Times New Roman"/>
+          <ns0:sz ns0:val="28"/>
+        </ns0:rPr>
+        <ns0:t xml:space="preserve"/>
+      </ns0:r>
+    </ns0:p>
+    <ns0:p>
+      <ns0:pPr>
+        <ns0:spacing ns0:after="0" ns0:line="360" ns0:lineRule="auto"/>
+        <ns0:ind ns0:firstLine="709"/>
+        <ns0:jc ns0:val="both"/>
+      </ns0:pPr>
+      <ns0:r>
+        <ns0:rPr>
+          <ns0:rFonts ns0:ascii="Times New Roman" ns0:hAnsi="Times New Roman"/>
+          <ns0:sz ns0:val="28"/>
+        </ns0:rPr>
+        <ns0:t xml:space="preserve">Глава 2. Практическая часть: опрос и диаграммы</ns0:t>
       </ns0:r>
     </ns0:p>
     <ns0:p>
@@ -2080,35 +2136,7 @@
           <ns0:sz ns0:val="28"/>
           <ns0:b/>
         </ns0:rPr>
-        <ns0:t xml:space="preserve">1.3 Операции над векторами и их смысл…………………………………..8</ns0:t>
-      </ns0:r>
-    </ns0:p>
-    <ns0:p>
-      <ns0:pPr>
-        <ns0:spacing ns0:after="0" ns0:line="360" ns0:lineRule="auto"/>
-        <ns0:ind ns0:firstLine="0"/>
-        <ns0:jc ns0:val="both"/>
-      </ns0:pPr>
-      <ns0:r>
-        <ns0:rPr>
-          <ns0:rFonts ns0:ascii="Times New Roman" ns0:hAnsi="Times New Roman"/>
-          <ns0:sz ns0:val="28"/>
-        </ns0:rPr>
-        <ns0:t xml:space="preserve"/>
-      </ns0:r>
-    </ns0:p>
-    <ns0:p>
-      <ns0:pPr>
-        <ns0:spacing ns0:after="0" ns0:line="360" ns0:lineRule="auto"/>
-        <ns0:ind ns0:firstLine="709"/>
-        <ns0:jc ns0:val="both"/>
-      </ns0:pPr>
-      <ns0:r>
-        <ns0:rPr>
-          <ns0:rFonts ns0:ascii="Times New Roman" ns0:hAnsi="Times New Roman"/>
-          <ns0:sz ns0:val="28"/>
-        </ns0:rPr>
-        <ns0:t xml:space="preserve">Глава 2. Практическая часть: опрос и диаграммы</ns0:t>
+        <ns0:t xml:space="preserve">2.1 Организация и проведение опроса……………………………………10</ns0:t>
       </ns0:r>
     </ns0:p>
     <ns0:p>
@@ -2137,7 +2165,7 @@
           <ns0:sz ns0:val="28"/>
           <ns0:b/>
         </ns0:rPr>
-        <ns0:t xml:space="preserve">2.1 Организация и проведение опроса……………………………………10</ns0:t>
+        <ns0:t xml:space="preserve">2.2 Диаграммы результатов опроса………………………………………12</ns0:t>
       </ns0:r>
     </ns0:p>
     <ns0:p>
@@ -2166,7 +2194,119 @@
           <ns0:sz ns0:val="28"/>
           <ns0:b/>
         </ns0:rPr>
-        <ns0:t xml:space="preserve">2.2 Диаграммы результатов опроса………………………………………12</ns0:t>
+        <ns0:t xml:space="preserve">2.3 Выводы по результатам опроса………………………………………15</ns0:t>
+      </ns0:r>
+    </ns0:p>
+    <ns0:p>
+      <ns0:pPr>
+        <ns0:spacing ns0:after="0" ns0:line="360" ns0:lineRule="auto"/>
+        <ns0:ind ns0:firstLine="0"/>
+        <ns0:jc ns0:val="both"/>
+      </ns0:pPr>
+      <ns0:r>
+        <ns0:rPr>
+          <ns0:rFonts ns0:ascii="Times New Roman" ns0:hAnsi="Times New Roman"/>
+          <ns0:sz ns0:val="28"/>
+        </ns0:rPr>
+        <ns0:t xml:space="preserve"/>
+      </ns0:r>
+    </ns0:p>
+    <ns0:p>
+      <ns0:pPr>
+        <ns0:spacing ns0:after="0" ns0:line="360" ns0:lineRule="auto"/>
+        <ns0:ind ns0:firstLine="709"/>
+        <ns0:jc ns0:val="both"/>
+      </ns0:pPr>
+      <ns0:r>
+        <ns0:rPr>
+          <ns0:rFonts ns0:ascii="Times New Roman" ns0:hAnsi="Times New Roman"/>
+          <ns0:sz ns0:val="28"/>
+        </ns0:rPr>
+        <ns0:t xml:space="preserve">Заключение…………………………………………………………………..16</ns0:t>
+      </ns0:r>
+    </ns0:p>
+    <ns0:p>
+      <ns0:pPr>
+        <ns0:spacing ns0:after="0" ns0:line="360" ns0:lineRule="auto"/>
+        <ns0:ind ns0:firstLine="0"/>
+        <ns0:jc ns0:val="both"/>
+      </ns0:pPr>
+      <ns0:r>
+        <ns0:rPr>
+          <ns0:rFonts ns0:ascii="Times New Roman" ns0:hAnsi="Times New Roman"/>
+          <ns0:sz ns0:val="28"/>
+        </ns0:rPr>
+        <ns0:t xml:space="preserve"/>
+      </ns0:r>
+    </ns0:p>
+    <ns0:p>
+      <ns0:pPr>
+        <ns0:spacing ns0:after="0" ns0:line="360" ns0:lineRule="auto"/>
+        <ns0:ind ns0:firstLine="709"/>
+        <ns0:jc ns0:val="both"/>
+      </ns0:pPr>
+      <ns0:r>
+        <ns0:rPr>
+          <ns0:rFonts ns0:ascii="Times New Roman" ns0:hAnsi="Times New Roman"/>
+          <ns0:sz ns0:val="28"/>
+        </ns0:rPr>
+        <ns0:t xml:space="preserve">Список использованных источников……………………………………..17</ns0:t>
+      </ns0:r>
+    </ns0:p>
+    <ns0:p>
+      <ns0:pPr>
+        <ns0:spacing ns0:after="0" ns0:line="360" ns0:lineRule="auto"/>
+        <ns0:ind ns0:firstLine="0"/>
+        <ns0:jc ns0:val="both"/>
+      </ns0:pPr>
+      <ns0:r>
+        <ns0:rPr>
+          <ns0:rFonts ns0:ascii="Times New Roman" ns0:hAnsi="Times New Roman"/>
+          <ns0:sz ns0:val="28"/>
+        </ns0:rPr>
+        <ns0:t xml:space="preserve"/>
+      </ns0:r>
+    </ns0:p>
+    <ns0:p>
+      <ns0:pPr>
+        <ns0:spacing ns0:after="0" ns0:line="360" ns0:lineRule="auto"/>
+        <ns0:ind ns0:firstLine="709"/>
+        <ns0:jc ns0:val="both"/>
+      </ns0:pPr>
+      <ns0:r>
+        <ns0:rPr>
+          <ns0:rFonts ns0:ascii="Times New Roman" ns0:hAnsi="Times New Roman"/>
+          <ns0:sz ns0:val="28"/>
+        </ns0:rPr>
+        <ns0:t xml:space="preserve">Приложение А. Анкета……………………………………………………..18</ns0:t>
+      </ns0:r>
+    </ns0:p>
+    <ns0:p>
+      <ns0:pPr>
+        <ns0:spacing ns0:after="0" ns0:line="360" ns0:lineRule="auto"/>
+        <ns0:ind ns0:firstLine="0"/>
+        <ns0:jc ns0:val="both"/>
+      </ns0:pPr>
+      <ns0:r>
+        <ns0:rPr>
+          <ns0:rFonts ns0:ascii="Times New Roman" ns0:hAnsi="Times New Roman"/>
+          <ns0:sz ns0:val="28"/>
+        </ns0:rPr>
+        <ns0:t xml:space="preserve"/>
+      </ns0:r>
+    </ns0:p>
+    <ns0:p>
+      <ns0:pPr>
+        <ns0:spacing ns0:after="0" ns0:line="360" ns0:lineRule="auto"/>
+        <ns0:ind ns0:firstLine="709"/>
+        <ns0:jc ns0:val="both"/>
+      </ns0:pPr>
+      <ns0:r>
+        <ns0:rPr>
+          <ns0:rFonts ns0:ascii="Times New Roman" ns0:hAnsi="Times New Roman"/>
+          <ns0:sz ns0:val="28"/>
+        </ns0:rPr>
+        <ns0:t xml:space="preserve">Приложение Б. Сырые данные опроса…………………………………..19</ns0:t>
       </ns0:r>
     </ns0:p>
     <ns0:p>
@@ -2195,119 +2335,7 @@
           <ns0:sz ns0:val="28"/>
           <ns0:b/>
         </ns0:rPr>
-        <ns0:t xml:space="preserve">2.3 Выводы по результатам опроса………………………………………15</ns0:t>
-      </ns0:r>
-    </ns0:p>
-    <ns0:p>
-      <ns0:pPr>
-        <ns0:spacing ns0:after="0" ns0:line="360" ns0:lineRule="auto"/>
-        <ns0:ind ns0:firstLine="0"/>
-        <ns0:jc ns0:val="both"/>
-      </ns0:pPr>
-      <ns0:r>
-        <ns0:rPr>
-          <ns0:rFonts ns0:ascii="Times New Roman" ns0:hAnsi="Times New Roman"/>
-          <ns0:sz ns0:val="28"/>
-        </ns0:rPr>
-        <ns0:t xml:space="preserve"/>
-      </ns0:r>
-    </ns0:p>
-    <ns0:p>
-      <ns0:pPr>
-        <ns0:spacing ns0:after="0" ns0:line="360" ns0:lineRule="auto"/>
-        <ns0:ind ns0:firstLine="709"/>
-        <ns0:jc ns0:val="both"/>
-      </ns0:pPr>
-      <ns0:r>
-        <ns0:rPr>
-          <ns0:rFonts ns0:ascii="Times New Roman" ns0:hAnsi="Times New Roman"/>
-          <ns0:sz ns0:val="28"/>
-        </ns0:rPr>
-        <ns0:t xml:space="preserve">Заключение…………………………………………………………………..16</ns0:t>
-      </ns0:r>
-    </ns0:p>
-    <ns0:p>
-      <ns0:pPr>
-        <ns0:spacing ns0:after="0" ns0:line="360" ns0:lineRule="auto"/>
-        <ns0:ind ns0:firstLine="0"/>
-        <ns0:jc ns0:val="both"/>
-      </ns0:pPr>
-      <ns0:r>
-        <ns0:rPr>
-          <ns0:rFonts ns0:ascii="Times New Roman" ns0:hAnsi="Times New Roman"/>
-          <ns0:sz ns0:val="28"/>
-        </ns0:rPr>
-        <ns0:t xml:space="preserve"/>
-      </ns0:r>
-    </ns0:p>
-    <ns0:p>
-      <ns0:pPr>
-        <ns0:spacing ns0:after="0" ns0:line="360" ns0:lineRule="auto"/>
-        <ns0:ind ns0:firstLine="709"/>
-        <ns0:jc ns0:val="both"/>
-      </ns0:pPr>
-      <ns0:r>
-        <ns0:rPr>
-          <ns0:rFonts ns0:ascii="Times New Roman" ns0:hAnsi="Times New Roman"/>
-          <ns0:sz ns0:val="28"/>
-        </ns0:rPr>
-        <ns0:t xml:space="preserve">Список использованных источников……………………………………..17</ns0:t>
-      </ns0:r>
-    </ns0:p>
-    <ns0:p>
-      <ns0:pPr>
-        <ns0:spacing ns0:after="0" ns0:line="360" ns0:lineRule="auto"/>
-        <ns0:ind ns0:firstLine="0"/>
-        <ns0:jc ns0:val="both"/>
-      </ns0:pPr>
-      <ns0:r>
-        <ns0:rPr>
-          <ns0:rFonts ns0:ascii="Times New Roman" ns0:hAnsi="Times New Roman"/>
-          <ns0:sz ns0:val="28"/>
-        </ns0:rPr>
-        <ns0:t xml:space="preserve"/>
-      </ns0:r>
-    </ns0:p>
-    <ns0:p>
-      <ns0:pPr>
-        <ns0:spacing ns0:after="0" ns0:line="360" ns0:lineRule="auto"/>
-        <ns0:ind ns0:firstLine="709"/>
-        <ns0:jc ns0:val="both"/>
-      </ns0:pPr>
-      <ns0:r>
-        <ns0:rPr>
-          <ns0:rFonts ns0:ascii="Times New Roman" ns0:hAnsi="Times New Roman"/>
-          <ns0:sz ns0:val="28"/>
-        </ns0:rPr>
-        <ns0:t xml:space="preserve">Приложение А. Анкета……………………………………………………..18</ns0:t>
-      </ns0:r>
-    </ns0:p>
-    <ns0:p>
-      <ns0:pPr>
-        <ns0:spacing ns0:after="0" ns0:line="360" ns0:lineRule="auto"/>
-        <ns0:ind ns0:firstLine="0"/>
-        <ns0:jc ns0:val="both"/>
-      </ns0:pPr>
-      <ns0:r>
-        <ns0:rPr>
-          <ns0:rFonts ns0:ascii="Times New Roman" ns0:hAnsi="Times New Roman"/>
-          <ns0:sz ns0:val="28"/>
-        </ns0:rPr>
-        <ns0:t xml:space="preserve"/>
-      </ns0:r>
-    </ns0:p>
-    <ns0:p>
-      <ns0:pPr>
-        <ns0:spacing ns0:after="0" ns0:line="360" ns0:lineRule="auto"/>
-        <ns0:ind ns0:firstLine="709"/>
-        <ns0:jc ns0:val="both"/>
-      </ns0:pPr>
-      <ns0:r>
-        <ns0:rPr>
-          <ns0:rFonts ns0:ascii="Times New Roman" ns0:hAnsi="Times New Roman"/>
-          <ns0:sz ns0:val="28"/>
-        </ns0:rPr>
-        <ns0:t xml:space="preserve">Приложение Б. Сырые данные опроса…………………………………..19</ns0:t>
+        <ns0:t xml:space="preserve">ГЛАВА 1. ВЕКТОРЫ КАК МАТЕМАТИЧЕСКАЯ МОДЕЛЬ НАПРАВЛЕННЫХ ВЕЛИЧИН</ns0:t>
       </ns0:r>
     </ns0:p>
     <ns0:p>
@@ -2336,7 +2364,119 @@
           <ns0:sz ns0:val="28"/>
           <ns0:b/>
         </ns0:rPr>
-        <ns0:t xml:space="preserve">ГЛАВА 1. ВЕКТОРЫ КАК МАТЕМАТИЧЕСКАЯ МОДЕЛЬ НАПРАВЛЕННЫХ ВЕЛИЧИН</ns0:t>
+        <ns0:t xml:space="preserve">1.1 Понятие вектора и основные характеристики</ns0:t>
+      </ns0:r>
+    </ns0:p>
+    <ns0:p>
+      <ns0:pPr>
+        <ns0:spacing ns0:after="0" ns0:line="360" ns0:lineRule="auto"/>
+        <ns0:ind ns0:firstLine="0"/>
+        <ns0:jc ns0:val="both"/>
+      </ns0:pPr>
+      <ns0:r>
+        <ns0:rPr>
+          <ns0:rFonts ns0:ascii="Times New Roman" ns0:hAnsi="Times New Roman"/>
+          <ns0:sz ns0:val="28"/>
+        </ns0:rPr>
+        <ns0:t xml:space="preserve"/>
+      </ns0:r>
+    </ns0:p>
+    <ns0:p>
+      <ns0:pPr>
+        <ns0:spacing ns0:after="0" ns0:line="360" ns0:lineRule="auto"/>
+        <ns0:ind ns0:firstLine="709"/>
+        <ns0:jc ns0:val="both"/>
+      </ns0:pPr>
+      <ns0:r>
+        <ns0:rPr>
+          <ns0:rFonts ns0:ascii="Times New Roman" ns0:hAnsi="Times New Roman"/>
+          <ns0:sz ns0:val="28"/>
+        </ns0:rPr>
+        <ns0:t xml:space="preserve">Вектором называют направленный отрезок. Он задаётся начальной и конечной точками и показывает направление от начала к концу. Важно, что вектор — это не просто «стрелка на листе», а математическая модель, которая описывает направленную величину.</ns0:t>
+      </ns0:r>
+    </ns0:p>
+    <ns0:p>
+      <ns0:pPr>
+        <ns0:spacing ns0:after="0" ns0:line="360" ns0:lineRule="auto"/>
+        <ns0:ind ns0:firstLine="0"/>
+        <ns0:jc ns0:val="both"/>
+      </ns0:pPr>
+      <ns0:r>
+        <ns0:rPr>
+          <ns0:rFonts ns0:ascii="Times New Roman" ns0:hAnsi="Times New Roman"/>
+          <ns0:sz ns0:val="28"/>
+        </ns0:rPr>
+        <ns0:t xml:space="preserve"/>
+      </ns0:r>
+    </ns0:p>
+    <ns0:p>
+      <ns0:pPr>
+        <ns0:spacing ns0:after="0" ns0:line="360" ns0:lineRule="auto"/>
+        <ns0:ind ns0:firstLine="709"/>
+        <ns0:jc ns0:val="both"/>
+      </ns0:pPr>
+      <ns0:r>
+        <ns0:rPr>
+          <ns0:rFonts ns0:ascii="Times New Roman" ns0:hAnsi="Times New Roman"/>
+          <ns0:sz ns0:val="28"/>
+        </ns0:rPr>
+        <ns0:t xml:space="preserve">Основные характеристики вектора — модуль (длина) и направление. Модуль показывает «сколько», направление — «куда». Именно наличие направления отличает векторные величины от скалярных.</ns0:t>
+      </ns0:r>
+    </ns0:p>
+    <ns0:p>
+      <ns0:pPr>
+        <ns0:spacing ns0:after="0" ns0:line="360" ns0:lineRule="auto"/>
+        <ns0:ind ns0:firstLine="0"/>
+        <ns0:jc ns0:val="both"/>
+      </ns0:pPr>
+      <ns0:r>
+        <ns0:rPr>
+          <ns0:rFonts ns0:ascii="Times New Roman" ns0:hAnsi="Times New Roman"/>
+          <ns0:sz ns0:val="28"/>
+        </ns0:rPr>
+        <ns0:t xml:space="preserve"/>
+      </ns0:r>
+    </ns0:p>
+    <ns0:p>
+      <ns0:pPr>
+        <ns0:spacing ns0:after="0" ns0:line="360" ns0:lineRule="auto"/>
+        <ns0:ind ns0:firstLine="709"/>
+        <ns0:jc ns0:val="both"/>
+      </ns0:pPr>
+      <ns0:r>
+        <ns0:rPr>
+          <ns0:rFonts ns0:ascii="Times New Roman" ns0:hAnsi="Times New Roman"/>
+          <ns0:sz ns0:val="28"/>
+        </ns0:rPr>
+        <ns0:t xml:space="preserve">Равные векторы имеют одинаковые модуль и направление, даже если они построены в разных местах. Это позволяет переносить вектор параллельно самому себе без изменения его смысла. Противоположные векторы равны по длине, но направлены в разные стороны; нулевой вектор имеет модуль 0.</ns0:t>
+      </ns0:r>
+    </ns0:p>
+    <ns0:p>
+      <ns0:pPr>
+        <ns0:spacing ns0:after="0" ns0:line="360" ns0:lineRule="auto"/>
+        <ns0:ind ns0:firstLine="0"/>
+        <ns0:jc ns0:val="both"/>
+      </ns0:pPr>
+      <ns0:r>
+        <ns0:rPr>
+          <ns0:rFonts ns0:ascii="Times New Roman" ns0:hAnsi="Times New Roman"/>
+          <ns0:sz ns0:val="28"/>
+        </ns0:rPr>
+        <ns0:t xml:space="preserve"/>
+      </ns0:r>
+    </ns0:p>
+    <ns0:p>
+      <ns0:pPr>
+        <ns0:spacing ns0:after="0" ns0:line="360" ns0:lineRule="auto"/>
+        <ns0:ind ns0:firstLine="709"/>
+        <ns0:jc ns0:val="both"/>
+      </ns0:pPr>
+      <ns0:r>
+        <ns0:rPr>
+          <ns0:rFonts ns0:ascii="Times New Roman" ns0:hAnsi="Times New Roman"/>
+          <ns0:sz ns0:val="28"/>
+        </ns0:rPr>
+        <ns0:t xml:space="preserve">В повседневной жизни векторная модель встречается в задачах про перемещение, скорость, силу, направление ветра. Например, «идти 200 м» недостаточно — важно указать направление; иначе разные маршруты дадут разные результаты.</ns0:t>
       </ns0:r>
     </ns0:p>
     <ns0:p>
@@ -2365,91 +2505,119 @@
           <ns0:sz ns0:val="28"/>
           <ns0:b/>
         </ns0:rPr>
-        <ns0:t xml:space="preserve">1.1 Понятие вектора и основные характеристики</ns0:t>
-      </ns0:r>
-    </ns0:p>
-    <ns0:p>
-      <ns0:pPr>
-        <ns0:spacing ns0:after="0" ns0:line="360" ns0:lineRule="auto"/>
-        <ns0:ind ns0:firstLine="0"/>
-        <ns0:jc ns0:val="both"/>
-      </ns0:pPr>
-      <ns0:r>
-        <ns0:rPr>
-          <ns0:rFonts ns0:ascii="Times New Roman" ns0:hAnsi="Times New Roman"/>
-          <ns0:sz ns0:val="28"/>
-        </ns0:rPr>
-        <ns0:t xml:space="preserve"/>
-      </ns0:r>
-    </ns0:p>
-    <ns0:p>
-      <ns0:pPr>
-        <ns0:spacing ns0:after="0" ns0:line="360" ns0:lineRule="auto"/>
-        <ns0:ind ns0:firstLine="709"/>
-        <ns0:jc ns0:val="both"/>
-      </ns0:pPr>
-      <ns0:r>
-        <ns0:rPr>
-          <ns0:rFonts ns0:ascii="Times New Roman" ns0:hAnsi="Times New Roman"/>
-          <ns0:sz ns0:val="28"/>
-        </ns0:rPr>
-        <ns0:t xml:space="preserve">Вектором называют направленный отрезок. Он задаётся начальной и конечной точками и показывает направление от начала к концу. Вектор характеризуется длиной (модулем) и направлением.</ns0:t>
-      </ns0:r>
-    </ns0:p>
-    <ns0:p>
-      <ns0:pPr>
-        <ns0:spacing ns0:after="0" ns0:line="360" ns0:lineRule="auto"/>
-        <ns0:ind ns0:firstLine="0"/>
-        <ns0:jc ns0:val="both"/>
-      </ns0:pPr>
-      <ns0:r>
-        <ns0:rPr>
-          <ns0:rFonts ns0:ascii="Times New Roman" ns0:hAnsi="Times New Roman"/>
-          <ns0:sz ns0:val="28"/>
-        </ns0:rPr>
-        <ns0:t xml:space="preserve"/>
-      </ns0:r>
-    </ns0:p>
-    <ns0:p>
-      <ns0:pPr>
-        <ns0:spacing ns0:after="0" ns0:line="360" ns0:lineRule="auto"/>
-        <ns0:ind ns0:firstLine="709"/>
-        <ns0:jc ns0:val="both"/>
-      </ns0:pPr>
-      <ns0:r>
-        <ns0:rPr>
-          <ns0:rFonts ns0:ascii="Times New Roman" ns0:hAnsi="Times New Roman"/>
-          <ns0:sz ns0:val="28"/>
-        </ns0:rPr>
-        <ns0:t xml:space="preserve">Равные векторы имеют одинаковые модуль и направление, даже если расположены в разных местах. Противоположные векторы равны по длине, но направлены в разные стороны. Нулевой вектор имеет модуль 0.</ns0:t>
-      </ns0:r>
-    </ns0:p>
-    <ns0:p>
-      <ns0:pPr>
-        <ns0:spacing ns0:after="0" ns0:line="360" ns0:lineRule="auto"/>
-        <ns0:ind ns0:firstLine="0"/>
-        <ns0:jc ns0:val="both"/>
-      </ns0:pPr>
-      <ns0:r>
-        <ns0:rPr>
-          <ns0:rFonts ns0:ascii="Times New Roman" ns0:hAnsi="Times New Roman"/>
-          <ns0:sz ns0:val="28"/>
-        </ns0:rPr>
-        <ns0:t xml:space="preserve"/>
-      </ns0:r>
-    </ns0:p>
-    <ns0:p>
-      <ns0:pPr>
-        <ns0:spacing ns0:after="0" ns0:line="360" ns0:lineRule="auto"/>
-        <ns0:ind ns0:firstLine="709"/>
-        <ns0:jc ns0:val="both"/>
-      </ns0:pPr>
-      <ns0:r>
-        <ns0:rPr>
-          <ns0:rFonts ns0:ascii="Times New Roman" ns0:hAnsi="Times New Roman"/>
-          <ns0:sz ns0:val="28"/>
-        </ns0:rPr>
-        <ns0:t xml:space="preserve">В реальной жизни векторная модель удобна там, где важны «сколько» и «куда»: перемещение, скорость, сила, направление ветра.</ns0:t>
+        <ns0:t xml:space="preserve">1.2 Координаты вектора и модуль</ns0:t>
+      </ns0:r>
+    </ns0:p>
+    <ns0:p>
+      <ns0:pPr>
+        <ns0:spacing ns0:after="0" ns0:line="360" ns0:lineRule="auto"/>
+        <ns0:ind ns0:firstLine="0"/>
+        <ns0:jc ns0:val="both"/>
+      </ns0:pPr>
+      <ns0:r>
+        <ns0:rPr>
+          <ns0:rFonts ns0:ascii="Times New Roman" ns0:hAnsi="Times New Roman"/>
+          <ns0:sz ns0:val="28"/>
+        </ns0:rPr>
+        <ns0:t xml:space="preserve"/>
+      </ns0:r>
+    </ns0:p>
+    <ns0:p>
+      <ns0:pPr>
+        <ns0:spacing ns0:after="0" ns0:line="360" ns0:lineRule="auto"/>
+        <ns0:ind ns0:firstLine="709"/>
+        <ns0:jc ns0:val="both"/>
+      </ns0:pPr>
+      <ns0:r>
+        <ns0:rPr>
+          <ns0:rFonts ns0:ascii="Times New Roman" ns0:hAnsi="Times New Roman"/>
+          <ns0:sz ns0:val="28"/>
+        </ns0:rPr>
+        <ns0:t xml:space="preserve">На координатной плоскости вектор удобно описывать координатами. Если заданы точки A(x1; y1) и B(x2; y2), то координаты вектора AB⃗ равны (x2 − x1; y2 − y1). Такая запись показывает, какой «сдвиг» по оси x и по оси y переводит точку A в точку B.</ns0:t>
+      </ns0:r>
+    </ns0:p>
+    <ns0:p>
+      <ns0:pPr>
+        <ns0:spacing ns0:after="0" ns0:line="360" ns0:lineRule="auto"/>
+        <ns0:ind ns0:firstLine="0"/>
+        <ns0:jc ns0:val="both"/>
+      </ns0:pPr>
+      <ns0:r>
+        <ns0:rPr>
+          <ns0:rFonts ns0:ascii="Times New Roman" ns0:hAnsi="Times New Roman"/>
+          <ns0:sz ns0:val="28"/>
+        </ns0:rPr>
+        <ns0:t xml:space="preserve"/>
+      </ns0:r>
+    </ns0:p>
+    <ns0:p>
+      <ns0:pPr>
+        <ns0:spacing ns0:after="0" ns0:line="360" ns0:lineRule="auto"/>
+        <ns0:ind ns0:firstLine="709"/>
+        <ns0:jc ns0:val="both"/>
+      </ns0:pPr>
+      <ns0:r>
+        <ns0:rPr>
+          <ns0:rFonts ns0:ascii="Times New Roman" ns0:hAnsi="Times New Roman"/>
+          <ns0:sz ns0:val="28"/>
+        </ns0:rPr>
+        <ns0:t xml:space="preserve">Например, из A(−2; 1) в B(3; 5) нужно сместиться на 5 вправо и на 4 вверх, поэтому AB⃗=(5; 4). Если поменять порядок точек местами, получится противоположный вектор BA⃗=(−5; −4).</ns0:t>
+      </ns0:r>
+    </ns0:p>
+    <ns0:p>
+      <ns0:pPr>
+        <ns0:spacing ns0:after="0" ns0:line="360" ns0:lineRule="auto"/>
+        <ns0:ind ns0:firstLine="0"/>
+        <ns0:jc ns0:val="both"/>
+      </ns0:pPr>
+      <ns0:r>
+        <ns0:rPr>
+          <ns0:rFonts ns0:ascii="Times New Roman" ns0:hAnsi="Times New Roman"/>
+          <ns0:sz ns0:val="28"/>
+        </ns0:rPr>
+        <ns0:t xml:space="preserve"/>
+      </ns0:r>
+    </ns0:p>
+    <ns0:p>
+      <ns0:pPr>
+        <ns0:spacing ns0:after="0" ns0:line="360" ns0:lineRule="auto"/>
+        <ns0:ind ns0:firstLine="709"/>
+        <ns0:jc ns0:val="both"/>
+      </ns0:pPr>
+      <ns0:r>
+        <ns0:rPr>
+          <ns0:rFonts ns0:ascii="Times New Roman" ns0:hAnsi="Times New Roman"/>
+          <ns0:sz ns0:val="28"/>
+        </ns0:rPr>
+        <ns0:t xml:space="preserve">Модуль вектора a⃗=(ax; ay) вычисляют по формуле |a⃗|=√(ax²+ay²). Она вытекает из теоремы Пифагора и показывает длину направленного отрезка. Формула полезна, когда нужно найти длину перемещения или сравнить «силу» разных направленных действий.</ns0:t>
+      </ns0:r>
+    </ns0:p>
+    <ns0:p>
+      <ns0:pPr>
+        <ns0:spacing ns0:after="0" ns0:line="360" ns0:lineRule="auto"/>
+        <ns0:ind ns0:firstLine="0"/>
+        <ns0:jc ns0:val="both"/>
+      </ns0:pPr>
+      <ns0:r>
+        <ns0:rPr>
+          <ns0:rFonts ns0:ascii="Times New Roman" ns0:hAnsi="Times New Roman"/>
+          <ns0:sz ns0:val="28"/>
+        </ns0:rPr>
+        <ns0:t xml:space="preserve"/>
+      </ns0:r>
+    </ns0:p>
+    <ns0:p>
+      <ns0:pPr>
+        <ns0:spacing ns0:after="0" ns0:line="360" ns0:lineRule="auto"/>
+        <ns0:ind ns0:firstLine="709"/>
+        <ns0:jc ns0:val="both"/>
+      </ns0:pPr>
+      <ns0:r>
+        <ns0:rPr>
+          <ns0:rFonts ns0:ascii="Times New Roman" ns0:hAnsi="Times New Roman"/>
+          <ns0:sz ns0:val="28"/>
+        </ns0:rPr>
+        <ns0:t xml:space="preserve">Связь с реальными задачами простая: координаты — это способ точно описать направление и величину перемещения в виде чисел, что удобно для вычислений и построений.</ns0:t>
       </ns0:r>
     </ns0:p>
     <ns0:p>
@@ -2478,91 +2646,119 @@
           <ns0:sz ns0:val="28"/>
           <ns0:b/>
         </ns0:rPr>
-        <ns0:t xml:space="preserve">1.2 Координаты вектора и модуль</ns0:t>
-      </ns0:r>
-    </ns0:p>
-    <ns0:p>
-      <ns0:pPr>
-        <ns0:spacing ns0:after="0" ns0:line="360" ns0:lineRule="auto"/>
-        <ns0:ind ns0:firstLine="0"/>
-        <ns0:jc ns0:val="both"/>
-      </ns0:pPr>
-      <ns0:r>
-        <ns0:rPr>
-          <ns0:rFonts ns0:ascii="Times New Roman" ns0:hAnsi="Times New Roman"/>
-          <ns0:sz ns0:val="28"/>
-        </ns0:rPr>
-        <ns0:t xml:space="preserve"/>
-      </ns0:r>
-    </ns0:p>
-    <ns0:p>
-      <ns0:pPr>
-        <ns0:spacing ns0:after="0" ns0:line="360" ns0:lineRule="auto"/>
-        <ns0:ind ns0:firstLine="709"/>
-        <ns0:jc ns0:val="both"/>
-      </ns0:pPr>
-      <ns0:r>
-        <ns0:rPr>
-          <ns0:rFonts ns0:ascii="Times New Roman" ns0:hAnsi="Times New Roman"/>
-          <ns0:sz ns0:val="28"/>
-        </ns0:rPr>
-        <ns0:t xml:space="preserve">На координатной плоскости вектор удобно описывать координатами. Если заданы точки A(x1; y1) и B(x2; y2), то координаты вектора AB⃗ равны (x2 − x1; y2 − y1).</ns0:t>
-      </ns0:r>
-    </ns0:p>
-    <ns0:p>
-      <ns0:pPr>
-        <ns0:spacing ns0:after="0" ns0:line="360" ns0:lineRule="auto"/>
-        <ns0:ind ns0:firstLine="0"/>
-        <ns0:jc ns0:val="both"/>
-      </ns0:pPr>
-      <ns0:r>
-        <ns0:rPr>
-          <ns0:rFonts ns0:ascii="Times New Roman" ns0:hAnsi="Times New Roman"/>
-          <ns0:sz ns0:val="28"/>
-        </ns0:rPr>
-        <ns0:t xml:space="preserve"/>
-      </ns0:r>
-    </ns0:p>
-    <ns0:p>
-      <ns0:pPr>
-        <ns0:spacing ns0:after="0" ns0:line="360" ns0:lineRule="auto"/>
-        <ns0:ind ns0:firstLine="709"/>
-        <ns0:jc ns0:val="both"/>
-      </ns0:pPr>
-      <ns0:r>
-        <ns0:rPr>
-          <ns0:rFonts ns0:ascii="Times New Roman" ns0:hAnsi="Times New Roman"/>
-          <ns0:sz ns0:val="28"/>
-        </ns0:rPr>
-        <ns0:t xml:space="preserve">Координаты вектора показывают, на сколько единиц нужно сместиться по оси x и по оси y, чтобы перейти из A в B. Например, из A(−2; 1) в B(3; 5) нужно сместиться на 5 вправо и на 4 вверх: AB⃗=(5; 4).</ns0:t>
-      </ns0:r>
-    </ns0:p>
-    <ns0:p>
-      <ns0:pPr>
-        <ns0:spacing ns0:after="0" ns0:line="360" ns0:lineRule="auto"/>
-        <ns0:ind ns0:firstLine="0"/>
-        <ns0:jc ns0:val="both"/>
-      </ns0:pPr>
-      <ns0:r>
-        <ns0:rPr>
-          <ns0:rFonts ns0:ascii="Times New Roman" ns0:hAnsi="Times New Roman"/>
-          <ns0:sz ns0:val="28"/>
-        </ns0:rPr>
-        <ns0:t xml:space="preserve"/>
-      </ns0:r>
-    </ns0:p>
-    <ns0:p>
-      <ns0:pPr>
-        <ns0:spacing ns0:after="0" ns0:line="360" ns0:lineRule="auto"/>
-        <ns0:ind ns0:firstLine="709"/>
-        <ns0:jc ns0:val="both"/>
-      </ns0:pPr>
-      <ns0:r>
-        <ns0:rPr>
-          <ns0:rFonts ns0:ascii="Times New Roman" ns0:hAnsi="Times New Roman"/>
-          <ns0:sz ns0:val="28"/>
-        </ns0:rPr>
-        <ns0:t xml:space="preserve">Модуль вектора a⃗=(ax; ay) вычисляют по формуле |a⃗|=√(ax²+ay²). Эта формула связана с теоремой Пифагора и применяется при вычислении длины перемещения.</ns0:t>
+        <ns0:t xml:space="preserve">1.3 Операции над векторами и их смысл</ns0:t>
+      </ns0:r>
+    </ns0:p>
+    <ns0:p>
+      <ns0:pPr>
+        <ns0:spacing ns0:after="0" ns0:line="360" ns0:lineRule="auto"/>
+        <ns0:ind ns0:firstLine="0"/>
+        <ns0:jc ns0:val="both"/>
+      </ns0:pPr>
+      <ns0:r>
+        <ns0:rPr>
+          <ns0:rFonts ns0:ascii="Times New Roman" ns0:hAnsi="Times New Roman"/>
+          <ns0:sz ns0:val="28"/>
+        </ns0:rPr>
+        <ns0:t xml:space="preserve"/>
+      </ns0:r>
+    </ns0:p>
+    <ns0:p>
+      <ns0:pPr>
+        <ns0:spacing ns0:after="0" ns0:line="360" ns0:lineRule="auto"/>
+        <ns0:ind ns0:firstLine="709"/>
+        <ns0:jc ns0:val="both"/>
+      </ns0:pPr>
+      <ns0:r>
+        <ns0:rPr>
+          <ns0:rFonts ns0:ascii="Times New Roman" ns0:hAnsi="Times New Roman"/>
+          <ns0:sz ns0:val="28"/>
+        </ns0:rPr>
+        <ns0:t xml:space="preserve">Сложение векторов соответствует последовательному выполнению перемещений: сначала по a⃗, затем по b⃗. Результирующее перемещение равно сумме a⃗+b⃗ (правило треугольника). То же самое можно трактовать как правило параллелограмма, когда оба вектора откладывают из одной точки.</ns0:t>
+      </ns0:r>
+    </ns0:p>
+    <ns0:p>
+      <ns0:pPr>
+        <ns0:spacing ns0:after="0" ns0:line="360" ns0:lineRule="auto"/>
+        <ns0:ind ns0:firstLine="0"/>
+        <ns0:jc ns0:val="both"/>
+      </ns0:pPr>
+      <ns0:r>
+        <ns0:rPr>
+          <ns0:rFonts ns0:ascii="Times New Roman" ns0:hAnsi="Times New Roman"/>
+          <ns0:sz ns0:val="28"/>
+        </ns0:rPr>
+        <ns0:t xml:space="preserve"/>
+      </ns0:r>
+    </ns0:p>
+    <ns0:p>
+      <ns0:pPr>
+        <ns0:spacing ns0:after="0" ns0:line="360" ns0:lineRule="auto"/>
+        <ns0:ind ns0:firstLine="709"/>
+        <ns0:jc ns0:val="both"/>
+      </ns0:pPr>
+      <ns0:r>
+        <ns0:rPr>
+          <ns0:rFonts ns0:ascii="Times New Roman" ns0:hAnsi="Times New Roman"/>
+          <ns0:sz ns0:val="28"/>
+        </ns0:rPr>
+        <ns0:t xml:space="preserve">Вычитание векторов связано со сложением: a⃗−b⃗ = a⃗ + (−b⃗), где −b⃗ — вектор той же длины, но противоположного направления. Умножение вектора на число меняет его длину (в |k| раз) и может изменить направление, если коэффициент отрицательный.</ns0:t>
+      </ns0:r>
+    </ns0:p>
+    <ns0:p>
+      <ns0:pPr>
+        <ns0:spacing ns0:after="0" ns0:line="360" ns0:lineRule="auto"/>
+        <ns0:ind ns0:firstLine="0"/>
+        <ns0:jc ns0:val="both"/>
+      </ns0:pPr>
+      <ns0:r>
+        <ns0:rPr>
+          <ns0:rFonts ns0:ascii="Times New Roman" ns0:hAnsi="Times New Roman"/>
+          <ns0:sz ns0:val="28"/>
+        </ns0:rPr>
+        <ns0:t xml:space="preserve"/>
+      </ns0:r>
+    </ns0:p>
+    <ns0:p>
+      <ns0:pPr>
+        <ns0:spacing ns0:after="0" ns0:line="360" ns0:lineRule="auto"/>
+        <ns0:ind ns0:firstLine="709"/>
+        <ns0:jc ns0:val="both"/>
+      </ns0:pPr>
+      <ns0:r>
+        <ns0:rPr>
+          <ns0:rFonts ns0:ascii="Times New Roman" ns0:hAnsi="Times New Roman"/>
+          <ns0:sz ns0:val="28"/>
+        </ns0:rPr>
+        <ns0:t xml:space="preserve">Скалярное произведение помогает сравнивать направления и находить проекции. Оно используется, например, в физике при вычислении работы силы A=F⃗·s⃗: если сила направлена по движению, работа положительна, если против — отрицательна, если перпендикулярно — близка к нулю.</ns0:t>
+      </ns0:r>
+    </ns0:p>
+    <ns0:p>
+      <ns0:pPr>
+        <ns0:spacing ns0:after="0" ns0:line="360" ns0:lineRule="auto"/>
+        <ns0:ind ns0:firstLine="0"/>
+        <ns0:jc ns0:val="both"/>
+      </ns0:pPr>
+      <ns0:r>
+        <ns0:rPr>
+          <ns0:rFonts ns0:ascii="Times New Roman" ns0:hAnsi="Times New Roman"/>
+          <ns0:sz ns0:val="28"/>
+        </ns0:rPr>
+        <ns0:t xml:space="preserve"/>
+      </ns0:r>
+    </ns0:p>
+    <ns0:p>
+      <ns0:pPr>
+        <ns0:spacing ns0:after="0" ns0:line="360" ns0:lineRule="auto"/>
+        <ns0:ind ns0:firstLine="709"/>
+        <ns0:jc ns0:val="both"/>
+      </ns0:pPr>
+      <ns0:r>
+        <ns0:rPr>
+          <ns0:rFonts ns0:ascii="Times New Roman" ns0:hAnsi="Times New Roman"/>
+          <ns0:sz ns0:val="28"/>
+        </ns0:rPr>
+        <ns0:t xml:space="preserve">Практический вывод: операции над векторами позволяют складывать влияния разных факторов (движений, сил) и получать один «итоговый» результат, который можно интерпретировать и измерить.</ns0:t>
       </ns0:r>
     </ns0:p>
     <ns0:p>
@@ -2591,91 +2787,7 @@
           <ns0:sz ns0:val="28"/>
           <ns0:b/>
         </ns0:rPr>
-        <ns0:t xml:space="preserve">1.3 Операции над векторами и их смысл</ns0:t>
-      </ns0:r>
-    </ns0:p>
-    <ns0:p>
-      <ns0:pPr>
-        <ns0:spacing ns0:after="0" ns0:line="360" ns0:lineRule="auto"/>
-        <ns0:ind ns0:firstLine="0"/>
-        <ns0:jc ns0:val="both"/>
-      </ns0:pPr>
-      <ns0:r>
-        <ns0:rPr>
-          <ns0:rFonts ns0:ascii="Times New Roman" ns0:hAnsi="Times New Roman"/>
-          <ns0:sz ns0:val="28"/>
-        </ns0:rPr>
-        <ns0:t xml:space="preserve"/>
-      </ns0:r>
-    </ns0:p>
-    <ns0:p>
-      <ns0:pPr>
-        <ns0:spacing ns0:after="0" ns0:line="360" ns0:lineRule="auto"/>
-        <ns0:ind ns0:firstLine="709"/>
-        <ns0:jc ns0:val="both"/>
-      </ns0:pPr>
-      <ns0:r>
-        <ns0:rPr>
-          <ns0:rFonts ns0:ascii="Times New Roman" ns0:hAnsi="Times New Roman"/>
-          <ns0:sz ns0:val="28"/>
-        </ns0:rPr>
-        <ns0:t xml:space="preserve">Сложение векторов соответствует последовательному выполнению перемещений: сначала по a⃗, затем по b⃗. Результирующее перемещение равно сумме a⃗+b⃗ (правило треугольника).</ns0:t>
-      </ns0:r>
-    </ns0:p>
-    <ns0:p>
-      <ns0:pPr>
-        <ns0:spacing ns0:after="0" ns0:line="360" ns0:lineRule="auto"/>
-        <ns0:ind ns0:firstLine="0"/>
-        <ns0:jc ns0:val="both"/>
-      </ns0:pPr>
-      <ns0:r>
-        <ns0:rPr>
-          <ns0:rFonts ns0:ascii="Times New Roman" ns0:hAnsi="Times New Roman"/>
-          <ns0:sz ns0:val="28"/>
-        </ns0:rPr>
-        <ns0:t xml:space="preserve"/>
-      </ns0:r>
-    </ns0:p>
-    <ns0:p>
-      <ns0:pPr>
-        <ns0:spacing ns0:after="0" ns0:line="360" ns0:lineRule="auto"/>
-        <ns0:ind ns0:firstLine="709"/>
-        <ns0:jc ns0:val="both"/>
-      </ns0:pPr>
-      <ns0:r>
-        <ns0:rPr>
-          <ns0:rFonts ns0:ascii="Times New Roman" ns0:hAnsi="Times New Roman"/>
-          <ns0:sz ns0:val="28"/>
-        </ns0:rPr>
-        <ns0:t xml:space="preserve">Вычитание векторов связано со сложением: a⃗−b⃗ = a⃗ + (−b⃗), где −b⃗ — вектор той же длины, но противоположного направления. Умножение вектора на число меняет его длину и, при отрицательном коэффициенте, направление.</ns0:t>
-      </ns0:r>
-    </ns0:p>
-    <ns0:p>
-      <ns0:pPr>
-        <ns0:spacing ns0:after="0" ns0:line="360" ns0:lineRule="auto"/>
-        <ns0:ind ns0:firstLine="0"/>
-        <ns0:jc ns0:val="both"/>
-      </ns0:pPr>
-      <ns0:r>
-        <ns0:rPr>
-          <ns0:rFonts ns0:ascii="Times New Roman" ns0:hAnsi="Times New Roman"/>
-          <ns0:sz ns0:val="28"/>
-        </ns0:rPr>
-        <ns0:t xml:space="preserve"/>
-      </ns0:r>
-    </ns0:p>
-    <ns0:p>
-      <ns0:pPr>
-        <ns0:spacing ns0:after="0" ns0:line="360" ns0:lineRule="auto"/>
-        <ns0:ind ns0:firstLine="709"/>
-        <ns0:jc ns0:val="both"/>
-      </ns0:pPr>
-      <ns0:r>
-        <ns0:rPr>
-          <ns0:rFonts ns0:ascii="Times New Roman" ns0:hAnsi="Times New Roman"/>
-          <ns0:sz ns0:val="28"/>
-        </ns0:rPr>
-        <ns0:t xml:space="preserve">Скалярное произведение помогает сравнивать направления и находить проекции. В прикладных задачах оно используется, например, при вычислении работы силы A=F⃗·s⃗.</ns0:t>
+        <ns0:t xml:space="preserve">ГЛАВА 2. ПРАКТИЧЕСКАЯ ЧАСТЬ: ОПРОС И ДИАГРАММЫ</ns0:t>
       </ns0:r>
     </ns0:p>
     <ns0:p>
@@ -2704,7 +2816,91 @@
           <ns0:sz ns0:val="28"/>
           <ns0:b/>
         </ns0:rPr>
-        <ns0:t xml:space="preserve">ГЛАВА 2. ПРАКТИЧЕСКАЯ ЧАСТЬ: ОПРОС И ДИАГРАММЫ</ns0:t>
+        <ns0:t xml:space="preserve">2.1 Организация и проведение опроса</ns0:t>
+      </ns0:r>
+    </ns0:p>
+    <ns0:p>
+      <ns0:pPr>
+        <ns0:spacing ns0:after="0" ns0:line="360" ns0:lineRule="auto"/>
+        <ns0:ind ns0:firstLine="0"/>
+        <ns0:jc ns0:val="both"/>
+      </ns0:pPr>
+      <ns0:r>
+        <ns0:rPr>
+          <ns0:rFonts ns0:ascii="Times New Roman" ns0:hAnsi="Times New Roman"/>
+          <ns0:sz ns0:val="28"/>
+        </ns0:rPr>
+        <ns0:t xml:space="preserve"/>
+      </ns0:r>
+    </ns0:p>
+    <ns0:p>
+      <ns0:pPr>
+        <ns0:spacing ns0:after="0" ns0:line="360" ns0:lineRule="auto"/>
+        <ns0:ind ns0:firstLine="709"/>
+        <ns0:jc ns0:val="both"/>
+      </ns0:pPr>
+      <ns0:r>
+        <ns0:rPr>
+          <ns0:rFonts ns0:ascii="Times New Roman" ns0:hAnsi="Times New Roman"/>
+          <ns0:sz ns0:val="28"/>
+        </ns0:rPr>
+        <ns0:t xml:space="preserve">Цель опроса — выяснить, насколько респонденты узнают векторы в жизненных ситуациях и различают векторные и скалярные величины. Это помогает понять, насколько тема воспринимается как «практическая», а не только как формулы.</ns0:t>
+      </ns0:r>
+    </ns0:p>
+    <ns0:p>
+      <ns0:pPr>
+        <ns0:spacing ns0:after="0" ns0:line="360" ns0:lineRule="auto"/>
+        <ns0:ind ns0:firstLine="0"/>
+        <ns0:jc ns0:val="both"/>
+      </ns0:pPr>
+      <ns0:r>
+        <ns0:rPr>
+          <ns0:rFonts ns0:ascii="Times New Roman" ns0:hAnsi="Times New Roman"/>
+          <ns0:sz ns0:val="28"/>
+        </ns0:rPr>
+        <ns0:t xml:space="preserve"/>
+      </ns0:r>
+    </ns0:p>
+    <ns0:p>
+      <ns0:pPr>
+        <ns0:spacing ns0:after="0" ns0:line="360" ns0:lineRule="auto"/>
+        <ns0:ind ns0:firstLine="709"/>
+        <ns0:jc ns0:val="both"/>
+      </ns0:pPr>
+      <ns0:r>
+        <ns0:rPr>
+          <ns0:rFonts ns0:ascii="Times New Roman" ns0:hAnsi="Times New Roman"/>
+          <ns0:sz ns0:val="28"/>
+        </ns0:rPr>
+        <ns0:t xml:space="preserve">Опрос проводился анонимно среди 30 человек. Анкета включала 8 вопросов с вариантами ответа: от общего понимания понятия «вектор» до различения конкретных величин (скорость и температура) и понимания результирующего перемещения.</ns0:t>
+      </ns0:r>
+    </ns0:p>
+    <ns0:p>
+      <ns0:pPr>
+        <ns0:spacing ns0:after="0" ns0:line="360" ns0:lineRule="auto"/>
+        <ns0:ind ns0:firstLine="0"/>
+        <ns0:jc ns0:val="both"/>
+      </ns0:pPr>
+      <ns0:r>
+        <ns0:rPr>
+          <ns0:rFonts ns0:ascii="Times New Roman" ns0:hAnsi="Times New Roman"/>
+          <ns0:sz ns0:val="28"/>
+        </ns0:rPr>
+        <ns0:t xml:space="preserve"/>
+      </ns0:r>
+    </ns0:p>
+    <ns0:p>
+      <ns0:pPr>
+        <ns0:spacing ns0:after="0" ns0:line="360" ns0:lineRule="auto"/>
+        <ns0:ind ns0:firstLine="709"/>
+        <ns0:jc ns0:val="both"/>
+      </ns0:pPr>
+      <ns0:r>
+        <ns0:rPr>
+          <ns0:rFonts ns0:ascii="Times New Roman" ns0:hAnsi="Times New Roman"/>
+          <ns0:sz ns0:val="28"/>
+        </ns0:rPr>
+        <ns0:t xml:space="preserve">Результаты фиксировались в виде количества ответов по каждому варианту. Затем данные были представлены диаграммами, чтобы наглядно сравнить распределение ответов по вопросам.</ns0:t>
       </ns0:r>
     </ns0:p>
     <ns0:p>
@@ -2733,91 +2929,91 @@
           <ns0:sz ns0:val="28"/>
           <ns0:b/>
         </ns0:rPr>
-        <ns0:t xml:space="preserve">2.1 Организация и проведение опроса</ns0:t>
-      </ns0:r>
-    </ns0:p>
-    <ns0:p>
-      <ns0:pPr>
-        <ns0:spacing ns0:after="0" ns0:line="360" ns0:lineRule="auto"/>
-        <ns0:ind ns0:firstLine="0"/>
-        <ns0:jc ns0:val="both"/>
-      </ns0:pPr>
-      <ns0:r>
-        <ns0:rPr>
-          <ns0:rFonts ns0:ascii="Times New Roman" ns0:hAnsi="Times New Roman"/>
-          <ns0:sz ns0:val="28"/>
-        </ns0:rPr>
-        <ns0:t xml:space="preserve"/>
-      </ns0:r>
-    </ns0:p>
-    <ns0:p>
-      <ns0:pPr>
-        <ns0:spacing ns0:after="0" ns0:line="360" ns0:lineRule="auto"/>
-        <ns0:ind ns0:firstLine="709"/>
-        <ns0:jc ns0:val="both"/>
-      </ns0:pPr>
-      <ns0:r>
-        <ns0:rPr>
-          <ns0:rFonts ns0:ascii="Times New Roman" ns0:hAnsi="Times New Roman"/>
-          <ns0:sz ns0:val="28"/>
-        </ns0:rPr>
-        <ns0:t xml:space="preserve">Цель опроса — выяснить, насколько респонденты узнают векторы в жизненных ситуациях и различают векторные и скалярные величины.</ns0:t>
-      </ns0:r>
-    </ns0:p>
-    <ns0:p>
-      <ns0:pPr>
-        <ns0:spacing ns0:after="0" ns0:line="360" ns0:lineRule="auto"/>
-        <ns0:ind ns0:firstLine="0"/>
-        <ns0:jc ns0:val="both"/>
-      </ns0:pPr>
-      <ns0:r>
-        <ns0:rPr>
-          <ns0:rFonts ns0:ascii="Times New Roman" ns0:hAnsi="Times New Roman"/>
-          <ns0:sz ns0:val="28"/>
-        </ns0:rPr>
-        <ns0:t xml:space="preserve"/>
-      </ns0:r>
-    </ns0:p>
-    <ns0:p>
-      <ns0:pPr>
-        <ns0:spacing ns0:after="0" ns0:line="360" ns0:lineRule="auto"/>
-        <ns0:ind ns0:firstLine="709"/>
-        <ns0:jc ns0:val="both"/>
-      </ns0:pPr>
-      <ns0:r>
-        <ns0:rPr>
-          <ns0:rFonts ns0:ascii="Times New Roman" ns0:hAnsi="Times New Roman"/>
-          <ns0:sz ns0:val="28"/>
-        </ns0:rPr>
-        <ns0:t xml:space="preserve">Формат: анонимная анкета из 8 вопросов с вариантами ответа. В опросе участвовали 30 человек. Подсчёт результатов выполнен по количеству выбранных вариантов.</ns0:t>
-      </ns0:r>
-    </ns0:p>
-    <ns0:p>
-      <ns0:pPr>
-        <ns0:spacing ns0:after="0" ns0:line="360" ns0:lineRule="auto"/>
-        <ns0:ind ns0:firstLine="0"/>
-        <ns0:jc ns0:val="both"/>
-      </ns0:pPr>
-      <ns0:r>
-        <ns0:rPr>
-          <ns0:rFonts ns0:ascii="Times New Roman" ns0:hAnsi="Times New Roman"/>
-          <ns0:sz ns0:val="28"/>
-        </ns0:rPr>
-        <ns0:t xml:space="preserve"/>
-      </ns0:r>
-    </ns0:p>
-    <ns0:p>
-      <ns0:pPr>
-        <ns0:spacing ns0:after="0" ns0:line="360" ns0:lineRule="auto"/>
-        <ns0:ind ns0:firstLine="709"/>
-        <ns0:jc ns0:val="both"/>
-      </ns0:pPr>
-      <ns0:r>
-        <ns0:rPr>
-          <ns0:rFonts ns0:ascii="Times New Roman" ns0:hAnsi="Times New Roman"/>
-          <ns0:sz ns0:val="28"/>
-        </ns0:rPr>
-        <ns0:t xml:space="preserve">Далее результаты представлены в виде диаграмм для наглядного сравнения ответов.</ns0:t>
+        <ns0:t xml:space="preserve">2.2 Диаграммы результатов опроса</ns0:t>
+      </ns0:r>
+    </ns0:p>
+    <ns0:p>
+      <ns0:pPr>
+        <ns0:spacing ns0:after="0" ns0:line="360" ns0:lineRule="auto"/>
+        <ns0:ind ns0:firstLine="0"/>
+        <ns0:jc ns0:val="both"/>
+      </ns0:pPr>
+      <ns0:r>
+        <ns0:rPr>
+          <ns0:rFonts ns0:ascii="Times New Roman" ns0:hAnsi="Times New Roman"/>
+          <ns0:sz ns0:val="28"/>
+        </ns0:rPr>
+        <ns0:t xml:space="preserve"/>
+      </ns0:r>
+    </ns0:p>
+    <ns0:p>
+      <ns0:pPr>
+        <ns0:spacing ns0:after="0" ns0:line="360" ns0:lineRule="auto"/>
+        <ns0:ind ns0:firstLine="709"/>
+        <ns0:jc ns0:val="both"/>
+      </ns0:pPr>
+      <ns0:r>
+        <ns0:rPr>
+          <ns0:rFonts ns0:ascii="Times New Roman" ns0:hAnsi="Times New Roman"/>
+          <ns0:sz ns0:val="28"/>
+        </ns0:rPr>
+        <ns0:t xml:space="preserve">Для каждого вопроса подсчитано количество ответов по вариантам. На рисунках 1–8 приведены диаграммы результатов опроса по вопросам 1–8 соответственно.</ns0:t>
+      </ns0:r>
+    </ns0:p>
+    <ns0:p>
+      <ns0:pPr>
+        <ns0:spacing ns0:after="0" ns0:line="360" ns0:lineRule="auto"/>
+        <ns0:ind ns0:firstLine="0"/>
+        <ns0:jc ns0:val="both"/>
+      </ns0:pPr>
+      <ns0:r>
+        <ns0:rPr>
+          <ns0:rFonts ns0:ascii="Times New Roman" ns0:hAnsi="Times New Roman"/>
+          <ns0:sz ns0:val="28"/>
+        </ns0:rPr>
+        <ns0:t xml:space="preserve"/>
+      </ns0:r>
+    </ns0:p>
+    <ns0:p>
+      <ns0:pPr>
+        <ns0:spacing ns0:after="0" ns0:line="360" ns0:lineRule="auto"/>
+        <ns0:ind ns0:firstLine="709"/>
+        <ns0:jc ns0:val="both"/>
+      </ns0:pPr>
+      <ns0:r>
+        <ns0:rPr>
+          <ns0:rFonts ns0:ascii="Times New Roman" ns0:hAnsi="Times New Roman"/>
+          <ns0:sz ns0:val="28"/>
+        </ns0:rPr>
+        <ns0:t xml:space="preserve">По первому вопросу большинство ответило «Да», однако значительная часть выбрала вариант «Примерно», что показывает: термин знаком, но уверенность в понимании есть не у всех. Это типично для темы, где важно уметь применять понятия в задачах.</ns0:t>
+      </ns0:r>
+    </ns0:p>
+    <ns0:p>
+      <ns0:pPr>
+        <ns0:spacing ns0:after="0" ns0:line="360" ns0:lineRule="auto"/>
+        <ns0:ind ns0:firstLine="0"/>
+        <ns0:jc ns0:val="both"/>
+      </ns0:pPr>
+      <ns0:r>
+        <ns0:rPr>
+          <ns0:rFonts ns0:ascii="Times New Roman" ns0:hAnsi="Times New Roman"/>
+          <ns0:sz ns0:val="28"/>
+        </ns0:rPr>
+        <ns0:t xml:space="preserve"/>
+      </ns0:r>
+    </ns0:p>
+    <ns0:p>
+      <ns0:pPr>
+        <ns0:spacing ns0:after="0" ns0:line="360" ns0:lineRule="auto"/>
+        <ns0:ind ns0:firstLine="709"/>
+        <ns0:jc ns0:val="both"/>
+      </ns0:pPr>
+      <ns0:r>
+        <ns0:rPr>
+          <ns0:rFonts ns0:ascii="Times New Roman" ns0:hAnsi="Times New Roman"/>
+          <ns0:sz ns0:val="28"/>
+        </ns0:rPr>
+        <ns0:t xml:space="preserve">По третьему вопросу большинство верно отметило, что векторная величина должна иметь и величину, и направление. По пятому вопросу большинство выбрало «Нет», что соответствует факту: температура — скалярная величина.</ns0:t>
       </ns0:r>
     </ns0:p>
     <ns0:p>
@@ -2846,119 +3042,6 @@
           <ns0:sz ns0:val="28"/>
           <ns0:b/>
         </ns0:rPr>
-        <ns0:t xml:space="preserve">2.2 Диаграммы результатов опроса</ns0:t>
-      </ns0:r>
-    </ns0:p>
-    <ns0:p>
-      <ns0:pPr>
-        <ns0:spacing ns0:after="0" ns0:line="360" ns0:lineRule="auto"/>
-        <ns0:ind ns0:firstLine="0"/>
-        <ns0:jc ns0:val="both"/>
-      </ns0:pPr>
-      <ns0:r>
-        <ns0:rPr>
-          <ns0:rFonts ns0:ascii="Times New Roman" ns0:hAnsi="Times New Roman"/>
-          <ns0:sz ns0:val="28"/>
-        </ns0:rPr>
-        <ns0:t xml:space="preserve"/>
-      </ns0:r>
-    </ns0:p>
-    <ns0:p>
-      <ns0:pPr>
-        <ns0:spacing ns0:after="0" ns0:line="360" ns0:lineRule="auto"/>
-        <ns0:ind ns0:firstLine="709"/>
-        <ns0:jc ns0:val="both"/>
-      </ns0:pPr>
-      <ns0:r>
-        <ns0:rPr>
-          <ns0:rFonts ns0:ascii="Times New Roman" ns0:hAnsi="Times New Roman"/>
-          <ns0:sz ns0:val="28"/>
-        </ns0:rPr>
-        <ns0:t xml:space="preserve">Для каждого вопроса подсчитано количество ответов по каждому варианту. На рисунках 1–8 приведены диаграммы распределения ответов по вопросам 1–8 соответственно.</ns0:t>
-      </ns0:r>
-    </ns0:p>
-    <ns0:p>
-      <ns0:pPr>
-        <ns0:spacing ns0:after="0" ns0:line="360" ns0:lineRule="auto"/>
-        <ns0:ind ns0:firstLine="0"/>
-        <ns0:jc ns0:val="both"/>
-      </ns0:pPr>
-      <ns0:r>
-        <ns0:rPr>
-          <ns0:rFonts ns0:ascii="Times New Roman" ns0:hAnsi="Times New Roman"/>
-          <ns0:sz ns0:val="28"/>
-        </ns0:rPr>
-        <ns0:t xml:space="preserve"/>
-      </ns0:r>
-    </ns0:p>
-    <ns0:p>
-      <ns0:pPr>
-        <ns0:spacing ns0:after="0" ns0:line="360" ns0:lineRule="auto"/>
-        <ns0:ind ns0:firstLine="709"/>
-        <ns0:jc ns0:val="both"/>
-      </ns0:pPr>
-      <ns0:r>
-        <ns0:rPr>
-          <ns0:rFonts ns0:ascii="Times New Roman" ns0:hAnsi="Times New Roman"/>
-          <ns0:sz ns0:val="28"/>
-        </ns0:rPr>
-        <ns0:t xml:space="preserve">Вопрос 1: Да — 18; Примерно — 10; Нет — 2. Вопрос 3: Величина и направление — 27 (большинство верно выделяет признак векторной величины).</ns0:t>
-      </ns0:r>
-    </ns0:p>
-    <ns0:p>
-      <ns0:pPr>
-        <ns0:spacing ns0:after="0" ns0:line="360" ns0:lineRule="auto"/>
-        <ns0:ind ns0:firstLine="0"/>
-        <ns0:jc ns0:val="both"/>
-      </ns0:pPr>
-      <ns0:r>
-        <ns0:rPr>
-          <ns0:rFonts ns0:ascii="Times New Roman" ns0:hAnsi="Times New Roman"/>
-          <ns0:sz ns0:val="28"/>
-        </ns0:rPr>
-        <ns0:t xml:space="preserve"/>
-      </ns0:r>
-    </ns0:p>
-    <ns0:p>
-      <ns0:pPr>
-        <ns0:spacing ns0:after="0" ns0:line="360" ns0:lineRule="auto"/>
-        <ns0:ind ns0:firstLine="709"/>
-        <ns0:jc ns0:val="both"/>
-      </ns0:pPr>
-      <ns0:r>
-        <ns0:rPr>
-          <ns0:rFonts ns0:ascii="Times New Roman" ns0:hAnsi="Times New Roman"/>
-          <ns0:sz ns0:val="28"/>
-        </ns0:rPr>
-        <ns0:t xml:space="preserve">Вопрос 5: Нет — 21 (температура является скалярной величиной). Эти результаты показывают, что базовые различия между скалярами и векторами в целом понятны.</ns0:t>
-      </ns0:r>
-    </ns0:p>
-    <ns0:p>
-      <ns0:pPr>
-        <ns0:spacing ns0:after="0" ns0:line="360" ns0:lineRule="auto"/>
-        <ns0:ind ns0:firstLine="0"/>
-        <ns0:jc ns0:val="both"/>
-      </ns0:pPr>
-      <ns0:r>
-        <ns0:rPr>
-          <ns0:rFonts ns0:ascii="Times New Roman" ns0:hAnsi="Times New Roman"/>
-          <ns0:sz ns0:val="28"/>
-        </ns0:rPr>
-        <ns0:t xml:space="preserve"/>
-      </ns0:r>
-    </ns0:p>
-    <ns0:p>
-      <ns0:pPr>
-        <ns0:spacing ns0:after="0" ns0:line="360" ns0:lineRule="auto"/>
-        <ns0:ind ns0:firstLine="0"/>
-        <ns0:jc ns0:val="both"/>
-      </ns0:pPr>
-      <ns0:r>
-        <ns0:rPr>
-          <ns0:rFonts ns0:ascii="Times New Roman" ns0:hAnsi="Times New Roman"/>
-          <ns0:sz ns0:val="28"/>
-          <ns0:b/>
-        </ns0:rPr>
         <ns0:t xml:space="preserve">2.3 Выводы по результатам опроса</ns0:t>
       </ns0:r>
     </ns0:p>
@@ -2987,63 +3070,63 @@
           <ns0:rFonts ns0:ascii="Times New Roman" ns0:hAnsi="Times New Roman"/>
           <ns0:sz ns0:val="28"/>
         </ns0:rPr>
-        <ns0:t xml:space="preserve">Большинство респондентов знакомы с понятием вектора и корректно определяют, что у векторной величины есть величина и направление. Также большинство верно относится к температуре как к скалярной величине.</ns0:t>
-      </ns0:r>
-    </ns0:p>
-    <ns0:p>
-      <ns0:pPr>
-        <ns0:spacing ns0:after="0" ns0:line="360" ns0:lineRule="auto"/>
-        <ns0:ind ns0:firstLine="0"/>
-        <ns0:jc ns0:val="both"/>
-      </ns0:pPr>
-      <ns0:r>
-        <ns0:rPr>
-          <ns0:rFonts ns0:ascii="Times New Roman" ns0:hAnsi="Times New Roman"/>
-          <ns0:sz ns0:val="28"/>
-        </ns0:rPr>
-        <ns0:t xml:space="preserve"/>
-      </ns0:r>
-    </ns0:p>
-    <ns0:p>
-      <ns0:pPr>
-        <ns0:spacing ns0:after="0" ns0:line="360" ns0:lineRule="auto"/>
-        <ns0:ind ns0:firstLine="709"/>
-        <ns0:jc ns0:val="both"/>
-      </ns0:pPr>
-      <ns0:r>
-        <ns0:rPr>
-          <ns0:rFonts ns0:ascii="Times New Roman" ns0:hAnsi="Times New Roman"/>
-          <ns0:sz ns0:val="28"/>
-        </ns0:rPr>
-        <ns0:t xml:space="preserve">Наиболее часто слово «вектор» респонденты встречают в математике и физике. Это подтверждает связь темы с учебными дисциплинами.</ns0:t>
-      </ns0:r>
-    </ns0:p>
-    <ns0:p>
-      <ns0:pPr>
-        <ns0:spacing ns0:after="0" ns0:line="360" ns0:lineRule="auto"/>
-        <ns0:ind ns0:firstLine="0"/>
-        <ns0:jc ns0:val="both"/>
-      </ns0:pPr>
-      <ns0:r>
-        <ns0:rPr>
-          <ns0:rFonts ns0:ascii="Times New Roman" ns0:hAnsi="Times New Roman"/>
-          <ns0:sz ns0:val="28"/>
-        </ns0:rPr>
-        <ns0:t xml:space="preserve"/>
-      </ns0:r>
-    </ns0:p>
-    <ns0:p>
-      <ns0:pPr>
-        <ns0:spacing ns0:after="0" ns0:line="360" ns0:lineRule="auto"/>
-        <ns0:ind ns0:firstLine="709"/>
-        <ns0:jc ns0:val="both"/>
-      </ns0:pPr>
-      <ns0:r>
-        <ns0:rPr>
-          <ns0:rFonts ns0:ascii="Times New Roman" ns0:hAnsi="Times New Roman"/>
-          <ns0:sz ns0:val="28"/>
-        </ns0:rPr>
-        <ns0:t xml:space="preserve">Большая часть респондентов хотели бы видеть больше примеров из жизни при изучении математики, поэтому практико-ориентированное объяснение темы повышает интерес и понимание.</ns0:t>
+        <ns0:t xml:space="preserve">Результаты показывают, что базовое представление о векторах у большинства есть: респонденты понимают ключевой признак векторной величины и правильно различают скорость и температуру.</ns0:t>
+      </ns0:r>
+    </ns0:p>
+    <ns0:p>
+      <ns0:pPr>
+        <ns0:spacing ns0:after="0" ns0:line="360" ns0:lineRule="auto"/>
+        <ns0:ind ns0:firstLine="0"/>
+        <ns0:jc ns0:val="both"/>
+      </ns0:pPr>
+      <ns0:r>
+        <ns0:rPr>
+          <ns0:rFonts ns0:ascii="Times New Roman" ns0:hAnsi="Times New Roman"/>
+          <ns0:sz ns0:val="28"/>
+        </ns0:rPr>
+        <ns0:t xml:space="preserve"/>
+      </ns0:r>
+    </ns0:p>
+    <ns0:p>
+      <ns0:pPr>
+        <ns0:spacing ns0:after="0" ns0:line="360" ns0:lineRule="auto"/>
+        <ns0:ind ns0:firstLine="709"/>
+        <ns0:jc ns0:val="both"/>
+      </ns0:pPr>
+      <ns0:r>
+        <ns0:rPr>
+          <ns0:rFonts ns0:ascii="Times New Roman" ns0:hAnsi="Times New Roman"/>
+          <ns0:sz ns0:val="28"/>
+        </ns0:rPr>
+        <ns0:t xml:space="preserve">Одновременно видно, что часть опрошенных не уверена в ответах. Это говорит о необходимости закреплять тему через практические ситуации: перемещения по маршруту, направление ветра, сложение воздействий, примеры из физики и повседневной жизни.</ns0:t>
+      </ns0:r>
+    </ns0:p>
+    <ns0:p>
+      <ns0:pPr>
+        <ns0:spacing ns0:after="0" ns0:line="360" ns0:lineRule="auto"/>
+        <ns0:ind ns0:firstLine="0"/>
+        <ns0:jc ns0:val="both"/>
+      </ns0:pPr>
+      <ns0:r>
+        <ns0:rPr>
+          <ns0:rFonts ns0:ascii="Times New Roman" ns0:hAnsi="Times New Roman"/>
+          <ns0:sz ns0:val="28"/>
+        </ns0:rPr>
+        <ns0:t xml:space="preserve"/>
+      </ns0:r>
+    </ns0:p>
+    <ns0:p>
+      <ns0:pPr>
+        <ns0:spacing ns0:after="0" ns0:line="360" ns0:lineRule="auto"/>
+        <ns0:ind ns0:firstLine="709"/>
+        <ns0:jc ns0:val="both"/>
+      </ns0:pPr>
+      <ns0:r>
+        <ns0:rPr>
+          <ns0:rFonts ns0:ascii="Times New Roman" ns0:hAnsi="Times New Roman"/>
+          <ns0:sz ns0:val="28"/>
+        </ns0:rPr>
+        <ns0:t xml:space="preserve">Таким образом, опрос подтверждает актуальность проекта: тема становится понятнее, когда её связывают с реальными примерами, а результаты удобно демонстрировать диаграммами.</ns0:t>
       </ns0:r>
     </ns0:p>
     <ns0:p>
@@ -3662,14 +3745,13 @@
     <ns0:p>
       <ns0:pPr>
         <ns0:spacing ns0:after="0" ns0:line="360" ns0:lineRule="auto"/>
-        <ns0:ind ns0:firstLine="0"/>
-        <ns0:jc ns0:val="both"/>
-      </ns0:pPr>
-      <ns0:r>
-        <ns0:rPr>
-          <ns0:rFonts ns0:ascii="Times New Roman" ns0:hAnsi="Times New Roman"/>
-          <ns0:sz ns0:val="28"/>
-          <ns0:b/>
+        <ns0:ind ns0:firstLine="709"/>
+        <ns0:jc ns0:val="both"/>
+      </ns0:pPr>
+      <ns0:r>
+        <ns0:rPr>
+          <ns0:rFonts ns0:ascii="Times New Roman" ns0:hAnsi="Times New Roman"/>
+          <ns0:sz ns0:val="28"/>
         </ns0:rPr>
         <ns0:t xml:space="preserve">1. Атанасян, Л. С. Геометрия. 7–9 классы : учебник / Л. С. Атанасян, В. Ф. Бутузов, С. Б. Кадомцев и др. – Москва : Просвещение, 2022. – 384 с.</ns0:t>
       </ns0:r>
@@ -3691,14 +3773,13 @@
     <ns0:p>
       <ns0:pPr>
         <ns0:spacing ns0:after="0" ns0:line="360" ns0:lineRule="auto"/>
-        <ns0:ind ns0:firstLine="0"/>
-        <ns0:jc ns0:val="both"/>
-      </ns0:pPr>
-      <ns0:r>
-        <ns0:rPr>
-          <ns0:rFonts ns0:ascii="Times New Roman" ns0:hAnsi="Times New Roman"/>
-          <ns0:sz ns0:val="28"/>
-          <ns0:b/>
+        <ns0:ind ns0:firstLine="709"/>
+        <ns0:jc ns0:val="both"/>
+      </ns0:pPr>
+      <ns0:r>
+        <ns0:rPr>
+          <ns0:rFonts ns0:ascii="Times New Roman" ns0:hAnsi="Times New Roman"/>
+          <ns0:sz ns0:val="28"/>
         </ns0:rPr>
         <ns0:t xml:space="preserve">2. Погорелов, А. В. Геометрия : учебник для 10–11 классов / А. В. Погорелов. – Москва : Просвещение, 2020. – 272 с.</ns0:t>
       </ns0:r>

</xml_diff>